<commit_message>
Economics closer to the sample; user's main-text edits; stamp top line; slides updated
- Economics: stage shares from the assignment, works table with critical-path totals, no
  network-parameter table, wages per work, cost via 40 % wage share, no extra pay, no
  conclusions subsection; 3-4 is a real task (theoretical channel estimate) instead of a
  wait; t_max of the critical path fits 09.10-25.12; relays per hop over 6 000 km instead
  of 20 km lines; terrain monitoring wording.
- Main part: user's edits from the reviewed docx (intro, criteria, novelty items,
  functional differences of task groups).
- Frames: thick top line on both stamps.
- Presentation: economics, goal, relevance and conclusions slides.

Co-Authored-By: Claude Opus 5.5 <noreply@anthropic.com>
</commit_message>
<xml_diff>
--- a/docs/ohrana_truda/Okhrana_truda_HaLow.docx
+++ b/docs/ohrana_truda/Okhrana_truda_HaLow.docx
@@ -10331,7 +10331,7 @@
       <w:pgMar w:top="1134" w:right="850" w:bottom="1417" w:left="1701" w:header="283" w:footer="283" w:gutter="0"/>
       <w:cols w:space="720"/>
       <w:docGrid w:linePitch="360"/>
-      <w:pgNumType w:start="62"/>
+      <w:pgNumType w:start="61"/>
     </w:sectPr>
   </w:body>
 </w:document>
@@ -10391,7 +10391,7 @@
         <w:tcPr>
           <w:tcW w:w="397" w:type="dxa"/>
           <w:tcBorders>
-            <w:top w:val="single" w:sz="4" w:space="0" w:color="auto"/>
+            <w:top w:val="single" w:sz="18" w:space="0" w:color="auto"/>
             <w:left w:val="nil"/>
             <w:right w:val="single" w:sz="18" w:space="0" w:color="auto"/>
           </w:tcBorders>
@@ -10411,7 +10411,7 @@
         <w:tcPr>
           <w:tcW w:w="567" w:type="dxa"/>
           <w:tcBorders>
-            <w:top w:val="single" w:sz="4" w:space="0" w:color="auto"/>
+            <w:top w:val="single" w:sz="18" w:space="0" w:color="auto"/>
             <w:left w:val="nil"/>
             <w:right w:val="single" w:sz="18" w:space="0" w:color="auto"/>
           </w:tcBorders>
@@ -10431,7 +10431,7 @@
         <w:tcPr>
           <w:tcW w:w="1304" w:type="dxa"/>
           <w:tcBorders>
-            <w:top w:val="single" w:sz="4" w:space="0" w:color="auto"/>
+            <w:top w:val="single" w:sz="18" w:space="0" w:color="auto"/>
             <w:left w:val="nil"/>
             <w:right w:val="nil"/>
           </w:tcBorders>
@@ -10451,7 +10451,7 @@
         <w:tcPr>
           <w:tcW w:w="851" w:type="dxa"/>
           <w:tcBorders>
-            <w:top w:val="single" w:sz="4" w:space="0" w:color="auto"/>
+            <w:top w:val="single" w:sz="18" w:space="0" w:color="auto"/>
             <w:left w:val="single" w:sz="18" w:space="0" w:color="auto"/>
             <w:right w:val="single" w:sz="18" w:space="0" w:color="auto"/>
           </w:tcBorders>
@@ -10471,7 +10471,7 @@
         <w:tcPr>
           <w:tcW w:w="567" w:type="dxa"/>
           <w:tcBorders>
-            <w:top w:val="single" w:sz="4" w:space="0" w:color="auto"/>
+            <w:top w:val="single" w:sz="18" w:space="0" w:color="auto"/>
             <w:left w:val="nil"/>
             <w:right w:val="single" w:sz="18" w:space="0" w:color="auto"/>
           </w:tcBorders>
@@ -10492,7 +10492,7 @@
           <w:tcW w:w="6235" w:type="dxa"/>
           <w:vMerge w:val="restart"/>
           <w:tcBorders>
-            <w:top w:val="single" w:sz="4" w:space="0" w:color="auto"/>
+            <w:top w:val="single" w:sz="18" w:space="0" w:color="auto"/>
             <w:left w:val="nil"/>
             <w:bottom w:val="nil"/>
             <w:right w:val="single" w:sz="18" w:space="0" w:color="auto"/>
@@ -10524,7 +10524,7 @@
         <w:tcPr>
           <w:tcW w:w="567" w:type="dxa"/>
           <w:tcBorders>
-            <w:top w:val="single" w:sz="4" w:space="0" w:color="auto"/>
+            <w:top w:val="single" w:sz="18" w:space="0" w:color="auto"/>
             <w:left w:val="nil"/>
             <w:bottom w:val="single" w:sz="18" w:space="0" w:color="auto"/>
             <w:right w:val="nil"/>

</xml_diff>

<commit_message>
Lighting per MAI method (Kz 1.5, 287 lx within tolerance), cost structure in rubles, economics conclusions
Co-Authored-By: Claude Opus 5.5 <noreply@anthropic.com>
</commit_message>
<xml_diff>
--- a/docs/ohrana_truda/Okhrana_truda_HaLow.docx
+++ b/docs/ohrana_truda/Okhrana_truda_HaLow.docx
@@ -19,7 +19,7 @@
         <w:rPr>
           <w:b/>
         </w:rPr>
-        <w:t>Определение благоприятных условий труда специалиста при анализе эффективности технологии Wi-Fi HaLow для передачи данных с борта беспилотного летательного аппарата</w:t>
+        <w:t>Определение благоприятных условий труда специалиста при исследовании эффективности технологии Wi-Fi HaLow для передачи данных с борта беспилотного летательного аппарата</w:t>
       </w:r>
     </w:p>
     <w:p>
@@ -812,7 +812,7 @@
     </w:p>
     <w:p>
       <w:r>
-        <w:t>Площадь на одно рабочее место пользователя ПЭВМ с монитором на плоском дискретном экране должна составлять не менее 4,5 м² [48]. Фактическая площадь на одно рабочее место — 4,65 м², требование выполняется.</w:t>
+        <w:t>Площадь на одно рабочее место пользователя ПЭВМ с монитором на плоском дискретном экране должна составлять не менее 4,5 м² [49]. Фактическая площадь на одно рабочее место — 4,65 м², требование выполняется.</w:t>
       </w:r>
     </w:p>
     <w:p>
@@ -1108,7 +1108,7 @@
     </w:p>
     <w:p>
       <w:r>
-        <w:t>Условия труда оцениваются по Методике проведения специальной оценки условий труда, утверждённой приказом Минтруда России от 21.11.2023 № 817н [49]. Порядок оценки: выявляются вредные и опасные факторы и их источники, фактические значения факторов сравниваются с нормативными, по степени отклонения устанавливается класс условий труда по каждому фактору, затем — итоговый класс. При превышении нормативов предлагаются мероприятия по их устранению. Классы условий труда установлены Федеральным законом № 426-ФЗ [50]: 1 — оптимальные, 2 — допустимые, 3.1–3.4 — вредные, 4 — опасные.</w:t>
+        <w:t>Условия труда оцениваются по Методике проведения специальной оценки условий труда, утверждённой приказом Минтруда России от 21.11.2023 № 817н [50]. Порядок оценки: выявляются вредные и опасные факторы и их источники, фактические значения факторов сравниваются с нормативными, по степени отклонения устанавливается класс условий труда по каждому фактору, затем — итоговый класс. При превышении нормативов предлагаются мероприятия по их устранению. Классы условий труда установлены Федеральным законом № 426-ФЗ [51]: 1 — оптимальные, 2 — допустимые, 3.1–3.4 — вредные, 4 — опасные.</w:t>
       </w:r>
     </w:p>
     <w:p>
@@ -1121,7 +1121,7 @@
     </w:p>
     <w:p>
       <w:r>
-        <w:t>Производственные факторы, которые могут воздействовать на специалиста [51], и их источники приведены в таблице 5.3.</w:t>
+        <w:t>Производственные факторы, которые могут воздействовать на специалиста [52], и их источники приведены в таблице 5.3.</w:t>
       </w:r>
     </w:p>
     <w:p>
@@ -1730,7 +1730,7 @@
     </w:p>
     <w:p>
       <w:r>
-        <w:t>Микроклимат характеризуется температурой, относительной влажностью и скоростью движения воздуха. Работа выполняется сидя, без систематических физических нагрузок; энерготраты организма при такой работе не превышают 139 Вт (120 ккал/ч), поэтому она относится к категории Iа. Оптимальные и допустимые значения показателей для этой категории установлены СанПиН 1.2.3685-21 [52, 53]. Источники тепла в помещении — люди, ПЭВМ, светильники и радиаторы отопления; температура поддерживается кондиционером.</w:t>
+        <w:t>Микроклимат характеризуется температурой, относительной влажностью и скоростью движения воздуха. Работа выполняется сидя, без систематических физических нагрузок; энерготраты организма при такой работе не превышают 139 Вт (120 ккал/ч), поэтому она относится к категории Iа. Оптимальные и допустимые значения показателей для этой категории установлены СанПиН 1.2.3685-21 [53, 54]. Источники тепла в помещении — люди, ПЭВМ, светильники и радиаторы отопления; температура поддерживается кондиционером.</w:t>
       </w:r>
     </w:p>
     <w:p>
@@ -2488,7 +2488,7 @@
         <w:keepNext/>
       </w:pPr>
       <w:r>
-        <w:t>Кондиционер сплит-системы не подаёт наружный воздух; воздухообмен обеспечивается естественной вентиляцией через открывающиеся створки окон. Необходимый расход наружного воздуха [54]:</w:t>
+        <w:t>Кондиционер сплит-системы не подаёт наружный воздух; воздухообмен обеспечивается естественной вентиляцией через открывающиеся створки окон. Необходимый расход наружного воздуха [55]:</w:t>
       </w:r>
     </w:p>
     <w:tbl>
@@ -2777,7 +2777,7 @@
     </w:p>
     <w:p>
       <w:r>
-        <w:t>Требуемая кратность воздухообмена 1,6 ч⁻¹ обеспечивается проветриванием через створки окон в регламентированные перерывы; норма 40 м³/ч установлена именно для помещений с естественным проветриванием [54].</w:t>
+        <w:t>Требуемая кратность воздухообмена 1,6 ч⁻¹ обеспечивается проветриванием через створки окон в регламентированные перерывы; норма 40 м³/ч установлена именно для помещений с естественным проветриванием [55].</w:t>
       </w:r>
     </w:p>
     <w:p>
@@ -2790,7 +2790,7 @@
     </w:p>
     <w:p>
       <w:r>
-        <w:t>Работа с экраном монитора и документами относится к зрительным работам высокой точности: наименьший размер объекта различения — элементов знаков на экране — 0,3–0,5 мм, это разряд III; контраст объекта с фоном и фон средние, это подразряд «в». Для него нормируемая освещённость при общем освещении — 300 лк, при комбинированном — 750 лк, показатель ослеплённости — не более 40 [55, 56]. Для рабочих мест с ПЭВМ дополнительно ограничены коэффициент пульсации освещённости — не более 5 % — и освещённость экрана — не более 200 лк [52]. Нормы для зрительных работ разряда III приведены в таблице 5.5.</w:t>
+        <w:t>Работа с экраном монитора и документами относится к зрительным работам высокой точности: наименьший размер объекта различения — элементов знаков на экране — 0,3–0,5 мм, это разряд III; контраст объекта с фоном и фон средние, это подразряд «в». Для него нормируемая освещённость при общем освещении — 300 лк, при комбинированном — 750 лк, показатель ослеплённости — не более 40 [56, 57]. Для рабочих мест с ПЭВМ дополнительно ограничены коэффициент пульсации освещённости — не более 5 % — и освещённость экрана — не более 200 лк [53]. Нормы для зрительных работ разряда III приведены в таблице 5.5.</w:t>
       </w:r>
     </w:p>
     <w:p>
@@ -4975,7 +4975,7 @@
     </w:p>
     <w:p>
       <w:r>
-        <w:t>Общее освещение создают 8 встраиваемых светодиодных панелей 595 × 595 мм мощностью 45 Вт со световым потоком 4 800 лм и коэффициентом пульсации менее 1 %; естественное освещение — боковое, через окна в левой стене. Расчёт в разделе 5.6 показывает, что установленные светильники создают на рабочей поверхности 307 лк при норме 300 лк. Условия труда по световой среде — класс 2 (допустимый) [49].</w:t>
+        <w:t>Общее освещение создают 8 встраиваемых светодиодных панелей 595 × 595 мм мощностью 45 Вт со световым потоком 4 800 лм и коэффициентом пульсации менее 1 %; естественное освещение — боковое, через окна в левой стене. Расчёт в разделе 5.6 показывает, что установленные светильники создают на рабочей поверхности 287 лк при норме 300 лк — на 4,4 % ниже нормы, в пределах допустимого отклонения −10…+20 % [57]. Условия труда по световой среде — класс 2 (допустимый) [50].</w:t>
       </w:r>
     </w:p>
     <w:p>
@@ -4988,7 +4988,7 @@
     </w:p>
     <w:p>
       <w:r>
-        <w:t>Шум снижает внимание и работоспособность и повышает утомляемость. Для рабочих мест, где ведётся научная деятельность, конструирование и программирование, допустимый эквивалентный уровень звука за смену — 50 дБА [52]; допустимые уровни звукового давления в октавных полосах частот приведены в таблице 5.6. Спектр шума в кабинете не измерялся, поэтому шум оценивается по уровню звука в дБА.</w:t>
+        <w:t>Шум снижает внимание и работоспособность и повышает утомляемость. Для рабочих мест, где ведётся научная деятельность, конструирование и программирование, допустимый эквивалентный уровень звука за смену — 50 дБА [53]; допустимые уровни звукового давления в октавных полосах частот приведены в таблице 5.6. Спектр шума в кабинете не измерялся, поэтому шум оценивается по уровню звука в дБА.</w:t>
       </w:r>
     </w:p>
     <w:p>
@@ -5515,7 +5515,7 @@
     </w:p>
     <w:p>
       <w:r>
-        <w:t>Источники шума в кабинете — системные блоки ПЭВМ (одновременно работают до 6), внутренний блок кондиционера и шредер, работающий кратковременно; разговоры сотрудников к производственному шуму не относятся. Уровни звука источников приняты по типовым паспортным данным такого оборудования. Вклад источника в эквивалентный уровень за смену [57, 58]:</w:t>
+        <w:t>Источники шума в кабинете — системные блоки ПЭВМ (одновременно работают до 6), внутренний блок кондиционера и шредер, работающий кратковременно; разговоры сотрудников к производственному шуму не относятся. Уровни звука источников приняты по типовым паспортным данным такого оборудования. Вклад источника в эквивалентный уровень за смену [58, 59]:</w:t>
       </w:r>
     </w:p>
     <w:tbl>
@@ -6502,7 +6502,7 @@
     </w:p>
     <w:p>
       <w:r>
-        <w:t>Тяжесть трудового процесса характеризует физическую нагрузку, напряжённость — нагрузку на центральную нервную систему, органы чувств и эмоциональную сферу [59]. Оценка тяжести приведена в таблице 5.8; итоговый класс равен наибольшему из классов по отдельным показателям.</w:t>
+        <w:t>Тяжесть трудового процесса характеризует физическую нагрузку, напряжённость — нагрузку на центральную нервную систему, органы чувств и эмоциональную сферу [60]. Оценка тяжести приведена в таблице 5.8; итоговый класс равен наибольшему из классов по отдельным показателям.</w:t>
       </w:r>
     </w:p>
     <w:p>
@@ -8733,7 +8733,7 @@
     </w:p>
     <w:p>
       <w:r>
-        <w:t>Из 23 показателей 3 выше класса 2, и это свойства самой исследовательской работы: содержание работы творческое — решения ищутся без готового алгоритма (класс 3.2); измеренные значения постоянно сопоставляются с расчётными и нормативными (класс 3.1); с экраном монитора работа идёт до 6 ч за смену (класс 3.1). По правилу Р 2.2.2006-05 напряжённость признаётся допустимой, если таких показателей не больше пяти, а остальные относятся к классам 1 и 2 [59]. Напряжённость трудового процесса — класс 2 (допустимый). Для снижения утомления через каждый час работы с ПЭВМ делаются перерывы 10–15 мин с упражнениями для глаз и разминкой.</w:t>
+        <w:t>Из 23 показателей 3 выше класса 2, и это свойства самой исследовательской работы: содержание работы творческое — решения ищутся без готового алгоритма (класс 3.2); измеренные значения постоянно сопоставляются с расчётными и нормативными (класс 3.1); с экраном монитора работа идёт до 6 ч за смену (класс 3.1). По правилу Р 2.2.2006-05 напряжённость признаётся допустимой, если таких показателей не больше пяти, а остальные относятся к классам 1 и 2 [60]. Напряжённость трудового процесса — класс 2 (допустимый). Для снижения утомления через каждый час работы с ПЭВМ делаются перерывы 10–15 мин с упражнениями для глаз и разминкой.</w:t>
       </w:r>
     </w:p>
     <w:p>
@@ -8746,7 +8746,7 @@
     </w:p>
     <w:p>
       <w:r>
-        <w:t>Итоговый класс условий труда равен наивысшему из классов по отдельным факторам [49]. Результаты приведены в таблице 5.10.</w:t>
+        <w:t>Итоговый класс условий труда равен наивысшему из классов по отдельным факторам [50]. Результаты приведены в таблице 5.10.</w:t>
       </w:r>
     </w:p>
     <w:p>
@@ -8981,7 +8981,7 @@
               <w:rPr>
                 <w:sz w:val="22"/>
               </w:rPr>
-              <w:t>307 лк</w:t>
+              <w:t>287 лк</w:t>
             </w:r>
           </w:p>
         </w:tc>
@@ -9000,7 +9000,7 @@
               <w:rPr>
                 <w:sz w:val="22"/>
               </w:rPr>
-              <w:t>не менее 300 лк</w:t>
+              <w:t>300 лк (допуск −10…+20 %)</w:t>
             </w:r>
           </w:p>
         </w:tc>
@@ -9332,7 +9332,7 @@
     </w:p>
     <w:p>
       <w:r>
-        <w:t>Конструкция рабочего места и взаимное расположение его элементов должны соответствовать антропометрическим, физиологическим и психологическим требованиям [60, 61]. Компоновка рабочего места специалиста показана на рисунке 5.2: верхний край экрана находится ниже уровня глаз, линия взгляда на центр экрана наклонена к горизонтали на 20°, руки при работе с клавиатурой согнуты в локтях под углом, близким к прямому, стопы стоят на полу.</w:t>
+        <w:t>Конструкция рабочего места и взаимное расположение его элементов должны соответствовать антропометрическим, физиологическим и психологическим требованиям [61, 62]. Компоновка рабочего места специалиста показана на рисунке 5.2: верхний край экрана находится ниже уровня глаз, линия взгляда на центр экрана наклонена к горизонтали на 20°, руки при работе с клавиатурой согнуты в локтях под углом, близким к прямому, стопы стоят на полу.</w:t>
       </w:r>
     </w:p>
     <w:p>
@@ -9387,7 +9387,7 @@
     </w:p>
     <w:p>
       <w:r>
-        <w:t>Органы управления и предметы труда размещаются в пределах зон досягаемости моторного поля [60], показанных на рисунке 5.3: в зоне А (оптимальной) находятся клавиатура и мышь, которыми пользуются постоянно, в зоне Б (лёгкой досягаемости) — документы, в зоне В (досягаемости вытянутой рукой) — редко используемые предметы. Монитор стоит за пределами зон досягаемости, на расстоянии наблюдения.</w:t>
+        <w:t>Органы управления и предметы труда размещаются в пределах зон досягаемости моторного поля [61], показанных на рисунке 5.3: в зоне А (оптимальной) находятся клавиатура и мышь, которыми пользуются постоянно, в зоне Б (лёгкой досягаемости) — документы, в зоне В (досягаемости вытянутой рукой) — редко используемые предметы. Монитор стоит за пределами зон досягаемости, на расстоянии наблюдения.</w:t>
       </w:r>
     </w:p>
     <w:p>
@@ -9442,7 +9442,7 @@
     </w:p>
     <w:p>
       <w:r>
-        <w:t>Параметры рабочего места и видеотерминала сопоставлены с нормативными в таблице 5.11 [61, 62, 63].</w:t>
+        <w:t>Параметры рабочего места и видеотерминала сопоставлены с нормативными в таблице 5.11 [62, 63, 64].</w:t>
       </w:r>
     </w:p>
     <w:p>
@@ -10574,12 +10574,12 @@
     </w:p>
     <w:p>
       <w:r>
-        <w:t>По опасности поражения электрическим током помещения делятся на помещения без повышенной опасности, с повышенной опасностью и особо опасные [64]. Относительная влажность воздуха в кабинете — 45 % (раздел 5.2.2), то есть не более 60 %, поэтому по ПУЭ помещение сухое; температура нормальная, токопроводящая пыль отсутствует, пол — ламинат — не проводит ток. Металлические радиаторы отопления, соединённые с землёй, закрыты декоративными экранами, поэтому одновременное прикосновение к радиатору и корпусу ПЭВМ исключено. Кабинет относится к помещениям без повышенной опасности.</w:t>
+        <w:t>По опасности поражения электрическим током помещения делятся на помещения без повышенной опасности, с повышенной опасностью и особо опасные [65]. Относительная влажность воздуха в кабинете — 45 % (раздел 5.2.2), то есть не более 60 %, поэтому по ПУЭ помещение сухое; температура нормальная, токопроводящая пыль отсутствует, пол — ламинат — не проводит ток. Металлические радиаторы отопления, соединённые с землёй, закрыты декоративными экранами, поэтому одновременное прикосновение к радиатору и корпусу ПЭВМ исключено. Кабинет относится к помещениям без повышенной опасности.</w:t>
       </w:r>
     </w:p>
     <w:p>
       <w:r>
-        <w:t>Предельно допустимые значения напряжения прикосновения и тока при нормальном режиме электроустановки переменного тока 50 Гц составляют 2 В и 0,3 мА, при аварийном режиме — зависят от продолжительности воздействия тока и приведены в таблице 5.12 [65].</w:t>
+        <w:t>Предельно допустимые значения напряжения прикосновения и тока при нормальном режиме электроустановки переменного тока 50 Гц составляют 2 В и 0,3 мА, при аварийном режиме — зависят от продолжительности воздействия тока и приведены в таблице 5.12 [66].</w:t>
       </w:r>
     </w:p>
     <w:p>
@@ -11498,7 +11498,7 @@
     </w:p>
     <w:p>
       <w:r>
-        <w:t>Для защиты от поражения током [66, 67]:</w:t>
+        <w:t>Для защиты от поражения током [67, 68]:</w:t>
       </w:r>
     </w:p>
     <w:p>
@@ -11535,7 +11535,7 @@
     </w:p>
     <w:p>
       <w:r>
-        <w:t>Статическое электричество. Синтетическая обивка кресел способствует накоплению зарядов на теле человека; разряды неприятны и могут повредить электронику. Напряжённость электростатического поля на рабочем месте пользователя ПЭВМ не должна превышать 15 кВ/м [52]. Электризацию ограничивают оптимальная влажность воздуха (45 %) и заземление корпусов ПЭВМ через розетки с заземляющим контактом.</w:t>
+        <w:t>Статическое электричество. Синтетическая обивка кресел способствует накоплению зарядов на теле человека; разряды неприятны и могут повредить электронику. Напряжённость электростатического поля на рабочем месте пользователя ПЭВМ не должна превышать 15 кВ/м [53]. Электризацию ограничивают оптимальная влажность воздуха (45 %) и заземление корпусов ПЭВМ через розетки с заземляющим контактом.</w:t>
       </w:r>
     </w:p>
     <w:p>
@@ -11553,7 +11553,7 @@
     </w:p>
     <w:p>
       <w:r>
-        <w:t>Кабинет предназначен для научно-исследовательской работы на ПЭВМ и расположен в офисном здании. Здания научных и проектно-конструкторских организаций, контор и офисов по классу функциональной пожарной опасности относятся к Ф4.3 [68]. Категории помещений по взрывопожарной и пожарной опасности (А, Б, В1–В4, Г, Д) устанавливаются для производственных и складских помещений [69], поэтому для кабинета категория не определяется. Класс Ф4.3 определяет требования к зданию — к эвакуационным путям и выходам, системам оповещения и пожарной сигнализации [68]; при эксплуатации кабинета действуют Правила противопожарного режима [70], из которых следуют мероприятия:</w:t>
+        <w:t>Кабинет предназначен для научно-исследовательской работы на ПЭВМ и расположен в офисном здании. Здания научных и проектно-конструкторских организаций, контор и офисов по классу функциональной пожарной опасности относятся к Ф4.3 [69]. Категории помещений по взрывопожарной и пожарной опасности (А, Б, В1–В4, Г, Д) устанавливаются для производственных и складских помещений [70], поэтому для кабинета категория не определяется. Класс Ф4.3 определяет требования к зданию — к эвакуационным путям и выходам, системам оповещения и пожарной сигнализации [69]; при эксплуатации кабинета действуют Правила противопожарного режима [71], из которых следуют мероприятия:</w:t>
       </w:r>
     </w:p>
     <w:p>
@@ -11561,7 +11561,7 @@
         <w:t xml:space="preserve">– </w:t>
       </w:r>
       <w:r>
-        <w:t>в верхнем правом углу прихожей, у выхода, установлен огнетушитель; для тушения электрооборудования под напряжением до 1000 В пригодны углекислотные ОУ-3, ОУ-5 и порошковые ОП-4 огнетушители, углекислотные не портят электронику [71];</w:t>
+        <w:t>в верхнем правом углу прихожей, у выхода, установлен огнетушитель; для тушения электрооборудования под напряжением до 1000 В пригодны углекислотные ОУ-3, ОУ-5 и порошковые ОП-4 огнетушители, углекислотные не портят электронику [72];</w:t>
       </w:r>
     </w:p>
     <w:p>
@@ -11606,7 +11606,7 @@
     </w:p>
     <w:p>
       <w:r>
-        <w:t>Индивидуальное задание — расчёт общего искусственного освещения кабинета. Расчёт выполняется методом коэффициента использования светового потока, который применяется для равномерно освещённых горизонтальных поверхностей [55, 56]. Нормируемая освещённость — 300 лк на горизонтальной рабочей поверхности на высоте 0,8 м (раздел 5.2.3).</w:t>
+        <w:t>Индивидуальное задание — расчёт общего искусственного освещения кабинета. Расчёт выполняется методом коэффициента использования светового потока, который применяется для равномерно освещённых горизонтальных поверхностей [56, 57]. Нормируемая освещённость — 300 лк на горизонтальной рабочей поверхности на высоте 0,8 м (раздел 5.2.3).</w:t>
       </w:r>
     </w:p>
     <w:p>
@@ -12091,7 +12091,7 @@
     </w:p>
     <w:p>
       <w:r>
-        <w:t>Коэффициенты отражения потолка, стен и пола (ламинат) — 70, 50 и 30 %. Коэффициент запаса для помещения с нормальными условиями среды Kз = 1,4, коэффициент неравномерности освещённости z = 1,1 [55, 56].</w:t>
+        <w:t>Коэффициенты отражения потолка, стен и пола (ламинат) — 70, 50 и 30 %. Коэффициент запаса для административно-конструкторских помещений Kз = 1,5, коэффициент неравномерности освещённости z = 1,1 [57]; значения приняты как для газоразрядных источников света: светодиодных светильников в таблицах методических указаний нет.</w:t>
       </w:r>
     </w:p>
     <w:p>
@@ -12099,7 +12099,7 @@
         <w:keepNext/>
       </w:pPr>
       <w:r>
-        <w:t>В кабинете установлены светильники — встраиваемые светодиодные панели 595 × 595 мм для потолка «Армстронг»: мощность 45 Вт, световой поток 4 800 лм, коэффициент пульсации менее 1 %, цветовая температура 4000 К, индекс цветопередачи не менее 80, матовый (опаловый) рассеиватель; светораспределение косинусное, тип кривой силы света Д-1. Коэффициент использования светового потока зависит от типа кривой силы света, индекса помещения и коэффициентов отражения; для светильников с типовыми кривыми он приведён в таблице 5.13 [72].</w:t>
+        <w:t>В кабинете установлены светильники — встраиваемые светодиодные панели 595 × 595 мм для потолка «Армстронг»: мощность 45 Вт, световой поток 4 800 лм, коэффициент пульсации менее 1 %, цветовая температура 4000 К, индекс цветопередачи не менее 80, матовый (опаловый) рассеиватель; светораспределение косинусное, тип кривой силы света Д-1. Коэффициент использования светового потока зависит от типа кривой силы света, индекса помещения и коэффициентов отражения; для светильников с типовыми кривыми он приведён в таблице 5.13 [57, 73].</w:t>
       </w:r>
     </w:p>
     <w:p>
@@ -13847,7 +13847,7 @@
         <w:keepNext/>
       </w:pPr>
       <w:r>
-        <w:t>Для i = 1,52 коэффициент использования находится линейной интерполяцией между значениями при i = 1,25 (58 %) и i = 2 (72 %): η = 0,63. Такое же значение, 0,63 при i = 1,5, даёт таблица производителя для встраиваемой светодиодной панели 595 × 595 мм с опаловым рассеивателем [73]. Необходимый суммарный световой поток:</w:t>
+        <w:t>Для i = 1,52 коэффициент использования находится линейной интерполяцией между значениями при i = 1,25 (58 %) и i = 2 (72 %): η = 0,63. Такое же значение, 0,63 при i = 1,5, даёт таблица производителя для встраиваемой светодиодной панели 595 × 595 мм с опаловым рассеивателем [74]. Необходимый суммарный световой поток:</w:t>
       </w:r>
     </w:p>
     <w:tbl>
@@ -14034,7 +14034,7 @@
                     <w:rPr>
                       <w:rFonts w:ascii="Cambria Math" w:hAnsi="Cambria Math"/>
                     </w:rPr>
-                    <m:t xml:space="preserve">300·51,1·1,4·1,1</m:t>
+                    <m:t xml:space="preserve">300·51,1·1,5·1,1</m:t>
                   </m:r>
                 </m:num>
                 <m:den>
@@ -14056,7 +14056,7 @@
                 <w:rPr>
                   <w:rFonts w:ascii="Cambria Math" w:hAnsi="Cambria Math"/>
                 </w:rPr>
-                <m:t xml:space="preserve"> = 37 488 лм,</m:t>
+                <m:t xml:space="preserve"> = 40 166 лм,</m:t>
               </m:r>
             </m:oMath>
           </w:p>
@@ -14266,7 +14266,7 @@
                     <w:rPr>
                       <w:rFonts w:ascii="Cambria Math" w:hAnsi="Cambria Math"/>
                     </w:rPr>
-                    <m:t xml:space="preserve">37 488</m:t>
+                    <m:t xml:space="preserve">40 166</m:t>
                   </m:r>
                 </m:num>
                 <m:den>
@@ -14288,7 +14288,7 @@
                 <w:rPr>
                   <w:rFonts w:ascii="Cambria Math" w:hAnsi="Cambria Math"/>
                 </w:rPr>
-                <m:t xml:space="preserve"> = 7,81 ≈ 8,</m:t>
+                <m:t xml:space="preserve"> = 8,37 ≈ 8,</m:t>
               </m:r>
             </m:oMath>
           </w:p>
@@ -14345,8 +14345,128 @@
       </w:r>
     </w:p>
     <w:p>
+      <w:pPr>
+        <w:keepNext/>
+      </w:pPr>
       <w:r>
-        <w:t>Расчётное число совпадает с числом установленных светильников. Они расположены в 2 ряда по 4 вдоль длинной стороны помещения (рисунок 5.4). Расстояние между рядами L = 2,50 м, от крайних рядов до стен l = 1,25 м; в ряду светильники стоят через 2,33 м. Отношение L/h = 1,14 не превышает наивыгоднейшего значения 1,4 для светильников с косинусным светораспределением, то есть освещённость между светильниками не проседает.</w:t>
+        <w:t>Принимаются 8 светильников, по 4 в 2 рядах. Требуемый поток одного светильника при этом числе — ФΣ / N = 40 166 / 8 = 5 021 лм. Отклонение номинального потока выбранного светильника от требуемого:</w:t>
+      </w:r>
+    </w:p>
+    <w:p>
+      <w:pPr>
+        <w:pStyle w:val="Formula"/>
+        <w:jc w:val="center"/>
+      </w:pPr>
+      <m:oMath>
+        <m:r>
+          <m:rPr>
+            <m:sty m:val="p"/>
+          </m:rPr>
+          <w:rPr>
+            <w:rFonts w:ascii="Cambria Math" w:hAnsi="Cambria Math"/>
+          </w:rPr>
+          <m:t xml:space="preserve">ΔФ = </m:t>
+        </m:r>
+        <m:f>
+          <m:num>
+            <m:sSub>
+              <m:e>
+                <m:r>
+                  <w:rPr>
+                    <w:rFonts w:ascii="Cambria Math" w:hAnsi="Cambria Math"/>
+                  </w:rPr>
+                  <m:t xml:space="preserve">Ф</m:t>
+                </m:r>
+              </m:e>
+              <m:sub>
+                <m:r>
+                  <m:rPr>
+                    <m:sty m:val="p"/>
+                  </m:rPr>
+                  <w:rPr>
+                    <w:rFonts w:ascii="Cambria Math" w:hAnsi="Cambria Math"/>
+                  </w:rPr>
+                  <m:t xml:space="preserve">л</m:t>
+                </m:r>
+              </m:sub>
+            </m:sSub>
+            <m:r>
+              <m:rPr>
+                <m:sty m:val="p"/>
+              </m:rPr>
+              <w:rPr>
+                <w:rFonts w:ascii="Cambria Math" w:hAnsi="Cambria Math"/>
+              </w:rPr>
+              <m:t xml:space="preserve"> - </m:t>
+            </m:r>
+            <m:r>
+              <w:rPr>
+                <w:rFonts w:ascii="Cambria Math" w:hAnsi="Cambria Math"/>
+              </w:rPr>
+              <m:t xml:space="preserve">Ф</m:t>
+            </m:r>
+          </m:num>
+          <m:den>
+            <m:r>
+              <w:rPr>
+                <w:rFonts w:ascii="Cambria Math" w:hAnsi="Cambria Math"/>
+              </w:rPr>
+              <m:t xml:space="preserve">Ф</m:t>
+            </m:r>
+          </m:den>
+        </m:f>
+        <m:r>
+          <m:rPr>
+            <m:sty m:val="p"/>
+          </m:rPr>
+          <w:rPr>
+            <w:rFonts w:ascii="Cambria Math" w:hAnsi="Cambria Math"/>
+          </w:rPr>
+          <m:t xml:space="preserve">·100 = </m:t>
+        </m:r>
+        <m:f>
+          <m:num>
+            <m:r>
+              <m:rPr>
+                <m:sty m:val="p"/>
+              </m:rPr>
+              <w:rPr>
+                <w:rFonts w:ascii="Cambria Math" w:hAnsi="Cambria Math"/>
+              </w:rPr>
+              <m:t xml:space="preserve">4 800 - 5 021</m:t>
+            </m:r>
+          </m:num>
+          <m:den>
+            <m:r>
+              <m:rPr>
+                <m:sty m:val="p"/>
+              </m:rPr>
+              <w:rPr>
+                <w:rFonts w:ascii="Cambria Math" w:hAnsi="Cambria Math"/>
+              </w:rPr>
+              <m:t xml:space="preserve">5 021</m:t>
+            </m:r>
+          </m:den>
+        </m:f>
+        <m:r>
+          <m:rPr>
+            <m:sty m:val="p"/>
+          </m:rPr>
+          <w:rPr>
+            <w:rFonts w:ascii="Cambria Math" w:hAnsi="Cambria Math"/>
+          </w:rPr>
+          <m:t xml:space="preserve">·100 = −4,4 %.</m:t>
+        </m:r>
+      </m:oMath>
+    </w:p>
+    <w:p>
+      <w:r>
+        <w:t>Методические указания допускают отклонение потока от требуемого в пределах −10…+20 % [57], поэтому принятое число светильников обеспечивает нормируемую освещённость.</w:t>
+      </w:r>
+    </w:p>
+    <w:p>
+      <w:r>
+        <w:t>Принятое число совпадает с числом установленных светильников. Они расположены в 2 ряда по 4 вдоль длинной стороны помещения (рисунок 5.4). Расстояние между рядами L = 2,50 м, от крайних рядов до стен l = 1,25 м; в ряду светильники стоят через 2,33 м. Отношение L/h = 1,14 не превышает наивыгоднейшего значения 1,4 для светильников с косинусным светораспределением, то есть освещённость между светильниками не проседает.</w:t>
       </w:r>
     </w:p>
     <w:p>
@@ -14602,7 +14722,7 @@
                     <w:rPr>
                       <w:rFonts w:ascii="Cambria Math" w:hAnsi="Cambria Math"/>
                     </w:rPr>
-                    <m:t xml:space="preserve">51,1·1,4·1,1</m:t>
+                    <m:t xml:space="preserve">51,1·1,5·1,1</m:t>
                   </m:r>
                 </m:den>
               </m:f>
@@ -14613,7 +14733,7 @@
                 <w:rPr>
                   <w:rFonts w:ascii="Cambria Math" w:hAnsi="Cambria Math"/>
                 </w:rPr>
-                <m:t xml:space="preserve"> = 307 лк.</m:t>
+                <m:t xml:space="preserve"> = 287 лк.</m:t>
               </m:r>
             </m:oMath>
           </w:p>
@@ -14728,7 +14848,7 @@
     </w:p>
     <w:p>
       <w:r>
-        <w:t>удельная мощность — 7,0 Вт/м². Освещённость 307 лк не ниже нормы 300 лк, пульсация светодиодных панелей менее 1 % при норме не более 5 %, матовый рассеиватель ограничивает блёскость. Установленное общее освещение соответствует нормам, условия труда по световой среде — допустимые (класс 2).</w:t>
+        <w:t>удельная мощность — 7,0 Вт/м². Освещённость 287 лк на 4,4 % ниже нормы 300 лк, что в пределах допустимого отклонения −10…+20 % [57], пульсация светодиодных панелей менее 1 % при норме не более 5 %, матовый рассеиватель ограничивает блёскость. Установленное общее освещение соответствует нормам, условия труда по световой среде — допустимые (класс 2).</w:t>
       </w:r>
     </w:p>
     <w:p>
@@ -14757,7 +14877,7 @@
         <w:t xml:space="preserve">– </w:t>
       </w:r>
       <w:r>
-        <w:t>освещённость рабочих мест — 307 лк при норме 300 лк;</w:t>
+        <w:t>освещённость рабочих мест — 287 лк при норме 300 лк, в пределах допустимого отклонения −10…+20 %;</w:t>
       </w:r>
     </w:p>
     <w:p>
@@ -14783,7 +14903,7 @@
     </w:p>
     <w:p>
       <w:r>
-        <w:t>По индивидуальному заданию было предложено спроектировать и рассчитать общее искусственное освещение кабинета методом коэффициента использования светового потока. В результате расчёта были выбраны встраиваемые светодиодные панели мощностью 45 Вт со световым потоком 4 800 лм в количестве 8 шт.; они обеспечивают освещённость 307 лк при норме 300 лк и пульсацию менее 1 % при норме не более 5 %. Расчётное число панелей совпадает с установленным в кабинете.</w:t>
+        <w:t>По индивидуальному заданию было предложено спроектировать и рассчитать общее искусственное освещение кабинета методом коэффициента использования светового потока. В результате расчёта были выбраны встраиваемые светодиодные панели мощностью 45 Вт со световым потоком 4 800 лм в количестве 8 шт.; они обеспечивают освещённость 287 лк при норме 300 лк (в пределах допустимого отклонения −10…+20 %) и пульсацию менее 1 % при норме не более 5 %. Расчётное число панелей совпадает с установленным в кабинете.</w:t>
       </w:r>
     </w:p>
     <w:sectPr>
@@ -14793,7 +14913,7 @@
       <w:pgMar w:top="1134" w:right="850" w:bottom="1417" w:left="1701" w:header="283" w:footer="283" w:gutter="0"/>
       <w:cols w:space="720"/>
       <w:docGrid w:linePitch="360"/>
-      <w:pgNumType w:start="63"/>
+      <w:pgNumType w:start="70"/>
     </w:sectPr>
   </w:body>
 </w:document>
@@ -14973,7 +15093,7 @@
           </w:pPr>
           <w:r>
             <w:rPr>
-              <w:rFonts w:ascii="GOST type B" w:hAnsi="GOST type B" w:cs="GOST type B" w:eastAsia="GOST type B"/>
+              <w:rFonts w:ascii="Arial" w:hAnsi="Arial" w:cs="Arial" w:eastAsia="Arial"/>
               <w:i/>
               <w:sz w:val="32"/>
               <w:szCs w:val="32"/>
@@ -15005,7 +15125,7 @@
           </w:pPr>
           <w:r>
             <w:rPr>
-              <w:rFonts w:ascii="GOST type B" w:hAnsi="GOST type B" w:cs="GOST type B" w:eastAsia="GOST type B"/>
+              <w:rFonts w:ascii="Arial" w:hAnsi="Arial" w:cs="Arial" w:eastAsia="Arial"/>
               <w:i/>
               <w:sz w:val="17"/>
             </w:rPr>
@@ -15170,7 +15290,7 @@
           </w:pPr>
           <w:r>
             <w:rPr>
-              <w:rFonts w:ascii="GOST type B" w:hAnsi="GOST type B" w:cs="GOST type B" w:eastAsia="GOST type B"/>
+              <w:rFonts w:ascii="Arial" w:hAnsi="Arial" w:cs="Arial" w:eastAsia="Arial"/>
               <w:i/>
               <w:sz w:val="22"/>
               <w:szCs w:val="22"/>
@@ -15179,7 +15299,7 @@
           </w:r>
           <w:r>
             <w:rPr>
-              <w:rFonts w:ascii="GOST type B" w:hAnsi="GOST type B" w:cs="GOST type B" w:eastAsia="GOST type B"/>
+              <w:rFonts w:ascii="Arial" w:hAnsi="Arial" w:cs="Arial" w:eastAsia="Arial"/>
               <w:i/>
               <w:sz w:val="22"/>
               <w:szCs w:val="22"/>
@@ -15188,7 +15308,7 @@
           </w:r>
           <w:r>
             <w:rPr>
-              <w:rFonts w:ascii="GOST type B" w:hAnsi="GOST type B" w:cs="GOST type B" w:eastAsia="GOST type B"/>
+              <w:rFonts w:ascii="Arial" w:hAnsi="Arial" w:cs="Arial" w:eastAsia="Arial"/>
               <w:i/>
               <w:sz w:val="22"/>
               <w:szCs w:val="22"/>
@@ -15232,7 +15352,7 @@
           </w:pPr>
           <w:r>
             <w:rPr>
-              <w:rFonts w:ascii="GOST type B" w:hAnsi="GOST type B" w:cs="GOST type B" w:eastAsia="GOST type B"/>
+              <w:rFonts w:ascii="Arial" w:hAnsi="Arial" w:cs="Arial" w:eastAsia="Arial"/>
               <w:i/>
               <w:sz w:val="17"/>
             </w:rPr>
@@ -15263,7 +15383,7 @@
           </w:pPr>
           <w:r>
             <w:rPr>
-              <w:rFonts w:ascii="GOST type B" w:hAnsi="GOST type B" w:cs="GOST type B" w:eastAsia="GOST type B"/>
+              <w:rFonts w:ascii="Arial" w:hAnsi="Arial" w:cs="Arial" w:eastAsia="Arial"/>
               <w:i/>
               <w:sz w:val="17"/>
             </w:rPr>
@@ -15294,7 +15414,7 @@
           </w:pPr>
           <w:r>
             <w:rPr>
-              <w:rFonts w:ascii="GOST type B" w:hAnsi="GOST type B" w:cs="GOST type B" w:eastAsia="GOST type B"/>
+              <w:rFonts w:ascii="Arial" w:hAnsi="Arial" w:cs="Arial" w:eastAsia="Arial"/>
               <w:i/>
               <w:sz w:val="17"/>
             </w:rPr>
@@ -15325,7 +15445,7 @@
           </w:pPr>
           <w:r>
             <w:rPr>
-              <w:rFonts w:ascii="GOST type B" w:hAnsi="GOST type B" w:cs="GOST type B" w:eastAsia="GOST type B"/>
+              <w:rFonts w:ascii="Arial" w:hAnsi="Arial" w:cs="Arial" w:eastAsia="Arial"/>
               <w:i/>
               <w:sz w:val="17"/>
             </w:rPr>
@@ -15356,7 +15476,7 @@
           </w:pPr>
           <w:r>
             <w:rPr>
-              <w:rFonts w:ascii="GOST type B" w:hAnsi="GOST type B" w:cs="GOST type B" w:eastAsia="GOST type B"/>
+              <w:rFonts w:ascii="Arial" w:hAnsi="Arial" w:cs="Arial" w:eastAsia="Arial"/>
               <w:i/>
               <w:sz w:val="17"/>
             </w:rPr>

</xml_diff>

<commit_message>
Economics conclusions: duration bound; labour safety: 500 lx note, wording
Co-Authored-By: Claude Opus 5.5 <noreply@anthropic.com>
</commit_message>
<xml_diff>
--- a/docs/ohrana_truda/Okhrana_truda_HaLow.docx
+++ b/docs/ohrana_truda/Okhrana_truda_HaLow.docx
@@ -2790,7 +2790,7 @@
     </w:p>
     <w:p>
       <w:r>
-        <w:t>Работа с экраном монитора и документами относится к зрительным работам высокой точности: наименьший размер объекта различения — элементов знаков на экране — 0,3–0,5 мм, это разряд III; контраст объекта с фоном и фон средние, это подразряд «в». Для него нормируемая освещённость при общем освещении — 300 лк, при комбинированном — 750 лк, показатель ослеплённости — не более 40 [56, 57]. Для рабочих мест с ПЭВМ дополнительно ограничены коэффициент пульсации освещённости — не более 5 % — и освещённость экрана — не более 200 лк [53]. Нормы для зрительных работ разряда III приведены в таблице 5.5.</w:t>
+        <w:t>Работа с экраном монитора и документами относится к зрительным работам высокой точности: наименьший размер объекта различения — элементов знаков на экране — 0,3–0,5 мм, это разряд III; контраст объекта с фоном и фон средние, это подразряд «в». Для него нормируемая освещённость при общем освещении — 300 лк, при комбинированном — 750 лк, показатель ослеплённости — не более 40 [56, 57]. Для рабочих мест с ПЭВМ дополнительно ограничены коэффициент пульсации освещённости — не более 5 % — и освещённость экрана — не более 200 лк [53]. Нормы для зрительных работ разряда III приведены в таблице 5.5. Для залов ЭВМ методические указания [57] приводят более высокую норму — 500 лк — по отменённому СНиП II-4-79; кабинет с ПЭВМ к залам ЭВМ не относится, а действующие санитарные нормы требуют на поверхности стола у рабочего места с ПЭВМ 300–500 лк [53].</w:t>
       </w:r>
     </w:p>
     <w:p>
@@ -14903,7 +14903,7 @@
     </w:p>
     <w:p>
       <w:r>
-        <w:t>По индивидуальному заданию было предложено спроектировать и рассчитать общее искусственное освещение кабинета методом коэффициента использования светового потока. В результате расчёта были выбраны встраиваемые светодиодные панели мощностью 45 Вт со световым потоком 4 800 лм в количестве 8 шт.; они обеспечивают освещённость 287 лк при норме 300 лк (в пределах допустимого отклонения −10…+20 %) и пульсацию менее 1 % при норме не более 5 %. Расчётное число панелей совпадает с установленным в кабинете.</w:t>
+        <w:t>По индивидуальному заданию было предложено спроектировать и рассчитать общее искусственное освещение кабинета методом коэффициента использования светового потока. В результате расчёта были выбраны встраиваемые светодиодные панели мощностью 45 Вт со световым потоком 4 800 лм в количестве 8 шт.; они обеспечивают освещённость 287 лк при норме 300 лк (в пределах допустимого отклонения −10…+20 %) и пульсацию менее 1 % при норме не более 5 %. Принятое число панелей совпадает с установленным в кабинете.</w:t>
       </w:r>
     </w:p>
     <w:sectPr>

</xml_diff>

<commit_message>
Labour safety: no L/h check (as in sample), KSS from manufacturer; journal group as in assignment
Co-Authored-By: Claude Opus 5.5 <noreply@anthropic.com>
</commit_message>
<xml_diff>
--- a/docs/ohrana_truda/Okhrana_truda_HaLow.docx
+++ b/docs/ohrana_truda/Okhrana_truda_HaLow.docx
@@ -12099,7 +12099,7 @@
         <w:keepNext/>
       </w:pPr>
       <w:r>
-        <w:t>В кабинете установлены светильники — встраиваемые светодиодные панели 595 × 595 мм для потолка «Армстронг»: мощность 45 Вт, световой поток 4 800 лм, коэффициент пульсации менее 1 %, цветовая температура 4000 К, индекс цветопередачи не менее 80, матовый (опаловый) рассеиватель; светораспределение косинусное, тип кривой силы света Д-1. Коэффициент использования светового потока зависит от типа кривой силы света, индекса помещения и коэффициентов отражения; для светильников с типовыми кривыми он приведён в таблице 5.13 [57, 73].</w:t>
+        <w:t>В кабинете установлены светильники — встраиваемые светодиодные панели 595 × 595 мм для потолка «Армстронг»: мощность 45 Вт, световой поток 4 800 лм, коэффициент пульсации менее 1 %, цветовая температура 4000 К, индекс цветопередачи не менее 80, матовый (опаловый) рассеиватель; светораспределение косинусное, тип кривой силы света Д-1 по данным производителя [73]. Коэффициент использования светового потока зависит от типа кривой силы света, индекса помещения и коэффициентов отражения; для светильников с типовыми кривыми он приведён в таблице 5.13 [57, 74].</w:t>
       </w:r>
     </w:p>
     <w:p>
@@ -13847,7 +13847,7 @@
         <w:keepNext/>
       </w:pPr>
       <w:r>
-        <w:t>Для i = 1,52 коэффициент использования находится линейной интерполяцией между значениями при i = 1,25 (58 %) и i = 2 (72 %): η = 0,63. Такое же значение, 0,63 при i = 1,5, даёт таблица производителя для встраиваемой светодиодной панели 595 × 595 мм с опаловым рассеивателем [74]. Необходимый суммарный световой поток:</w:t>
+        <w:t>Для i = 1,52 коэффициент использования находится линейной интерполяцией между значениями при i = 1,25 (58 %) и i = 2 (72 %): η = 0,63. Такое же значение, 0,63 при i = 1,5, даёт таблица производителя для встраиваемой светодиодной панели 595 × 595 мм с опаловым рассеивателем [73]. Необходимый суммарный световой поток:</w:t>
       </w:r>
     </w:p>
     <w:tbl>
@@ -14466,7 +14466,7 @@
     </w:p>
     <w:p>
       <w:r>
-        <w:t>Принятое число совпадает с числом установленных светильников. Они расположены в 2 ряда по 4 вдоль длинной стороны помещения (рисунок 5.4). Расстояние между рядами L = 2,50 м, от крайних рядов до стен l = 1,25 м; в ряду светильники стоят через 2,33 м. Отношение L/h = 1,14 не превышает наивыгоднейшего значения 1,4 для светильников с косинусным светораспределением, то есть освещённость между светильниками не проседает.</w:t>
+        <w:t>Принятое число совпадает с числом установленных светильников. Они расположены в 2 ряда по 4 вдоль длинной стороны помещения (рисунок 5.4). Расстояние между рядами L = 2,50 м, от крайних рядов до стен l = 1,25 м; в ряду светильники стоят через 2,33 м.</w:t>
       </w:r>
     </w:p>
     <w:p>

</xml_diff>

<commit_message>
Labour safety, journal and main text: user edits and review comments
- Labour safety: tolerance applies to the 287 lx design value (new panels ~430 lx);
  category Ia per GOST 12.1.005-88; CO2 extinguisher OU-2; KSS D-1 chosen as the
  conservative option; hearing-load row reworded; Kz remark dropped
- Practice journal: user edits; no counter-UAV remark (source dropped, refs renumbered),
  GKRCh decision named, simpler throughput paragraph, image quality at range,
  table 1 fits one page
- Main text: user edits carried into the source; regulation paragraph shorter, no dipole
- Deck: slide 14 lighting row

Co-Authored-By: Claude Opus 5.5 <noreply@anthropic.com>
</commit_message>
<xml_diff>
--- a/docs/ohrana_truda/Okhrana_truda_HaLow.docx
+++ b/docs/ohrana_truda/Okhrana_truda_HaLow.docx
@@ -1730,7 +1730,7 @@
     </w:p>
     <w:p>
       <w:r>
-        <w:t>Микроклимат характеризуется температурой, относительной влажностью и скоростью движения воздуха. Работа выполняется сидя, без систематических физических нагрузок; энерготраты организма при такой работе не превышают 139 Вт (120 ккал/ч), поэтому она относится к категории Iа. Оптимальные и допустимые значения показателей для этой категории установлены СанПиН 1.2.3685-21 [53, 54]. Источники тепла в помещении — люди, ПЭВМ, светильники и радиаторы отопления; температура поддерживается кондиционером.</w:t>
+        <w:t>Микроклимат характеризуется температурой, относительной влажностью и скоростью движения воздуха. Работа выполняется сидя, без систематических физических нагрузок. По ГОСТ 12.1.005-88 (приложение 1) работы, производимые сидя и сопровождающиеся незначительным физическим напряжением, с интенсивностью энергозатрат до 120 ккал/ч (139 Вт) относятся к категории Iа [53]. Оптимальные и допустимые значения показателей для этой категории установлены СанПиН 1.2.3685-21 [53, 54]. Источники тепла в помещении — люди, ПЭВМ, светильники и радиаторы отопления; температура поддерживается кондиционером.</w:t>
       </w:r>
     </w:p>
     <w:p>
@@ -2790,7 +2790,7 @@
     </w:p>
     <w:p>
       <w:r>
-        <w:t>Работа с экраном монитора и документами относится к зрительным работам высокой точности: наименьший размер объекта различения — элементов знаков на экране — 0,3–0,5 мм, это разряд III (высота самих знаков — 1,1–5 мм, этот размер учитывается в оценке напряжённости, раздел 5.2.5); контраст объекта с фоном и фон средние, это подразряд «в». Для него нормируемая освещённость при общем освещении — 300 лк, при комбинированном — 750 лк, показатель ослеплённости — не более 40 [56, 57]. Для рабочих мест с ПЭВМ дополнительно ограничены коэффициент пульсации освещённости — не более 5 % — и освещённость экрана — не более 200 лк [53]. Нормы для зрительных работ разряда III приведены в таблице 5.5.</w:t>
+        <w:t>Работа с экраном монитора и документами относится к зрительным работам высокой точности: наименьший размер объекта различения — элементов знаков на экране — 0,3–0,5 мм, это разряд III (высота самих знаков — 1,1–5 мм, этот размер учитывается в оценке напряжённости, раздел 5.2.5); контраст объекта с фоном и фон средние, это подразряд «в». Для него нормируемая освещённость при общем освещении — 300 лк, при комбинированном — 750 лк, показатель ослеплённости — не более 40 [56, 57]. Для рабочих мест с ПЭВМ дополнительно ограничены коэффициент пульсации освещённости — не более 5 % — и освещённость экрана — не более 200 лк [54]. Нормы для зрительных работ разряда III приведены в таблице 5.5.</w:t>
       </w:r>
     </w:p>
     <w:p>
@@ -4975,7 +4975,7 @@
     </w:p>
     <w:p>
       <w:r>
-        <w:t>Общее освещение создают 8 встраиваемых светодиодных панелей 595 × 595 мм мощностью 45 Вт со световым потоком 4 800 лм и коэффициентом пульсации менее 1 %; естественное освещение — боковое, через окно в левой стене. Расчёт в разделе 5.6 показывает, что новые светильники создают на рабочей поверхности около 430 лк, а к концу срока службы, с учётом коэффициента запаса, — 287 лк; отклонение от нормы 300 лк — в пределах допуска −10…+20 %, принятого при проектировании освещения [57]. Условия труда по световой среде приняты допустимыми (класс 2); при специальной оценке условий труда класс устанавливается по измеренной освещённости [50].</w:t>
+        <w:t>Общее освещение создают 8 встраиваемых светодиодных панелей 595 × 595 мм мощностью 45 Вт со световым потоком 4 800 лм и коэффициентом пульсации менее 1 %; естественное освещение — боковое, через окно в левой стене. Расчёт в разделе 5.6 показывает, что к концу срока службы, с учётом коэффициента запаса, светильники создают на рабочей поверхности 287 лк: отклонение от нормы 300 лк составляет −4,4 % и находится в пределах допуска −10…+20 %, принятого при проектировании освещения [57]. Допуск относится именно к этой, расчётной освещённости. Новые светильники дают больше — около 430 лк: запас в 1,5 раза заложен на снижение их потока и загрязнение. Условия труда по световой среде приняты допустимыми (класс 2); при специальной оценке условий труда класс устанавливается по измеренной освещённости [50].</w:t>
       </w:r>
     </w:p>
     <w:p>
@@ -4988,7 +4988,7 @@
     </w:p>
     <w:p>
       <w:r>
-        <w:t>Шум снижает внимание и работоспособность и повышает утомляемость. Для рабочих мест, где ведётся научная деятельность, конструирование и программирование, допустимый эквивалентный уровень звука за смену — 50 дБА [53]; допустимые уровни звукового давления в октавных полосах частот приведены в таблице 5.6. Спектр шума в кабинете не измерялся, поэтому шум оценивается по уровню звука в дБА.</w:t>
+        <w:t>Шум снижает внимание и работоспособность и повышает утомляемость. Для рабочих мест, где ведётся научная деятельность, конструирование и программирование, допустимый эквивалентный уровень звука за смену — 50 дБА [54]; допустимые уровни звукового давления в октавных полосах частот приведены в таблице 5.6. Спектр шума в кабинете не измерялся, поэтому шум оценивается по уровню звука в дБА.</w:t>
       </w:r>
     </w:p>
     <w:p>
@@ -7851,7 +7851,7 @@
               <w:rPr>
                 <w:sz w:val="20"/>
               </w:rPr>
-              <w:t>Разборчивость слов 100–90 %</w:t>
+              <w:t>Работа на слух не выполняется; речь в кабинете разборчива без помех (разборчивость 100–90 %)</w:t>
             </w:r>
           </w:p>
         </w:tc>
@@ -8981,7 +8981,7 @@
               <w:rPr>
                 <w:sz w:val="22"/>
               </w:rPr>
-              <w:t>430 лк (к концу срока службы — 287 лк, расчёт)</w:t>
+              <w:t>287 лк к концу срока службы (новые светильники — около 430 лк), расчёт</w:t>
             </w:r>
           </w:p>
         </w:tc>
@@ -9000,7 +9000,7 @@
               <w:rPr>
                 <w:sz w:val="22"/>
               </w:rPr>
-              <w:t>не менее 300 лк</w:t>
+              <w:t>300 лк, допуск −10…+20 %</w:t>
             </w:r>
           </w:p>
         </w:tc>
@@ -11535,7 +11535,7 @@
     </w:p>
     <w:p>
       <w:r>
-        <w:t>Статическое электричество. Синтетическая обивка кресел способствует накоплению зарядов на теле человека; разряды неприятны и могут повредить электронику. Напряжённость электростатического поля на рабочем месте пользователя ПЭВМ не должна превышать 15 кВ/м [53]. Электризацию ограничивают оптимальная влажность воздуха (40–50 %) и заземление корпусов ПЭВМ через розетки с заземляющим контактом.</w:t>
+        <w:t>Статическое электричество. Синтетическая обивка кресел способствует накоплению зарядов на теле человека; разряды неприятны и могут повредить электронику. Напряжённость электростатического поля на рабочем месте пользователя ПЭВМ не должна превышать 15 кВ/м [54]. Электризацию ограничивают оптимальная влажность воздуха (40–50 %) и заземление корпусов ПЭВМ через розетки с заземляющим контактом.</w:t>
       </w:r>
     </w:p>
     <w:p>
@@ -11561,7 +11561,7 @@
         <w:t xml:space="preserve">– </w:t>
       </w:r>
       <w:r>
-        <w:t>в верхнем правом углу прихожей, у выхода, установлен огнетушитель; для тушения электрооборудования под напряжением до 1000 В пригодны углекислотные ОУ-3, ОУ-5 и порошковые ОП-4 огнетушители, углекислотные не портят электронику [72];</w:t>
+        <w:t>в верхнем правом углу прихожей, у выхода, установлен углекислотный огнетушитель ОУ-2, пригодный для тушения электрооборудования под напряжением до 1000 В; углекислотный огнетушитель не портит электронику [72];</w:t>
       </w:r>
     </w:p>
     <w:p>
@@ -12091,7 +12091,7 @@
     </w:p>
     <w:p>
       <w:r>
-        <w:t>Коэффициенты отражения потолка, стен и пола (ламинат) — 70, 50 и 30 %. Коэффициент запаса для административно-конструкторских помещений Kз = 1,5, коэффициент неравномерности освещённости z = 1,1 [57]; значения приняты как для газоразрядных источников света: светодиодных светильников в таблицах методических указаний нет.</w:t>
+        <w:t>Коэффициенты отражения потолка, стен и пола (ламинат) — 70, 50 и 30 %. Коэффициент запаса для административно-конструкторских помещений Kз = 1,5, коэффициент неравномерности освещённости z = 1,1 [57].</w:t>
       </w:r>
     </w:p>
     <w:p>
@@ -12099,7 +12099,7 @@
         <w:keepNext/>
       </w:pPr>
       <w:r>
-        <w:t>В кабинете установлены светильники — встраиваемые светодиодные панели 595 × 595 мм для потолка «Армстронг»: мощность 45 Вт, световой поток 4 800 лм, коэффициент пульсации менее 1 %, цветовая температура 4000 К, индекс цветопередачи не менее 80, матовый (опаловый) рассеиватель. Светильник с матовым рассеивателем светит по косинусному закону — тип кривой силы света Д [57]; для панели принят Д-1. Коэффициент использования светового потока зависит от типа кривой силы света, индекса помещения и коэффициентов отражения; для светильников с типовыми кривыми он приведён в таблице 5.13 [57, 73].</w:t>
+        <w:t>В кабинете установлены светильники — встраиваемые светодиодные панели 595 × 595 мм для потолка «Армстронг»: мощность 45 Вт, световой поток 4 800 лм, коэффициент пульсации менее 1 %, цветовая температура 4000 К, индекс цветопередачи не менее 80, матовый (опаловый) рассеиватель. Светильник с матовым рассеивателем светит по косинусному закону — тип кривой силы света Д [57]. Для косинусной кривой в таблице коэффициентов использования приведены два варианта, Д-1 и Д-2; принят Д-1: при нём коэффициент использования при любом индексе помещения меньше (при i = 1,25 — 58 % против 68 %), поэтому число светильников не занижается и расчёт идёт в запас. Коэффициент использования светового потока зависит от типа кривой силы света, индекса помещения и коэффициентов отражения; для светильников с типовыми кривыми он приведён в таблице 5.13 [57, 73].</w:t>
       </w:r>
     </w:p>
     <w:p>
@@ -14877,7 +14877,7 @@
         <w:t xml:space="preserve">– </w:t>
       </w:r>
       <w:r>
-        <w:t>освещённость рабочих мест — около 430 лк при норме 300 лк, к концу срока службы светильников — 287 лк, в пределах допуска −10…+20 %;</w:t>
+        <w:t>освещённость рабочих мест к концу срока службы светильников — 287 лк при норме 300 лк (−4,4 %, в пределах допуска −10…+20 %); новые светильники дают около 430 лк;</w:t>
       </w:r>
     </w:p>
     <w:p>
@@ -14903,7 +14903,7 @@
     </w:p>
     <w:p>
       <w:r>
-        <w:t>По индивидуальному заданию было предложено спроектировать и рассчитать общее искусственное освещение кабинета методом коэффициента использования светового потока. В результате расчёта были выбраны встраиваемые светодиодные панели мощностью 45 Вт со световым потоком 4 800 лм в количестве 8 шт.; они обеспечивают освещённость около 430 лк, а к концу срока службы — 287 лк при норме 300 лк (в пределах допуска −10…+20 %) и пульсацию менее 1 % при норме не более 5 %. Принятое число панелей совпадает с установленным в кабинете.</w:t>
+        <w:t>По индивидуальному заданию было предложено спроектировать и рассчитать общее искусственное освещение кабинета методом коэффициента использования светового потока. В результате расчёта были выбраны встраиваемые светодиодные панели мощностью 45 Вт со световым потоком 4 800 лм в количестве 8 шт.; они обеспечивают к концу срока службы освещённость 287 лк при норме 300 лк (−4,4 %, в пределах допуска −10…+20 %; новые — около 430 лк) и пульсацию менее 1 % при норме не более 5 %. Принятое число панелей совпадает с установленным в кабинете.</w:t>
       </w:r>
     </w:p>
     <w:sectPr>

</xml_diff>

<commit_message>
Labour safety: noise norm source, rounding fixes, slide 14
- Noise: SanPiN 1.2.3685-21 gives a single 80 dBA for workplaces; the
  86...38 dB / 50 dBA row is SP 51.13330.2011 table 1 item 14 (offices,
  design and research organisations), LAmax 65 dBA added; new source [60]
- Shredder time taken as 0.17 h in the calculation, as in the table (43.3 dBA)
- Illuminance deviation computed from 287 lx: -4.3 % in text and slide 14
- 5.2.5 wording: no separate EMF norms for PCs (not "no PC norms at all")
- Thesis rebuilt: 80 sources

Co-Authored-By: Claude Opus 5.5 <noreply@anthropic.com>
</commit_message>
<xml_diff>
--- a/docs/ohrana_truda/Okhrana_truda_HaLow.docx
+++ b/docs/ohrana_truda/Okhrana_truda_HaLow.docx
@@ -4975,7 +4975,7 @@
     </w:p>
     <w:p>
       <w:r>
-        <w:t>Общее освещение создают 8 встраиваемых светодиодных панелей 595 × 595 мм мощностью 45 Вт со световым потоком 4 800 лм и коэффициентом пульсации менее 1 %; естественное освещение — боковое, через окно в левой стене. Расчёт в разделе 5.6 показывает, что к концу срока службы, с учётом коэффициента запаса, светильники создают на рабочей поверхности 287 лк: отклонение от нормы 300 лк составляет −4,4 % и находится в пределах допуска −10…+20 %, принятого при проектировании освещения [59]. Допуск относится именно к этой, расчётной освещённости. Новые светильники дают больше — около 430 лк: запас в 1,5 раза заложен на снижение их потока и загрязнение. Условия труда по световой среде приняты допустимыми (класс 2); при специальной оценке условий труда класс устанавливается по измеренной освещённости [52].</w:t>
+        <w:t>Общее освещение создают 8 встраиваемых светодиодных панелей 595 × 595 мм мощностью 45 Вт со световым потоком 4 800 лм и коэффициентом пульсации менее 1 %; естественное освещение — боковое, через окно в левой стене. Расчёт в разделе 5.6 показывает, что к концу срока службы, с учётом коэффициента запаса, светильники создают на рабочей поверхности 287 лк: отклонение от нормы 300 лк составляет −4,3 % и находится в пределах допуска −10…+20 %, принятого при проектировании освещения [59]. Допуск относится именно к этой, расчётной освещённости. Новые светильники дают больше — около 430 лк: запас в 1,5 раза заложен на снижение их потока и загрязнение. Условия труда по световой среде приняты допустимыми (класс 2); при специальной оценке условий труда класс устанавливается по измеренной освещённости [52].</w:t>
       </w:r>
     </w:p>
     <w:p>
@@ -4988,7 +4988,7 @@
     </w:p>
     <w:p>
       <w:r>
-        <w:t>Шум снижает внимание и работоспособность и повышает утомляемость. Для рабочих мест, где ведётся научная деятельность, конструирование и программирование, допустимый эквивалентный уровень звука за смену — 50 дБА [56]; допустимые уровни звукового давления в октавных полосах частот приведены в таблице 5.6. Спектр шума в кабинете не измерялся, поэтому шум оценивается по уровню звука в дБА.</w:t>
+        <w:t>Шум снижает внимание и работоспособность и повышает утомляемость. Гигиенический норматив для рабочих мест — эквивалентный уровень звука за смену 80 дБА [56] — один для всех видов работ. Для помещений офисов и кабинетов конструкторских, проектных и научно-исследовательских организаций свод правил по защите от шума устанавливает более строгие допустимые уровни: эквивалентный уровень звука 50 дБА, максимальный — 65 дБА, уровни звукового давления в октавных полосах частот — по таблице 5.6 [60]. Шум в кабинете оценивается по более строгому значению 50 дБА. Спектр шума в кабинете не измерялся, поэтому шум оценивается по уровню звука в дБА.</w:t>
       </w:r>
     </w:p>
     <w:p>
@@ -4997,7 +4997,7 @@
         <w:ind w:firstLine="0"/>
       </w:pPr>
       <w:r>
-        <w:t>Таблица 5.6 – Допустимые уровни звукового давления в октавных полосах частот, уровни звука на рабочих местах</w:t>
+        <w:t>Таблица 5.6 – Допустимые уровни звукового давления в октавных полосах частот, уровни звука в помещениях офисов и научно-исследовательских организаций</w:t>
       </w:r>
     </w:p>
     <w:tbl>
@@ -5014,16 +5014,17 @@
       </w:tblPr>
       <w:tblGrid>
         <w:gridCol w:w="2154"/>
-        <w:gridCol w:w="623"/>
-        <w:gridCol w:w="623"/>
-        <w:gridCol w:w="623"/>
-        <w:gridCol w:w="623"/>
-        <w:gridCol w:w="623"/>
-        <w:gridCol w:w="680"/>
-        <w:gridCol w:w="680"/>
-        <w:gridCol w:w="680"/>
-        <w:gridCol w:w="680"/>
-        <w:gridCol w:w="1360"/>
+        <w:gridCol w:w="510"/>
+        <w:gridCol w:w="510"/>
+        <w:gridCol w:w="510"/>
+        <w:gridCol w:w="510"/>
+        <w:gridCol w:w="510"/>
+        <w:gridCol w:w="566"/>
+        <w:gridCol w:w="566"/>
+        <w:gridCol w:w="566"/>
+        <w:gridCol w:w="566"/>
+        <w:gridCol w:w="1474"/>
+        <w:gridCol w:w="1474"/>
       </w:tblGrid>
       <w:tr>
         <w:trPr>
@@ -5047,13 +5048,13 @@
                 <w:b/>
                 <w:sz w:val="22"/>
               </w:rPr>
-              <w:t>Рабочие места</w:t>
-            </w:r>
-          </w:p>
-        </w:tc>
-        <w:tc>
-          <w:tcPr>
-            <w:tcW w:type="dxa" w:w="5840"/>
+              <w:t>Назначение помещений</w:t>
+            </w:r>
+          </w:p>
+        </w:tc>
+        <w:tc>
+          <w:tcPr>
+            <w:tcW w:type="dxa" w:w="4818"/>
             <w:gridSpan w:val="9"/>
             <w:vAlign w:val="center"/>
           </w:tcPr>
@@ -5074,7 +5075,7 @@
         </w:tc>
         <w:tc>
           <w:tcPr>
-            <w:tcW w:type="dxa" w:w="1361"/>
+            <w:tcW w:type="dxa" w:w="1474"/>
             <w:vMerge w:val="restart"/>
             <w:vAlign w:val="center"/>
           </w:tcPr>
@@ -5089,7 +5090,56 @@
                 <w:b/>
                 <w:sz w:val="22"/>
               </w:rPr>
-              <w:t>Уровни звука и эквивалентные уровни звука, дБА</w:t>
+              <w:t>Эквива-</w:t>
+            </w:r>
+          </w:p>
+          <w:p>
+            <w:pPr>
+              <w:pStyle w:val="TableText"/>
+              <w:keepNext/>
+              <w:jc w:val="center"/>
+            </w:pPr>
+            <w:r>
+              <w:rPr>
+                <w:b/>
+                <w:sz w:val="22"/>
+              </w:rPr>
+              <w:t>лентный уровень звука, дБА</w:t>
+            </w:r>
+          </w:p>
+        </w:tc>
+        <w:tc>
+          <w:tcPr>
+            <w:tcW w:type="dxa" w:w="1474"/>
+            <w:vMerge w:val="restart"/>
+            <w:vAlign w:val="center"/>
+          </w:tcPr>
+          <w:p>
+            <w:pPr>
+              <w:pStyle w:val="TableText"/>
+              <w:keepNext/>
+              <w:jc w:val="center"/>
+            </w:pPr>
+            <w:r>
+              <w:rPr>
+                <w:b/>
+                <w:sz w:val="22"/>
+              </w:rPr>
+              <w:t>Макси-</w:t>
+            </w:r>
+          </w:p>
+          <w:p>
+            <w:pPr>
+              <w:pStyle w:val="TableText"/>
+              <w:keepNext/>
+              <w:jc w:val="center"/>
+            </w:pPr>
+            <w:r>
+              <w:rPr>
+                <w:b/>
+                <w:sz w:val="22"/>
+              </w:rPr>
+              <w:t>мальный уровень звука, дБА</w:t>
             </w:r>
           </w:p>
         </w:tc>
@@ -5113,7 +5163,7 @@
         </w:tc>
         <w:tc>
           <w:tcPr>
-            <w:tcW w:type="dxa" w:w="624"/>
+            <w:tcW w:type="dxa" w:w="510"/>
             <w:vAlign w:val="center"/>
           </w:tcPr>
           <w:p>
@@ -5133,7 +5183,7 @@
         </w:tc>
         <w:tc>
           <w:tcPr>
-            <w:tcW w:type="dxa" w:w="624"/>
+            <w:tcW w:type="dxa" w:w="510"/>
             <w:vAlign w:val="center"/>
           </w:tcPr>
           <w:p>
@@ -5153,7 +5203,7 @@
         </w:tc>
         <w:tc>
           <w:tcPr>
-            <w:tcW w:type="dxa" w:w="624"/>
+            <w:tcW w:type="dxa" w:w="510"/>
             <w:vAlign w:val="center"/>
           </w:tcPr>
           <w:p>
@@ -5173,7 +5223,7 @@
         </w:tc>
         <w:tc>
           <w:tcPr>
-            <w:tcW w:type="dxa" w:w="624"/>
+            <w:tcW w:type="dxa" w:w="510"/>
             <w:vAlign w:val="center"/>
           </w:tcPr>
           <w:p>
@@ -5193,7 +5243,7 @@
         </w:tc>
         <w:tc>
           <w:tcPr>
-            <w:tcW w:type="dxa" w:w="624"/>
+            <w:tcW w:type="dxa" w:w="510"/>
             <w:vAlign w:val="center"/>
           </w:tcPr>
           <w:p>
@@ -5213,7 +5263,7 @@
         </w:tc>
         <w:tc>
           <w:tcPr>
-            <w:tcW w:type="dxa" w:w="680"/>
+            <w:tcW w:type="dxa" w:w="567"/>
             <w:vAlign w:val="center"/>
           </w:tcPr>
           <w:p>
@@ -5233,7 +5283,7 @@
         </w:tc>
         <w:tc>
           <w:tcPr>
-            <w:tcW w:type="dxa" w:w="680"/>
+            <w:tcW w:type="dxa" w:w="567"/>
             <w:vAlign w:val="center"/>
           </w:tcPr>
           <w:p>
@@ -5253,7 +5303,7 @@
         </w:tc>
         <w:tc>
           <w:tcPr>
-            <w:tcW w:type="dxa" w:w="680"/>
+            <w:tcW w:type="dxa" w:w="567"/>
             <w:vAlign w:val="center"/>
           </w:tcPr>
           <w:p>
@@ -5273,7 +5323,7 @@
         </w:tc>
         <w:tc>
           <w:tcPr>
-            <w:tcW w:type="dxa" w:w="680"/>
+            <w:tcW w:type="dxa" w:w="567"/>
             <w:vAlign w:val="center"/>
           </w:tcPr>
           <w:p>
@@ -5293,7 +5343,19 @@
         </w:tc>
         <w:tc>
           <w:tcPr>
-            <w:tcW w:type="dxa" w:w="1361"/>
+            <w:tcW w:type="dxa" w:w="1474"/>
+            <w:vMerge/>
+            <w:vAlign w:val="center"/>
+          </w:tcPr>
+          <w:p>
+            <w:pPr>
+              <w:keepNext/>
+            </w:pPr>
+          </w:p>
+        </w:tc>
+        <w:tc>
+          <w:tcPr>
+            <w:tcW w:type="dxa" w:w="1474"/>
             <w:vMerge/>
             <w:vAlign w:val="center"/>
           </w:tcPr>
@@ -5322,13 +5384,13 @@
               <w:rPr>
                 <w:sz w:val="22"/>
               </w:rPr>
-              <w:t>Научная деятельность, конструирование и проектирование, программирование</w:t>
-            </w:r>
-          </w:p>
-        </w:tc>
-        <w:tc>
-          <w:tcPr>
-            <w:tcW w:type="dxa" w:w="624"/>
+              <w:t>Помещения офисов, рабочие помещения и кабинеты административных зданий, конструкторских, проектных и научно-исследовательских организаций</w:t>
+            </w:r>
+          </w:p>
+        </w:tc>
+        <w:tc>
+          <w:tcPr>
+            <w:tcW w:type="dxa" w:w="510"/>
             <w:vAlign w:val="center"/>
           </w:tcPr>
           <w:p>
@@ -5346,7 +5408,7 @@
         </w:tc>
         <w:tc>
           <w:tcPr>
-            <w:tcW w:type="dxa" w:w="624"/>
+            <w:tcW w:type="dxa" w:w="510"/>
             <w:vAlign w:val="center"/>
           </w:tcPr>
           <w:p>
@@ -5364,7 +5426,7 @@
         </w:tc>
         <w:tc>
           <w:tcPr>
-            <w:tcW w:type="dxa" w:w="624"/>
+            <w:tcW w:type="dxa" w:w="510"/>
             <w:vAlign w:val="center"/>
           </w:tcPr>
           <w:p>
@@ -5382,7 +5444,7 @@
         </w:tc>
         <w:tc>
           <w:tcPr>
-            <w:tcW w:type="dxa" w:w="624"/>
+            <w:tcW w:type="dxa" w:w="510"/>
             <w:vAlign w:val="center"/>
           </w:tcPr>
           <w:p>
@@ -5400,7 +5462,7 @@
         </w:tc>
         <w:tc>
           <w:tcPr>
-            <w:tcW w:type="dxa" w:w="624"/>
+            <w:tcW w:type="dxa" w:w="510"/>
             <w:vAlign w:val="center"/>
           </w:tcPr>
           <w:p>
@@ -5418,7 +5480,7 @@
         </w:tc>
         <w:tc>
           <w:tcPr>
-            <w:tcW w:type="dxa" w:w="680"/>
+            <w:tcW w:type="dxa" w:w="567"/>
             <w:vAlign w:val="center"/>
           </w:tcPr>
           <w:p>
@@ -5436,7 +5498,7 @@
         </w:tc>
         <w:tc>
           <w:tcPr>
-            <w:tcW w:type="dxa" w:w="680"/>
+            <w:tcW w:type="dxa" w:w="567"/>
             <w:vAlign w:val="center"/>
           </w:tcPr>
           <w:p>
@@ -5454,7 +5516,7 @@
         </w:tc>
         <w:tc>
           <w:tcPr>
-            <w:tcW w:type="dxa" w:w="680"/>
+            <w:tcW w:type="dxa" w:w="567"/>
             <w:vAlign w:val="center"/>
           </w:tcPr>
           <w:p>
@@ -5472,7 +5534,7 @@
         </w:tc>
         <w:tc>
           <w:tcPr>
-            <w:tcW w:type="dxa" w:w="680"/>
+            <w:tcW w:type="dxa" w:w="567"/>
             <w:vAlign w:val="center"/>
           </w:tcPr>
           <w:p>
@@ -5490,7 +5552,7 @@
         </w:tc>
         <w:tc>
           <w:tcPr>
-            <w:tcW w:type="dxa" w:w="1361"/>
+            <w:tcW w:type="dxa" w:w="1474"/>
             <w:vAlign w:val="center"/>
           </w:tcPr>
           <w:p>
@@ -5503,6 +5565,24 @@
                 <w:sz w:val="22"/>
               </w:rPr>
               <w:t>50</w:t>
+            </w:r>
+          </w:p>
+        </w:tc>
+        <w:tc>
+          <w:tcPr>
+            <w:tcW w:type="dxa" w:w="1474"/>
+            <w:vAlign w:val="center"/>
+          </w:tcPr>
+          <w:p>
+            <w:pPr>
+              <w:pStyle w:val="TableText"/>
+              <w:jc w:val="center"/>
+            </w:pPr>
+            <w:r>
+              <w:rPr>
+                <w:sz w:val="22"/>
+              </w:rPr>
+              <w:t>65</w:t>
             </w:r>
           </w:p>
         </w:tc>
@@ -5515,7 +5595,7 @@
     </w:p>
     <w:p>
       <w:r>
-        <w:t>Источники шума в кабинете — системные блоки ПЭВМ (одновременно работают до 6), внутренний блок кондиционера и шредер, работающий кратковременно; разговоры сотрудников к производственному шуму не относятся. Уровни звука источников приняты по паспортным данным оборудования того же класса для самого шумного режима работы: системный блок офисного ПК — 19 дБА на месте оператора при записи на диск [60]; внутренний блок настенной сплит-системы холодопроизводительностью 5,3 кВт, рассчитанной на помещение около 50 м², — от 30 до 44 дБА в зависимости от скорости вентилятора, принято наибольшее значение 44 дБА [61]; шредер с уровнем секретности P-5 — 60 дБ [62]. Вклад источника в эквивалентный уровень за смену [63, 64]:</w:t>
+        <w:t>Источники шума в кабинете — системные блоки ПЭВМ (одновременно работают до 6), внутренний блок кондиционера и шредер, работающий кратковременно; разговоры сотрудников к производственному шуму не относятся. Уровни звука источников приняты по паспортным данным оборудования того же класса для самого шумного режима работы: системный блок офисного ПК — 19 дБА на месте оператора при записи на диск [61]; внутренний блок настенной сплит-системы холодопроизводительностью 5,3 кВт, рассчитанной на помещение около 50 м², — от 30 до 44 дБА в зависимости от скорости вентилятора, принято наибольшее значение 44 дБА [62]; шредер с уровнем секретности P-5 — 60 дБ [63]. Вклад источника в эквивалентный уровень за смену [64, 65]:</w:t>
       </w:r>
     </w:p>
     <w:tbl>
@@ -6432,7 +6512,7 @@
               <w:rPr>
                 <w:sz w:val="22"/>
               </w:rPr>
-              <w:t>43,2</w:t>
+              <w:t>43,3</w:t>
             </w:r>
           </w:p>
         </w:tc>
@@ -6489,7 +6569,7 @@
     </w:p>
     <w:p>
       <w:r>
-        <w:t>Эквивалентный уровень звука 46,7 дБА не превышает нормы 50 дБА; условия труда по шуму допустимые (класс 2), запас до нормы — 3,3 дБА.</w:t>
+        <w:t>Эквивалентный уровень звука 46,7 дБА не превышает допустимого уровня 50 дБА для офисов и научно-исследовательских организаций и тем более гигиенического норматива 80 дБА; условия труда по шуму допустимые (класс 2), запас до 50 дБА — 3,3 дБА.</w:t>
       </w:r>
     </w:p>
     <w:p>
@@ -6502,7 +6582,7 @@
     </w:p>
     <w:p>
       <w:r>
-        <w:t>Источники электромагнитных полей на рабочем месте — ПЭВМ и мониторы, которые питаются от сети 50 Гц, и радиомодули плат экспериментального стенда: при отладке программ платы передают данные по каналу Wi-Fi HaLow на частоте 867 МГц. Отдельных нормативов для рабочих мест с ПЭВМ действующий СанПиН 1.2.3685-21 не содержит; поля частотой 50 Гц в кабинете не измерялись. Излучение стенда оценивается расчётом.</w:t>
+        <w:t>Источники электромагнитных полей на рабочем месте — ПЭВМ и мониторы, которые питаются от сети 50 Гц, и радиомодули плат экспериментального стенда: при отладке программ платы передают данные по каналу Wi-Fi HaLow на частоте 867 МГц. Отдельных нормативов электромагнитных полей от ПЭВМ действующий СанПиН 1.2.3685-21 не содержит; поля частотой 50 Гц в кабинете не измерялись. Излучение стенда оценивается расчётом.</w:t>
       </w:r>
     </w:p>
     <w:p>
@@ -6969,7 +7049,7 @@
     </w:p>
     <w:p>
       <w:r>
-        <w:t>Тяжесть трудового процесса характеризует физическую нагрузку, напряжённость — нагрузку на центральную нервную систему, органы чувств и эмоциональную сферу [65]. Оценка тяжести приведена в таблице 5.8; итоговый класс равен наибольшему из классов по отдельным показателям.</w:t>
+        <w:t>Тяжесть трудового процесса характеризует физическую нагрузку, напряжённость — нагрузку на центральную нервную систему, органы чувств и эмоциональную сферу [66]. Оценка тяжести приведена в таблице 5.8; итоговый класс равен наибольшему из классов по отдельным показателям.</w:t>
       </w:r>
     </w:p>
     <w:p>
@@ -9200,7 +9280,7 @@
     </w:p>
     <w:p>
       <w:r>
-        <w:t>Из 23 показателей 3 выше класса 2, и это свойства самой исследовательской работы: содержание работы творческое — решения ищутся без готового алгоритма (класс 3.2); измеренные значения постоянно сопоставляются с расчётными и нормативными (класс 3.1); с экраном монитора работа идёт до 6 ч за смену (класс 3.1). По правилу Р 2.2.2006-05 напряжённость признаётся допустимой, если таких показателей не больше пяти, а остальные относятся к классам 1 и 2 [65]. Напряжённость трудового процесса — класс 2 (допустимый). Для снижения утомления через каждый час работы с ПЭВМ делаются перерывы 10–15 мин с упражнениями для глаз и разминкой.</w:t>
+        <w:t>Из 23 показателей 3 выше класса 2, и это свойства самой исследовательской работы: содержание работы творческое — решения ищутся без готового алгоритма (класс 3.2); измеренные значения постоянно сопоставляются с расчётными и нормативными (класс 3.1); с экраном монитора работа идёт до 6 ч за смену (класс 3.1). По правилу Р 2.2.2006-05 напряжённость признаётся допустимой, если таких показателей не больше пяти, а остальные относятся к классам 1 и 2 [66]. Напряжённость трудового процесса — класс 2 (допустимый). Для снижения утомления через каждый час работы с ПЭВМ делаются перерывы 10–15 мин с упражнениями для глаз и разминкой.</w:t>
       </w:r>
     </w:p>
     <w:p>
@@ -9880,7 +9960,7 @@
     </w:p>
     <w:p>
       <w:r>
-        <w:t>Конструкция рабочего места и взаимное расположение его элементов должны соответствовать антропометрическим, физиологическим и психологическим требованиям [66, 67]. Компоновка рабочего места специалиста показана на рисунке 5.2: верхний край экрана находится ниже уровня глаз, линия взгляда на центр экрана наклонена к горизонтали на 20°, руки при работе с клавиатурой согнуты в локтях под углом, близким к прямому, стопы стоят на полу.</w:t>
+        <w:t>Конструкция рабочего места и взаимное расположение его элементов должны соответствовать антропометрическим, физиологическим и психологическим требованиям [67, 68]. Компоновка рабочего места специалиста показана на рисунке 5.2: верхний край экрана находится ниже уровня глаз, линия взгляда на центр экрана наклонена к горизонтали на 20°, руки при работе с клавиатурой согнуты в локтях под углом, близким к прямому, стопы стоят на полу.</w:t>
       </w:r>
     </w:p>
     <w:p>
@@ -9935,7 +10015,7 @@
     </w:p>
     <w:p>
       <w:r>
-        <w:t>Органы управления и предметы труда размещаются в пределах зон досягаемости моторного поля [66], показанных на рисунке 5.3: в зоне А (оптимальной) находятся клавиатура и мышь, которыми пользуются постоянно, в зоне Б (лёгкой досягаемости) — документы, в зоне В (досягаемости вытянутой рукой) — редко используемые предметы. Монитор стоит за пределами зон досягаемости, на расстоянии наблюдения.</w:t>
+        <w:t>Органы управления и предметы труда размещаются в пределах зон досягаемости моторного поля [67], показанных на рисунке 5.3: в зоне А (оптимальной) находятся клавиатура и мышь, которыми пользуются постоянно, в зоне Б (лёгкой досягаемости) — документы, в зоне В (досягаемости вытянутой рукой) — редко используемые предметы. Монитор стоит за пределами зон досягаемости, на расстоянии наблюдения.</w:t>
       </w:r>
     </w:p>
     <w:p>
@@ -9990,7 +10070,7 @@
     </w:p>
     <w:p>
       <w:r>
-        <w:t>Параметры рабочего места и видеотерминала сопоставлены с нормативными в таблице 5.11 [67, 68, 69].</w:t>
+        <w:t>Параметры рабочего места и видеотерминала сопоставлены с нормативными в таблице 5.11 [68, 69, 70].</w:t>
       </w:r>
     </w:p>
     <w:p>
@@ -11122,12 +11202,12 @@
     </w:p>
     <w:p>
       <w:r>
-        <w:t>По опасности поражения электрическим током помещения делятся на помещения без повышенной опасности, с повышенной опасностью и особо опасные [70]. Относительная влажность воздуха в кабинете — 40–50 % (раздел 5.2.2), то есть не более 60 %, поэтому по ПУЭ помещение сухое; температура нормальная, токопроводящая пыль отсутствует, пол — ламинат — не проводит ток. Металлические радиаторы отопления, соединённые с землёй, закрыты декоративными экранами, поэтому одновременное прикосновение к радиатору и корпусу ПЭВМ исключено. Кабинет относится к помещениям без повышенной опасности.</w:t>
+        <w:t>По опасности поражения электрическим током помещения делятся на помещения без повышенной опасности, с повышенной опасностью и особо опасные [71]. Относительная влажность воздуха в кабинете — 40–50 % (раздел 5.2.2), то есть не более 60 %, поэтому по ПУЭ помещение сухое; температура нормальная, токопроводящая пыль отсутствует, пол — ламинат — не проводит ток. Металлические радиаторы отопления, соединённые с землёй, закрыты декоративными экранами, поэтому одновременное прикосновение к радиатору и корпусу ПЭВМ исключено. Кабинет относится к помещениям без повышенной опасности.</w:t>
       </w:r>
     </w:p>
     <w:p>
       <w:r>
-        <w:t>Предельно допустимые значения напряжения прикосновения и тока при нормальном режиме электроустановки переменного тока 50 Гц составляют 2 В и 0,3 мА, при аварийном режиме — зависят от продолжительности воздействия тока и приведены в таблице 5.12 [71].</w:t>
+        <w:t>Предельно допустимые значения напряжения прикосновения и тока при нормальном режиме электроустановки переменного тока 50 Гц составляют 2 В и 0,3 мА, при аварийном режиме — зависят от продолжительности воздействия тока и приведены в таблице 5.12 [72].</w:t>
       </w:r>
     </w:p>
     <w:p>
@@ -12046,7 +12126,7 @@
     </w:p>
     <w:p>
       <w:r>
-        <w:t>Для защиты от поражения током [72, 73]:</w:t>
+        <w:t>Для защиты от поражения током [73, 74]:</w:t>
       </w:r>
     </w:p>
     <w:p>
@@ -12101,7 +12181,7 @@
     </w:p>
     <w:p>
       <w:r>
-        <w:t>Кабинет предназначен для научно-исследовательской работы на ПЭВМ и расположен в офисном здании. Здания научных и проектно-конструкторских организаций, контор и офисов по классу функциональной пожарной опасности относятся к Ф4.3 [74]. Категории по взрывопожарной и пожарной опасности (А, Б, В1–В4, Г, Д) установлены только для помещений производственного и складского назначения: так их определяют статья 27 Технического регламента о требованиях пожарной безопасности [74] и пункт 1.1 СП 12.13130.2009, задающего методику их расчёта [75]. Кабинет — помещение офисного здания, к производственным и складским не относится, поэтому категория для него не определяется. Класс Ф4.3 определяет требования к зданию — к эвакуационным путям и выходам, системам оповещения и пожарной сигнализации [74]; при эксплуатации кабинета действуют Правила противопожарного режима [76], из которых следуют мероприятия:</w:t>
+        <w:t>Кабинет предназначен для научно-исследовательской работы на ПЭВМ и расположен в офисном здании. Здания научных и проектно-конструкторских организаций, контор и офисов по классу функциональной пожарной опасности относятся к Ф4.3 [75]. Категории по взрывопожарной и пожарной опасности (А, Б, В1–В4, Г, Д) установлены только для помещений производственного и складского назначения: так их определяют статья 27 Технического регламента о требованиях пожарной безопасности [75] и пункт 1.1 СП 12.13130.2009, задающего методику их расчёта [76]. Кабинет — помещение офисного здания, к производственным и складским не относится, поэтому категория для него не определяется. Класс Ф4.3 определяет требования к зданию — к эвакуационным путям и выходам, системам оповещения и пожарной сигнализации [75]; при эксплуатации кабинета действуют Правила противопожарного режима [77], из которых следуют мероприятия:</w:t>
       </w:r>
     </w:p>
     <w:p>
@@ -12109,7 +12189,7 @@
         <w:t xml:space="preserve">– </w:t>
       </w:r>
       <w:r>
-        <w:t>в верхнем правом углу прихожей, у выхода, установлен углекислотный огнетушитель ОУ-2, пригодный для тушения электрооборудования под напряжением до 1000 В; углекислотный огнетушитель не портит электронику [77];</w:t>
+        <w:t>в верхнем правом углу прихожей, у выхода, установлен углекислотный огнетушитель ОУ-2, пригодный для тушения электрооборудования под напряжением до 1000 В; углекислотный огнетушитель не портит электронику [78];</w:t>
       </w:r>
     </w:p>
     <w:p>
@@ -12141,7 +12221,7 @@
         <w:t xml:space="preserve">– </w:t>
       </w:r>
       <w:r>
-        <w:t>ширина выхода из помещения 0,9 м, полотно двери открывается внутрь и не перекрывает пути движения в прихожей; направление открывания дверей не нормируется для помещений с одновременным пребыванием не более 15 человек, кроме помещений категорий А и Б [78], а в кабинете одновременно находятся не более 6 человек.</w:t>
+        <w:t>ширина выхода из помещения 0,9 м, полотно двери открывается внутрь и не перекрывает пути движения в прихожей; направление открывания дверей не нормируется для помещений с одновременным пребыванием не более 15 человек, кроме помещений категорий А и Б [79], а в кабинете одновременно находятся не более 6 человек.</w:t>
       </w:r>
     </w:p>
     <w:p>
@@ -12647,7 +12727,7 @@
         <w:keepNext/>
       </w:pPr>
       <w:r>
-        <w:t>В кабинете установлены светильники — встраиваемые светодиодные панели 595 × 595 мм для потолка «Армстронг»: мощность 45 Вт, световой поток 4 800 лм, коэффициент пульсации менее 1 %, цветовая температура 4000 К, индекс цветопередачи не менее 80, матовый (опаловый) рассеиватель. Светильник с матовым рассеивателем светит по косинусному закону — тип кривой силы света Д [59]. Для косинусной кривой в таблице коэффициентов использования приведены два варианта, Д-1 и Д-2; принят Д-1: при нём коэффициент использования при любом индексе помещения меньше (при i = 1,25 — 58 % против 68 %), поэтому число светильников не занижается и расчёт идёт в запас. Коэффициент использования светового потока зависит от типа кривой силы света, индекса помещения и коэффициентов отражения; для светильников с типовыми кривыми он приведён в таблице 5.13 [59, 79].</w:t>
+        <w:t>В кабинете установлены светильники — встраиваемые светодиодные панели 595 × 595 мм для потолка «Армстронг»: мощность 45 Вт, световой поток 4 800 лм, коэффициент пульсации менее 1 %, цветовая температура 4000 К, индекс цветопередачи не менее 80, матовый (опаловый) рассеиватель. Светильник с матовым рассеивателем светит по косинусному закону — тип кривой силы света Д [59]. Для косинусной кривой в таблице коэффициентов использования приведены два варианта, Д-1 и Д-2; принят Д-1: при нём коэффициент использования при любом индексе помещения меньше (при i = 1,25 — 58 % против 68 %), поэтому число светильников не занижается и расчёт идёт в запас. Коэффициент использования светового потока зависит от типа кривой силы света, индекса помещения и коэффициентов отражения; для светильников с типовыми кривыми он приведён в таблице 5.13 [59, 80].</w:t>
       </w:r>
     </w:p>
     <w:p>
@@ -15396,7 +15476,7 @@
     </w:p>
     <w:p>
       <w:r>
-        <w:t>удельная мощность — 7,0 Вт/м². Освещённость 287 лк — наименьшая, к концу срока службы светильников: коэффициент запаса учитывает снижение их потока и загрязнение; новые панели дают около 430 лк. Отклонение расчётной освещённости от нормы 300 лк (−4,4 %) — в пределах допуска −10…+20 % [59], пульсация светодиодных панелей менее 1 % при норме не более 5 %, матовый рассеиватель ограничивает блёскость. Установленное общее освещение соответствует нормам, условия труда по световой среде — допустимые (класс 2).</w:t>
+        <w:t>удельная мощность — 7,0 Вт/м². Освещённость 287 лк — наименьшая, к концу срока службы светильников: коэффициент запаса учитывает снижение их потока и загрязнение; новые панели дают около 430 лк. Отклонение расчётной освещённости от нормы 300 лк (−4,3 %) — в пределах допуска −10…+20 % [59], пульсация светодиодных панелей менее 1 % при норме не более 5 %, матовый рассеиватель ограничивает блёскость. Установленное общее освещение соответствует нормам, условия труда по световой среде — допустимые (класс 2).</w:t>
       </w:r>
     </w:p>
     <w:p>
@@ -15425,7 +15505,7 @@
         <w:t xml:space="preserve">– </w:t>
       </w:r>
       <w:r>
-        <w:t>освещённость рабочих мест к концу срока службы светильников — 287 лк при норме 300 лк (−4,4 %, в пределах допуска −10…+20 %); новые светильники дают около 430 лк;</w:t>
+        <w:t>освещённость рабочих мест к концу срока службы светильников — 287 лк при норме 300 лк (−4,3 %, в пределах допуска −10…+20 %); новые светильники дают около 430 лк;</w:t>
       </w:r>
     </w:p>
     <w:p>
@@ -15459,7 +15539,7 @@
     </w:p>
     <w:p>
       <w:r>
-        <w:t>По индивидуальному заданию было предложено спроектировать и рассчитать общее искусственное освещение кабинета методом коэффициента использования светового потока. В результате расчёта были выбраны встраиваемые светодиодные панели мощностью 45 Вт со световым потоком 4 800 лм в количестве 8 шт.; они обеспечивают к концу срока службы освещённость 287 лк при норме 300 лк (−4,4 %, в пределах допуска −10…+20 %; новые — около 430 лк) и пульсацию менее 1 % при норме не более 5 %. Принятое число панелей совпадает с установленным в кабинете.</w:t>
+        <w:t>По индивидуальному заданию было предложено спроектировать и рассчитать общее искусственное освещение кабинета методом коэффициента использования светового потока. В результате расчёта были выбраны встраиваемые светодиодные панели мощностью 45 Вт со световым потоком 4 800 лм в количестве 8 шт.; они обеспечивают к концу срока службы освещённость 287 лк при норме 300 лк (−4,3 %, в пределах допуска −10…+20 %; новые — около 430 лк) и пульсацию менее 1 % при норме не более 5 %. Принятое число панелей совпадает с установленным в кабинете.</w:t>
       </w:r>
     </w:p>
     <w:sectPr>

</xml_diff>

<commit_message>
Labour safety: norms checked against full SanPiN and SP 51 texts
- Noise: equipment noise assessed by SanPiN 1.2.3685-21 p. 35 (80 dBA);
  SP 51.13330.2011 (rev. 12.12.2023) table 1 item 13 gives 50/65 dBA only for
  noise penetrating into offices (note 1) - kept as a stricter reference,
  table 5.6 retitled accordingly
- Removed "screen illuminance <= 200 lx": norm of the cancelled SanPiN
  2.2.2/2.4.1340-03, absent from 1.2.3685-21
- Panel Ra 80 was an assumption: dropped; replacement panels Ra >= 85 (p. 84)
- Electrostatics: added 15 kV/m on polymer surfaces in public buildings (p. 123)
- Humidity from the hygrometer installed in the office
- Thesis rebuilt

Co-Authored-By: Claude Opus 5.5 <noreply@anthropic.com>
</commit_message>
<xml_diff>
--- a/docs/ohrana_truda/Okhrana_truda_HaLow.docx
+++ b/docs/ohrana_truda/Okhrana_truda_HaLow.docx
@@ -1735,7 +1735,7 @@
     </w:p>
     <w:p>
       <w:r>
-        <w:t>Температура воздуха принята по уставке кондиционера, относительная влажность — по показаниям бытового гигрометра. Скорость движения воздуха не измерялась и принята равной верхней границе оптимальной нормы — 0,1 м/с. Измерения поверенными приборами не проводились. Сравнение с нормой приведено в таблице 5.4.</w:t>
+        <w:t>Температура воздуха принята по уставке кондиционера, относительная влажность — по показаниям гигрометра, установленного в кабинете. Скорость движения воздуха не измерялась и принята равной верхней границе оптимальной нормы — 0,1 м/с. Измерения поверенными приборами не проводились. Сравнение с нормой приведено в таблице 5.4.</w:t>
       </w:r>
     </w:p>
     <w:p>
@@ -2790,7 +2790,7 @@
     </w:p>
     <w:p>
       <w:r>
-        <w:t>Работа с экраном монитора и документами относится к зрительным работам высокой точности: наименьший размер объекта различения — элементов знаков на экране — 0,3–0,5 мм, это разряд III (высота самих знаков — 1,1–5 мм, этот размер учитывается в оценке напряжённости, раздел 5.2.6); контраст объекта с фоном и фон средние, это подразряд «в». Для него нормируемая освещённость при общем освещении — 300 лк, при комбинированном — 750 лк, показатель ослеплённости — не более 40 [58, 59]. Для рабочих мест с ПЭВМ дополнительно ограничены коэффициент пульсации освещённости — не более 5 % — и освещённость экрана — не более 200 лк [56]. Нормы для зрительных работ разряда III приведены в таблице 5.5.</w:t>
+        <w:t>Работа с экраном монитора и документами относится к зрительным работам высокой точности: наименьший размер объекта различения — элементов знаков на экране — 0,3–0,5 мм, это разряд III (высота самих знаков — 1,1–5 мм, этот размер учитывается в оценке напряжённости, раздел 5.2.6); контраст объекта с фоном и фон средние, это подразряд «в». Для него нормируемая освещённость при общем освещении — 300 лк, при комбинированном — 750 лк, показатель ослеплённости — не более 40 [58, 59]. В помещениях с рабочими местами, оборудованными ПЭВМ, коэффициент пульсации освещённости не должен превышать 5 % [56]. Нормы для зрительных работ разряда III приведены в таблице 5.5.</w:t>
       </w:r>
     </w:p>
     <w:p>
@@ -4988,7 +4988,7 @@
     </w:p>
     <w:p>
       <w:r>
-        <w:t>Шум снижает внимание и работоспособность и повышает утомляемость. Гигиенический норматив для рабочих мест — эквивалентный уровень звука за смену 80 дБА [56] — один для всех видов работ. Для помещений офисов и кабинетов конструкторских, проектных и научно-исследовательских организаций свод правил по защите от шума устанавливает более строгие допустимые уровни: эквивалентный уровень звука 50 дБА, максимальный — 65 дБА, уровни звукового давления в октавных полосах частот — по таблице 5.6 [60]. Шум в кабинете оценивается по более строгому значению 50 дБА. Спектр шума в кабинете не измерялся, поэтому шум оценивается по уровню звука в дБА.</w:t>
+        <w:t>Шум снижает внимание и работоспособность и повышает утомляемость. Гигиенический норматив для рабочих мест — эквивалентный уровень звука за смену 80 дБА [56]; он один для всех видов работ и относится к шуму на рабочем месте, в том числе от собственного оборудования. Для помещений офисов и кабинетов конструкторских, проектных и научно-исследовательских организаций свод правил по защите от шума устанавливает более строгие допустимые уровни шума, проникающего из других помещений и извне: эквивалентный уровень звука 50 дБА, максимальный — 65 дБА, уровни звукового давления в октавных полосах частот — по таблице 5.6 [60]. Шум оборудования кабинета оценивается по нормативу 80 дБА и дополнительно сравнивается с более строгим значением 50 дБА. Спектр шума в кабинете не измерялся, поэтому шум оценивается по уровню звука в дБА.</w:t>
       </w:r>
     </w:p>
     <w:p>
@@ -4997,7 +4997,7 @@
         <w:ind w:firstLine="0"/>
       </w:pPr>
       <w:r>
-        <w:t>Таблица 5.6 – Допустимые уровни звукового давления в октавных полосах частот, уровни звука в помещениях офисов и научно-исследовательских организаций</w:t>
+        <w:t>Таблица 5.6 – Допустимые уровни проникающего шума в помещениях офисов и научно-исследовательских организаций</w:t>
       </w:r>
     </w:p>
     <w:tbl>
@@ -6569,7 +6569,7 @@
     </w:p>
     <w:p>
       <w:r>
-        <w:t>Эквивалентный уровень звука 46,7 дБА не превышает допустимого уровня 50 дБА для офисов и научно-исследовательских организаций и тем более гигиенического норматива 80 дБА; условия труда по шуму допустимые (класс 2), запас до 50 дБА — 3,3 дБА.</w:t>
+        <w:t>Эквивалентный уровень звука 46,7 дБА не превышает гигиенического норматива 80 дБА и укладывается даже в более строгий допустимый уровень 50 дБА для офисов (запас 3,3 дБА); условия труда по шуму допустимые (класс 2).</w:t>
       </w:r>
     </w:p>
     <w:p>
@@ -9628,7 +9628,7 @@
               <w:rPr>
                 <w:sz w:val="22"/>
               </w:rPr>
-              <w:t>не более 50 дБА</w:t>
+              <w:t>не более 80 дБА (для офисов — 50 дБА)</w:t>
             </w:r>
           </w:p>
         </w:tc>
@@ -12163,7 +12163,7 @@
     </w:p>
     <w:p>
       <w:r>
-        <w:t>Статическое электричество. Синтетическая обивка кресел способствует накоплению зарядов на теле человека; разряды неприятны и могут повредить электронику. Напряжённость электростатического поля на рабочем месте при воздействии в течение всей смены не должна превышать 20 кВ/м [56]. Электризацию ограничивают оптимальная влажность воздуха (40–50 %) и заземление корпусов ПЭВМ через розетки с заземляющим контактом.</w:t>
+        <w:t>Статическое электричество. Синтетическая обивка кресел способствует накоплению зарядов на теле человека; разряды неприятны и могут повредить электронику. Напряжённость электростатического поля на рабочем месте при воздействии в течение всей смены не должна превышать 20 кВ/м, а на поверхности полимерных материалов в общественных зданиях — 15 кВ/м при относительной влажности 30–60 % [56]. Электризацию ограничивают оптимальная влажность воздуха (40–50 %) и заземление корпусов ПЭВМ через розетки с заземляющим контактом.</w:t>
       </w:r>
     </w:p>
     <w:p>
@@ -12727,7 +12727,7 @@
         <w:keepNext/>
       </w:pPr>
       <w:r>
-        <w:t>В кабинете установлены светильники — встраиваемые светодиодные панели 595 × 595 мм для потолка «Армстронг»: мощность 45 Вт, световой поток 4 800 лм, коэффициент пульсации менее 1 %, цветовая температура 4000 К, индекс цветопередачи не менее 80, матовый (опаловый) рассеиватель. Светильник с матовым рассеивателем светит по косинусному закону — тип кривой силы света Д [59]. Для косинусной кривой в таблице коэффициентов использования приведены два варианта, Д-1 и Д-2; принят Д-1: при нём коэффициент использования при любом индексе помещения меньше (при i = 1,25 — 58 % против 68 %), поэтому число светильников не занижается и расчёт идёт в запас. Коэффициент использования светового потока зависит от типа кривой силы света, индекса помещения и коэффициентов отражения; для светильников с типовыми кривыми он приведён в таблице 5.13 [59, 80].</w:t>
+        <w:t>В кабинете установлены светильники — встраиваемые светодиодные панели 595 × 595 мм для потолка «Армстронг»: мощность 45 Вт, световой поток 4 800 лм, коэффициент пульсации менее 1 %, цветовая температура 4000 К, матовый (опаловый) рассеиватель. Светильник с матовым рассеивателем светит по косинусному закону — тип кривой силы света Д [59]. Для косинусной кривой в таблице коэффициентов использования приведены два варианта, Д-1 и Д-2; принят Д-1: при нём коэффициент использования при любом индексе помещения меньше (при i = 1,25 — 58 % против 68 %), поэтому число светильников не занижается и расчёт идёт в запас. Коэффициент использования светового потока зависит от типа кривой силы света, индекса помещения и коэффициентов отражения; для светильников с типовыми кривыми он приведён в таблице 5.13 [59, 80].</w:t>
       </w:r>
     </w:p>
     <w:p>
@@ -15476,7 +15476,7 @@
     </w:p>
     <w:p>
       <w:r>
-        <w:t>удельная мощность — 7,0 Вт/м². Освещённость 287 лк — наименьшая, к концу срока службы светильников: коэффициент запаса учитывает снижение их потока и загрязнение; новые панели дают около 430 лк. Отклонение расчётной освещённости от нормы 300 лк (−4,3 %) — в пределах допуска −10…+20 % [59], пульсация светодиодных панелей менее 1 % при норме не более 5 %, матовый рассеиватель ограничивает блёскость. Установленное общее освещение соответствует нормам, условия труда по световой среде — допустимые (класс 2).</w:t>
+        <w:t>удельная мощность — 7,0 Вт/м². Освещённость 287 лк — наименьшая, к концу срока службы светильников: коэффициент запаса учитывает снижение их потока и загрязнение; новые панели дают около 430 лк. Отклонение расчётной освещённости от нормы 300 лк (−4,3 %) — в пределах допуска −10…+20 % [59], пульсация светодиодных панелей менее 1 % при норме не более 5 %, матовый рассеиватель ограничивает блёскость. Установленное общее освещение соответствует нормам, условия труда по световой среде — допустимые (класс 2). При замене панелей выбираются светильники с индексом цветопередачи не менее 85, который установлен для общего искусственного освещения [56].</w:t>
       </w:r>
     </w:p>
     <w:p>
@@ -15513,7 +15513,7 @@
         <w:t xml:space="preserve">– </w:t>
       </w:r>
       <w:r>
-        <w:t>эквивалентный уровень шума 46,7 дБА не превышает нормы 50 дБА; тяжесть и напряжённость трудового процесса — класс 2;</w:t>
+        <w:t>эквивалентный уровень шума 46,7 дБА не превышает норматива 80 дБА и укладывается в более строгие 50 дБА для офисов; тяжесть и напряжённость трудового процесса — класс 2;</w:t>
       </w:r>
     </w:p>
     <w:p>

</xml_diff>

<commit_message>
Thesis and deck: department style, section 5 local sources, slides 4 and 7
Deck restyled after the department sample (academic.py): white, Times,
centred headings, blue-header tables, figure captions 1-15, framed slide
numbers, new cover and closing slide. Slide 4 is three real scenarios with
drone photos from Wikimedia Commons (figures 1-3); slide 7 compares the
datasheet budget (115 dB) with our measured link boundary (95 dB).
Thesis 2.2 uses the same comparison. Section 5: lighting for 9 panels,
ventilation per SP 60, local source numbering with its own list.

Co-Authored-By: Claude Opus 5.5 <noreply@anthropic.com>
</commit_message>
<xml_diff>
--- a/docs/ohrana_truda/Okhrana_truda_HaLow.docx
+++ b/docs/ohrana_truda/Okhrana_truda_HaLow.docx
@@ -13,9 +13,11 @@
     <w:p>
       <w:pPr>
         <w:pStyle w:val="Heading2"/>
+        <w:ind w:firstLine="0"/>
+        <w:jc w:val="center"/>
       </w:pPr>
       <w:r>
-        <w:t>5.1 Введение</w:t>
+        <w:t>Введение</w:t>
       </w:r>
     </w:p>
     <w:p>
@@ -800,15 +802,16 @@
     </w:p>
     <w:p>
       <w:r>
-        <w:t>Площадь на одно рабочее место пользователя ПЭВМ с монитором на плоском дискретном экране должна составлять не менее 4,5 м² [51]. Фактическая площадь на одно рабочее место – 4,65 м², требование выполняется.</w:t>
+        <w:t>Площадь на одно рабочее место пользователя ПЭВМ с монитором на плоском дискретном экране должна составлять не менее 4,5 м² [1]. Фактическая площадь на одно рабочее место – 4,65 м², требование выполняется.</w:t>
       </w:r>
     </w:p>
     <w:p>
       <w:pPr>
         <w:pStyle w:val="Heading3"/>
+        <w:ind/>
       </w:pPr>
       <w:r>
-        <w:t>5.1.1 Характеристика производственного оборудования</w:t>
+        <w:t>Характеристика производственного оборудования</w:t>
       </w:r>
     </w:p>
     <w:p>
@@ -1065,15 +1068,16 @@
     </w:p>
     <w:p>
       <w:r>
-        <w:t>ПЭВМ питаются от однофазной сети переменного тока напряжением 220 В частотой 50 Гц. Системные блоки подключаются шнуром с заземляющей жилой к розеткам с заземляющим контактом: изделия, имеющие рабочую изоляцию и элемент для заземления, относятся к I классу защиты от поражения электрическим током [52]. Кроме ПЭВМ, в помещении находятся кондиционер сплит-системы, шредер, светильники общего освещения.</w:t>
+        <w:t>ПЭВМ питаются от однофазной сети переменного тока напряжением 220 В частотой 50 Гц. Системные блоки подключаются шнуром с заземляющей жилой к розеткам с заземляющим контактом: изделия, имеющие рабочую изоляцию и элемент для заземления, относятся к I классу защиты от поражения электрическим током [2]. Кроме ПЭВМ, в помещении находятся кондиционер сплит-системы, шредер, светильники общего освещения.</w:t>
       </w:r>
     </w:p>
     <w:p>
       <w:pPr>
         <w:pStyle w:val="Heading3"/>
+        <w:ind/>
       </w:pPr>
       <w:r>
-        <w:t>5.1.2 Характеристика производственного процесса</w:t>
+        <w:t>Характеристика производственного процесса</w:t>
       </w:r>
     </w:p>
     <w:p>
@@ -1091,12 +1095,12 @@
         <w:pStyle w:val="Heading2"/>
       </w:pPr>
       <w:r>
-        <w:t>5.2 Оценка условий труда</w:t>
+        <w:t>5.1 Оценка условий труда инженера</w:t>
       </w:r>
     </w:p>
     <w:p>
       <w:r>
-        <w:t>Условия труда оцениваются по Методике проведения специальной оценки условий труда, утверждённой приказом Минтруда России от 21.11.2023 № 817н [53]. Порядок оценки: выявляются вредные и опасные факторы и их источники, фактические значения факторов сравниваются с нормативными, по степени отклонения устанавливается класс условий труда по каждому фактору, затем – итоговый класс. При превышении нормативов предлагаются мероприятия по их устранению. Классы условий труда установлены Федеральным законом № 426-ФЗ [54]: 1 – оптимальные, 2 – допустимые, 3.1–3.4 – вредные, 4 – опасные.</w:t>
+        <w:t>Условия труда оцениваются по Методике проведения специальной оценки условий труда, утверждённой приказом Минтруда России от 21.11.2023 № 817н [3]. Порядок оценки: выявляются вредные и опасные факторы и их источники, фактические значения факторов сравниваются с нормативными, по степени отклонения устанавливается класс условий труда по каждому фактору, затем – итоговый класс. При превышении нормативов предлагаются мероприятия по их устранению. Классы условий труда установлены Федеральным законом № 426-ФЗ [4]: 1 – оптимальные, 2 – допустимые, 3.1–3.4 – вредные, 4 – опасные.</w:t>
       </w:r>
     </w:p>
     <w:p>
@@ -1104,12 +1108,12 @@
         <w:pStyle w:val="Heading3"/>
       </w:pPr>
       <w:r>
-        <w:t>5.2.1 Вредные и опасные производственные факторы</w:t>
+        <w:t>5.1.1 Вредные и опасные производственные факторы</w:t>
       </w:r>
     </w:p>
     <w:p>
       <w:r>
-        <w:t>Производственные факторы, которые могут воздействовать на специалиста [55], и их источники приведены в таблице 5.3.</w:t>
+        <w:t>Производственные факторы, которые могут воздействовать на специалиста [5], и их источники приведены в таблице 5.3.</w:t>
       </w:r>
     </w:p>
     <w:p>
@@ -1447,7 +1451,7 @@
               <w:rPr>
                 <w:sz w:val="22"/>
               </w:rPr>
-              <w:t>Оценивается расчётом по СанПиН 1.2.3685-21, раздел 5.2.5</w:t>
+              <w:t>Оценивается расчётом по СанПиН 1.2.3685-21, раздел 5.1.5</w:t>
             </w:r>
           </w:p>
         </w:tc>
@@ -1509,7 +1513,7 @@
               <w:rPr>
                 <w:sz w:val="22"/>
               </w:rPr>
-              <w:t>Оценивается по Р 2.2.2006-05</w:t>
+              <w:t>Раздел 5.1.6</w:t>
             </w:r>
           </w:p>
         </w:tc>
@@ -1571,7 +1575,7 @@
               <w:rPr>
                 <w:sz w:val="22"/>
               </w:rPr>
-              <w:t>Оценивается по Р 2.2.2006-05</w:t>
+              <w:t>Раздел 5.1.6</w:t>
             </w:r>
           </w:p>
         </w:tc>
@@ -1633,7 +1637,7 @@
               <w:rPr>
                 <w:sz w:val="22"/>
               </w:rPr>
-              <w:t>Раздел 5.4</w:t>
+              <w:t>Раздел 5.3</w:t>
             </w:r>
           </w:p>
         </w:tc>
@@ -1692,7 +1696,7 @@
               <w:rPr>
                 <w:sz w:val="22"/>
               </w:rPr>
-              <w:t>Раздел 5.5</w:t>
+              <w:t>Раздел 5.4</w:t>
             </w:r>
           </w:p>
         </w:tc>
@@ -1713,12 +1717,12 @@
         <w:pStyle w:val="Heading3"/>
       </w:pPr>
       <w:r>
-        <w:t>5.2.2 Микроклимат</w:t>
+        <w:t>5.1.2 Микроклимат</w:t>
       </w:r>
     </w:p>
     <w:p>
       <w:r>
-        <w:t>Микроклимат характеризуется температурой, относительной влажностью и скоростью движения воздуха. Работа выполняется сидя, без систематических физических нагрузок. По ГОСТ 12.1.005-88 (приложение 1) работы, производимые сидя и сопровождающиеся незначительным физическим напряжением, с интенсивностью энергозатрат до 120 ккал/ч (139 Вт) относятся к категории Iа [56]. Оптимальные значения показателей для этой категории установлены ГОСТ 12.1.005-88 [56], допустимые – СанПиН 1.2.3685-21 [57]. Источники тепла в помещении – люди, ПЭВМ, светильники и радиаторы отопления.</w:t>
+        <w:t>Микроклимат характеризуется температурой, относительной влажностью и скоростью движения воздуха. Работа выполняется сидя, без систематических физических нагрузок. По ГОСТ 12.1.005-88 работы, производимые сидя и сопровождающиеся незначительным физическим напряжением, с интенсивностью энергозатрат до 120 ккал/ч (139 Вт) относятся к категории Iа [6]. Оптимальные значения показателей для этой категории установлены ГОСТ 12.1.005-88 [6], допустимые – СанПиН 1.2.3685-21 [7]. Источники тепла в помещении – люди, ПЭВМ, светильники и радиаторы отопления.</w:t>
       </w:r>
     </w:p>
     <w:p>
@@ -2476,7 +2480,7 @@
         <w:keepNext/>
       </w:pPr>
       <w:r>
-        <w:t>Кондиционер сплит-системы не подаёт наружный воздух; воздухообмен обеспечивается естественной вентиляцией через открывающиеся створки окон. Необходимый расход наружного воздуха [58]:</w:t>
+        <w:t>Количество наружного воздуха, которое нужно подавать в кабинет, определяется по числу работающих [8]:</w:t>
       </w:r>
     </w:p>
     <w:tbl>
@@ -2614,7 +2618,7 @@
         </m:r>
       </m:oMath>
       <w:r>
-        <w:t xml:space="preserve"> – норма наружного воздуха на одного человека для офиса с естественным проветриванием, 40 м³/ч.</w:t>
+        <w:t xml:space="preserve"> – норма наружного воздуха на одного человека. Для кабинетов с открывающимися окнами СП 60.13330.2020 устанавливает 40 м³/ч [9].</w:t>
       </w:r>
     </w:p>
     <w:p>
@@ -2764,21 +2768,16 @@
       </m:oMath>
     </w:p>
     <w:p>
-      <w:r>
-        <w:t>Требуемая кратность воздухообмена 1,6 ч⁻¹ обеспечивается проветриванием через створки окон в регламентированные перерывы; норма 40 м³/ч установлена именно для помещений с естественным проветриванием [58].</w:t>
-      </w:r>
-    </w:p>
-    <w:p>
       <w:pPr>
         <w:pStyle w:val="Heading3"/>
       </w:pPr>
       <w:r>
-        <w:t>5.2.3 Световая среда</w:t>
+        <w:t>5.1.3 Световая среда</w:t>
       </w:r>
     </w:p>
     <w:p>
       <w:r>
-        <w:t>Работа с экраном монитора и документами относится к зрительным работам высокой точности: наименьший размер объекта различения – элементов знаков на экране – 0,3–0,5 мм, это разряд III (высота самих знаков – 1,1–5 мм, этот размер учитывается в оценке напряжённости, раздел 5.2.6); контраст объекта с фоном и фон средние, это подразряд «в». Для него нормируемая освещённость при общем освещении – 300 лк, при комбинированном – 750 лк, показатель ослеплённости – не более 40 [59, 60]. В помещениях с рабочими местами, оборудованными ПЭВМ, коэффициент пульсации освещённости не должен превышать 5 % [57]. Нормы для зрительных работ разряда III по СП 52.13330.2016 приведены в таблице 5.5 [59].</w:t>
+        <w:t>Работа с экраном монитора и документами относится к зрительным работам высокой точности: наименьший размер объекта различения – элементов знаков на экране – 0,3–0,5 мм, это разряд III; контраст объекта с фоном и фон средние, это подразряд «в». Для него нормируемая освещённость при общем освещении – 300 лк, при комбинированном – 750 лк, показатель ослеплённости – не более 40 [10, 11]. В помещениях с рабочими местами, оборудованными ПЭВМ, коэффициент пульсации освещённости не должен превышать 5 % [7]. Нормы для зрительных работ разряда III по СП 52.13330.2016 приведены в таблице 5.5 [10].</w:t>
       </w:r>
     </w:p>
     <w:p>
@@ -4963,7 +4962,7 @@
     </w:p>
     <w:p>
       <w:r>
-        <w:t>Общее освещение создают 8 встраиваемых светодиодных панелей 595 × 595 мм; по паспортным данным панели того же типа мощность одной панели – 48 Вт, световой поток – 4 800 лм, коэффициент пульсации – менее 1 % [61]; естественное освещение – боковое, через окно в левой стене. Расчёт в разделе 5.6 показывает, что к концу срока службы, с учётом коэффициента запаса, светильники создают на рабочей поверхности 287 лк: отклонение от нормы 300 лк составляет −4,3 % и находится в пределах допуска −10…+20 %, принятого при проектировании освещения [60]. Допуск относится именно к этой, расчётной освещённости. Новые светильники дают больше – около 430 лк: запас в 1,5 раза заложен на снижение их потока и загрязнение. Условия труда по световой среде приняты допустимыми (класс 2); при специальной оценке условий труда класс устанавливается по измеренной освещённости [53].</w:t>
+        <w:t>Общее освещение создают 9 встраиваемых светодиодных панелей 595 × 595 мм; по паспортным данным панели того же типа мощность одной панели – 48 Вт, световой поток – 4 800 лм, коэффициент пульсации – менее 1 % [12]; естественное освещение – боковое, через окно в левой стене. Расчёт в разделе 5.5 показывает, что к концу срока службы, с учётом коэффициента запаса, эти светильники создают на рабочей поверхности 323 лк при норме 300 лк. Новые светильники дают больше – около 480 лк: запас в 1,5 раза заложен на снижение их потока и загрязнение. Условия труда по световой среде приняты допустимыми (класс 2); при специальной оценке условий труда класс устанавливается по измеренной освещённости [3].</w:t>
       </w:r>
     </w:p>
     <w:p>
@@ -4971,12 +4970,12 @@
         <w:pStyle w:val="Heading3"/>
       </w:pPr>
       <w:r>
-        <w:t>5.2.4 Шум</w:t>
+        <w:t>5.1.4 Шум</w:t>
       </w:r>
     </w:p>
     <w:p>
       <w:r>
-        <w:t>Шум снижает внимание и работоспособность и повышает утомляемость. Гигиенический норматив для рабочих мест – эквивалентный уровень звука за смену 80 дБА [57]; он один для всех видов работ и относится к шуму на рабочем месте, в том числе от собственного оборудования. Для помещений офисов и кабинетов конструкторских, проектных и научно-исследовательских организаций свод правил по защите от шума устанавливает более строгие допустимые уровни шума, проникающего из других помещений и извне: эквивалентный уровень звука 50 дБА, максимальный – 65 дБА, уровни звукового давления в октавных полосах частот – по таблице 5.6 [62]. Шум оборудования кабинета оценивается по нормативу 80 дБА и дополнительно сравнивается с более строгим значением 50 дБА. Спектр шума в кабинете не измерялся, поэтому шум оценивается по уровню звука в дБА.</w:t>
+        <w:t>Шум снижает внимание и работоспособность и повышает утомляемость. Гигиенический норматив для рабочих мест – эквивалентный уровень звука за смену 80 дБА [7]; он один для всех видов работ и относится к шуму на рабочем месте, в том числе от собственного оборудования. Для помещений офисов и кабинетов конструкторских, проектных и научно-исследовательских организаций свод правил по защите от шума устанавливает более строгие допустимые уровни шума, проникающего из других помещений и извне: эквивалентный уровень звука 50 дБА, максимальный – 65 дБА, уровни звукового давления в октавных полосах частот – по таблице 5.6 [13]. Шум оборудования кабинета оценивается по нормативу 80 дБА и дополнительно сравнивается с более строгим значением 50 дБА. Спектр шума в кабинете не измерялся, поэтому шум оценивается по уровню звука в дБА.</w:t>
       </w:r>
     </w:p>
     <w:p>
@@ -5583,7 +5582,7 @@
     </w:p>
     <w:p>
       <w:r>
-        <w:t>Источники шума в кабинете – системные блоки ПЭВМ (одновременно работают до 6), внутренний блок кондиционера и шредер, работающий кратковременно; разговоры сотрудников к производственному шуму не относятся. Уровни звука источников приняты по паспортным данным оборудования того же класса для самого шумного режима работы: системный блок офисного ПК – 19 дБА на месте оператора в наиболее шумном из указанных в паспорте режимов [63]; внутренний блок настенной сплит-системы холодопроизводительностью 5,3 кВт, рассчитанной на помещение около 50 м², – от 30 до 44 дБА в зависимости от скорости вентилятора, принято наибольшее значение 44 дБА [64]; шредер с уровнем секретности P-5 – 60 дБ [65]. Вклад источника в эквивалентный уровень за смену [66, 67]:</w:t>
+        <w:t>Источники шума в кабинете – системные блоки ПЭВМ (одновременно работают до 6), внутренний блок кондиционера и шредер, работающий кратковременно; разговоры сотрудников к производственному шуму не относятся. Уровни звука источников приняты по паспортным данным оборудования того же класса для самого шумного режима работы: системный блок офисного ПК – 19 дБА на месте оператора в наиболее шумном из указанных в паспорте режимов [14]; внутренний блок настенной сплит-системы холодопроизводительностью 5,3 кВт, рассчитанной на помещение около 50 м², – от 30 до 44 дБА в зависимости от скорости вентилятора, принято наибольшее значение 44 дБА [15]; шредер с уровнем секретности P-5 – 60 дБ [16]. Вклад источника в эквивалентный уровень за смену [17, 18]:</w:t>
       </w:r>
     </w:p>
     <w:tbl>
@@ -6565,7 +6564,7 @@
         <w:pStyle w:val="Heading3"/>
       </w:pPr>
       <w:r>
-        <w:t>5.2.5 Электромагнитные поля</w:t>
+        <w:t>5.1.5 Электромагнитные поля</w:t>
       </w:r>
     </w:p>
     <w:p>
@@ -6578,7 +6577,7 @@
         <w:keepNext/>
       </w:pPr>
       <w:r>
-        <w:t>Наибольшая мощность передатчика модуля TX-AH стенда – +20 дБм, то есть 100 мВт [17]. В опытах мощность стенда ограничена 14 дБм: в полосе 866–868 МГц решения ГКРЧ допускают эффективную излучаемую мощность не более 25 мВт [15, 23], поэтому расчёт по 20 дБм идёт в запас. Усиление штатных антенн – 0 дБи. На расстоянии больше длины волны (0,35 м) плотность потока энергии от одновременно передающих плат:</w:t>
+        <w:t>Наибольшая мощность передатчика модуля TX-AH стенда – +20 дБм, то есть 100 мВт [19]. В опытах мощность стенда ограничена 14 дБм: в полосе 866–868 МГц решения ГКРЧ допускают эффективную излучаемую мощность не более 25 мВт [20, 21], поэтому расчёт по 20 дБм идёт в запас. Усиление штатных антенн – 0 дБи. На расстоянии больше длины волны (0,35 м) плотность потока энергии от одновременно передающих плат:</w:t>
       </w:r>
     </w:p>
     <w:tbl>
@@ -6877,7 +6876,7 @@
         <w:keepNext/>
       </w:pPr>
       <w:r>
-        <w:t>Энергетическая экспозиция за смену при непрерывной передаче [57]:</w:t>
+        <w:t>Энергетическая экспозиция за смену при непрерывной передаче [7]:</w:t>
       </w:r>
     </w:p>
     <w:tbl>
@@ -7024,7 +7023,7 @@
     </w:p>
     <w:p>
       <w:r>
-        <w:t>Для диапазона 300 МГц – 300 ГГц энергетическая экспозиция за смену должна быть не более 200 (мкВт/см²)·ч, плотность потока энергии – не более 1000 мкВт/см² [57]. Даже если обе платы передают с наибольшей мощностью всю смену, экспозиция в 3,9 раза ниже нормы; по экспозиции норма выполняется уже на расстоянии 0,25 м от антенн. Платы стенда размещаются на столе не ближе 0,5 м от оператора (рисунок 5.3). Уровень фактора не превышает предельно допустимого, поэтому по Методике СОУТ условия труда по излучению стенда – класс 2 (допустимый) [53].</w:t>
+        <w:t>Для диапазона 300 МГц – 300 ГГц энергетическая экспозиция за смену должна быть не более 200 (мкВт/см²)·ч, плотность потока энергии – не более 1000 мкВт/см² [7]. Даже если обе платы передают с наибольшей мощностью всю смену, экспозиция в 3,9 раза ниже нормы; по экспозиции норма выполняется уже на расстоянии 0,25 м от антенн. Платы стенда размещаются на столе не ближе 0,5 м от оператора (рисунок 5.3). Уровень фактора не превышает предельно допустимого, поэтому по Методике СОУТ условия труда по излучению стенда – класс 2 (допустимый) [3].</w:t>
       </w:r>
     </w:p>
     <w:p>
@@ -7032,12 +7031,12 @@
         <w:pStyle w:val="Heading3"/>
       </w:pPr>
       <w:r>
-        <w:t>5.2.6 Тяжесть и напряжённость трудового процесса</w:t>
+        <w:t>5.1.6 Тяжесть и напряжённость трудового процесса</w:t>
       </w:r>
     </w:p>
     <w:p>
       <w:r>
-        <w:t>Тяжесть трудового процесса характеризует физическую нагрузку, напряжённость – нагрузку на центральную нервную систему, органы чувств и эмоциональную сферу [68]. Оценка тяжести приведена в таблице 5.8; итоговый класс равен наибольшему из классов по отдельным показателям.</w:t>
+        <w:t>Тяжесть трудового процесса характеризует физическую нагрузку, напряжённость – нагрузку на центральную нервную систему, органы чувств и эмоциональную сферу; оба фактора оцениваются по показателям Методики СОУТ [3]. Оценка тяжести приведена в таблице 5.8; итоговый класс равен наибольшему из классов по отдельным показателям.</w:t>
       </w:r>
     </w:p>
     <w:p>
@@ -7618,7 +7617,7 @@
     </w:p>
     <w:p>
       <w:r>
-        <w:t>Напряжённость оценивается по 23 показателям; результаты приведены в таблице 5.9.</w:t>
+        <w:t>Оценка напряжённости по показателям сенсорных нагрузок и монотонности нагрузок приведена в таблице 5.9.</w:t>
       </w:r>
     </w:p>
     <w:p>
@@ -7643,9 +7642,9 @@
         </w:tblCellMar>
       </w:tblPr>
       <w:tblGrid>
-        <w:gridCol w:w="4081"/>
-        <w:gridCol w:w="4422"/>
-        <w:gridCol w:w="850"/>
+        <w:gridCol w:w="3514"/>
+        <w:gridCol w:w="3968"/>
+        <w:gridCol w:w="1870"/>
       </w:tblGrid>
       <w:tr>
         <w:trPr>
@@ -7654,12 +7653,13 @@
         </w:trPr>
         <w:tc>
           <w:tcPr>
-            <w:tcW w:type="dxa" w:w="4082"/>
-            <w:vAlign w:val="center"/>
-          </w:tcPr>
-          <w:p>
-            <w:pPr>
-              <w:pStyle w:val="TableText"/>
+            <w:tcW w:type="dxa" w:w="3515"/>
+            <w:vAlign w:val="center"/>
+          </w:tcPr>
+          <w:p>
+            <w:pPr>
+              <w:pStyle w:val="TableText"/>
+              <w:keepNext/>
               <w:jc w:val="center"/>
             </w:pPr>
             <w:r>
@@ -7667,18 +7667,19 @@
                 <w:b/>
                 <w:sz w:val="22"/>
               </w:rPr>
-              <w:t>Показатель напряжённости</w:t>
-            </w:r>
-          </w:p>
-        </w:tc>
-        <w:tc>
-          <w:tcPr>
-            <w:tcW w:type="dxa" w:w="4422"/>
-            <w:vAlign w:val="center"/>
-          </w:tcPr>
-          <w:p>
-            <w:pPr>
-              <w:pStyle w:val="TableText"/>
+              <w:t>Показатель</w:t>
+            </w:r>
+          </w:p>
+        </w:tc>
+        <w:tc>
+          <w:tcPr>
+            <w:tcW w:type="dxa" w:w="3969"/>
+            <w:vAlign w:val="center"/>
+          </w:tcPr>
+          <w:p>
+            <w:pPr>
+              <w:pStyle w:val="TableText"/>
+              <w:keepNext/>
               <w:jc w:val="center"/>
             </w:pPr>
             <w:r>
@@ -7686,18 +7687,19 @@
                 <w:b/>
                 <w:sz w:val="22"/>
               </w:rPr>
-              <w:t>Характеристика работы специалиста</w:t>
-            </w:r>
-          </w:p>
-        </w:tc>
-        <w:tc>
-          <w:tcPr>
-            <w:tcW w:type="dxa" w:w="850"/>
-            <w:vAlign w:val="center"/>
-          </w:tcPr>
-          <w:p>
-            <w:pPr>
-              <w:pStyle w:val="TableText"/>
+              <w:t>Фактическое значение</w:t>
+            </w:r>
+          </w:p>
+        </w:tc>
+        <w:tc>
+          <w:tcPr>
+            <w:tcW w:type="dxa" w:w="1871"/>
+            <w:vAlign w:val="center"/>
+          </w:tcPr>
+          <w:p>
+            <w:pPr>
+              <w:pStyle w:val="TableText"/>
+              <w:keepNext/>
               <w:jc w:val="center"/>
             </w:pPr>
             <w:r>
@@ -7705,7 +7707,7 @@
                 <w:b/>
                 <w:sz w:val="22"/>
               </w:rPr>
-              <w:t>Класс</w:t>
+              <w:t>Класс условий труда</w:t>
             </w:r>
           </w:p>
         </w:tc>
@@ -7716,21 +7718,58 @@
         </w:trPr>
         <w:tc>
           <w:tcPr>
-            <w:tcW w:type="dxa" w:w="9354"/>
-            <w:gridSpan w:val="3"/>
-            <w:vAlign w:val="center"/>
-          </w:tcPr>
-          <w:p>
-            <w:pPr>
-              <w:pStyle w:val="TableText"/>
+            <w:tcW w:type="dxa" w:w="3515"/>
+            <w:vAlign w:val="center"/>
+          </w:tcPr>
+          <w:p>
+            <w:pPr>
+              <w:pStyle w:val="TableText"/>
+              <w:keepNext/>
               <w:jc w:val="left"/>
             </w:pPr>
             <w:r>
               <w:rPr>
-                <w:b/>
-                <w:sz w:val="20"/>
-              </w:rPr>
-              <w:t>1. Интеллектуальные нагрузки</w:t>
+                <w:sz w:val="22"/>
+              </w:rPr>
+              <w:t>Плотность сигналов и сообщений в среднем за 1 ч, ед.</w:t>
+            </w:r>
+          </w:p>
+        </w:tc>
+        <w:tc>
+          <w:tcPr>
+            <w:tcW w:type="dxa" w:w="3969"/>
+            <w:vAlign w:val="center"/>
+          </w:tcPr>
+          <w:p>
+            <w:pPr>
+              <w:pStyle w:val="TableText"/>
+              <w:keepNext/>
+              <w:jc w:val="left"/>
+            </w:pPr>
+            <w:r>
+              <w:rPr>
+                <w:sz w:val="22"/>
+              </w:rPr>
+              <w:t>15–20 (сообщения, результаты расчётов и измерений)</w:t>
+            </w:r>
+          </w:p>
+        </w:tc>
+        <w:tc>
+          <w:tcPr>
+            <w:tcW w:type="dxa" w:w="1871"/>
+            <w:vAlign w:val="center"/>
+          </w:tcPr>
+          <w:p>
+            <w:pPr>
+              <w:pStyle w:val="TableText"/>
+              <w:keepNext/>
+              <w:jc w:val="center"/>
+            </w:pPr>
+            <w:r>
+              <w:rPr>
+                <w:sz w:val="22"/>
+              </w:rPr>
+              <w:t>1 (до 75)</w:t>
             </w:r>
           </w:p>
         </w:tc>
@@ -7741,55 +7780,58 @@
         </w:trPr>
         <w:tc>
           <w:tcPr>
-            <w:tcW w:type="dxa" w:w="4082"/>
-            <w:vAlign w:val="center"/>
-          </w:tcPr>
-          <w:p>
-            <w:pPr>
-              <w:pStyle w:val="TableText"/>
+            <w:tcW w:type="dxa" w:w="3515"/>
+            <w:vAlign w:val="center"/>
+          </w:tcPr>
+          <w:p>
+            <w:pPr>
+              <w:pStyle w:val="TableText"/>
+              <w:keepNext/>
               <w:jc w:val="left"/>
             </w:pPr>
             <w:r>
               <w:rPr>
-                <w:sz w:val="20"/>
-              </w:rPr>
-              <w:t>1.1. Содержание работы</w:t>
-            </w:r>
-          </w:p>
-        </w:tc>
-        <w:tc>
-          <w:tcPr>
-            <w:tcW w:type="dxa" w:w="4422"/>
-            <w:vAlign w:val="center"/>
-          </w:tcPr>
-          <w:p>
-            <w:pPr>
-              <w:pStyle w:val="TableText"/>
+                <w:sz w:val="22"/>
+              </w:rPr>
+              <w:t>Число производственных объектов одновременного наблюдения, ед.</w:t>
+            </w:r>
+          </w:p>
+        </w:tc>
+        <w:tc>
+          <w:tcPr>
+            <w:tcW w:type="dxa" w:w="3969"/>
+            <w:vAlign w:val="center"/>
+          </w:tcPr>
+          <w:p>
+            <w:pPr>
+              <w:pStyle w:val="TableText"/>
+              <w:keepNext/>
               <w:jc w:val="left"/>
             </w:pPr>
             <w:r>
               <w:rPr>
-                <w:sz w:val="20"/>
-              </w:rPr>
-              <w:t>Эвристическая (творческая) деятельность: разработка программ, анализ результатов измерений</w:t>
-            </w:r>
-          </w:p>
-        </w:tc>
-        <w:tc>
-          <w:tcPr>
-            <w:tcW w:type="dxa" w:w="850"/>
-            <w:vAlign w:val="center"/>
-          </w:tcPr>
-          <w:p>
-            <w:pPr>
-              <w:pStyle w:val="TableText"/>
-              <w:jc w:val="center"/>
-            </w:pPr>
-            <w:r>
-              <w:rPr>
-                <w:sz w:val="20"/>
-              </w:rPr>
-              <w:t>3.2</w:t>
+                <w:sz w:val="22"/>
+              </w:rPr>
+              <w:t>до 4 (редактор программ, консоль, окна графиков, журнал измерений)</w:t>
+            </w:r>
+          </w:p>
+        </w:tc>
+        <w:tc>
+          <w:tcPr>
+            <w:tcW w:type="dxa" w:w="1871"/>
+            <w:vAlign w:val="center"/>
+          </w:tcPr>
+          <w:p>
+            <w:pPr>
+              <w:pStyle w:val="TableText"/>
+              <w:keepNext/>
+              <w:jc w:val="center"/>
+            </w:pPr>
+            <w:r>
+              <w:rPr>
+                <w:sz w:val="22"/>
+              </w:rPr>
+              <w:t>1 (до 5)</w:t>
             </w:r>
           </w:p>
         </w:tc>
@@ -7800,55 +7842,58 @@
         </w:trPr>
         <w:tc>
           <w:tcPr>
-            <w:tcW w:type="dxa" w:w="4082"/>
-            <w:vAlign w:val="center"/>
-          </w:tcPr>
-          <w:p>
-            <w:pPr>
-              <w:pStyle w:val="TableText"/>
+            <w:tcW w:type="dxa" w:w="3515"/>
+            <w:vAlign w:val="center"/>
+          </w:tcPr>
+          <w:p>
+            <w:pPr>
+              <w:pStyle w:val="TableText"/>
+              <w:keepNext/>
               <w:jc w:val="left"/>
             </w:pPr>
             <w:r>
               <w:rPr>
-                <w:sz w:val="20"/>
-              </w:rPr>
-              <w:t>1.2. Восприятие сигналов (информации) и их оценка</w:t>
-            </w:r>
-          </w:p>
-        </w:tc>
-        <w:tc>
-          <w:tcPr>
-            <w:tcW w:type="dxa" w:w="4422"/>
-            <w:vAlign w:val="center"/>
-          </w:tcPr>
-          <w:p>
-            <w:pPr>
-              <w:pStyle w:val="TableText"/>
+                <w:sz w:val="22"/>
+              </w:rPr>
+              <w:t>Работа с оптическими приборами, % времени смены</w:t>
+            </w:r>
+          </w:p>
+        </w:tc>
+        <w:tc>
+          <w:tcPr>
+            <w:tcW w:type="dxa" w:w="3969"/>
+            <w:vAlign w:val="center"/>
+          </w:tcPr>
+          <w:p>
+            <w:pPr>
+              <w:pStyle w:val="TableText"/>
+              <w:keepNext/>
               <w:jc w:val="left"/>
             </w:pPr>
             <w:r>
               <w:rPr>
-                <w:sz w:val="20"/>
-              </w:rPr>
-              <w:t>Сопоставление измеренных значений параметров канала с расчётными</w:t>
-            </w:r>
-          </w:p>
-        </w:tc>
-        <w:tc>
-          <w:tcPr>
-            <w:tcW w:type="dxa" w:w="850"/>
-            <w:vAlign w:val="center"/>
-          </w:tcPr>
-          <w:p>
-            <w:pPr>
-              <w:pStyle w:val="TableText"/>
-              <w:jc w:val="center"/>
-            </w:pPr>
-            <w:r>
-              <w:rPr>
-                <w:sz w:val="20"/>
-              </w:rPr>
-              <w:t>3.1</w:t>
+                <w:sz w:val="22"/>
+              </w:rPr>
+              <w:t>не выполняется</w:t>
+            </w:r>
+          </w:p>
+        </w:tc>
+        <w:tc>
+          <w:tcPr>
+            <w:tcW w:type="dxa" w:w="1871"/>
+            <w:vAlign w:val="center"/>
+          </w:tcPr>
+          <w:p>
+            <w:pPr>
+              <w:pStyle w:val="TableText"/>
+              <w:keepNext/>
+              <w:jc w:val="center"/>
+            </w:pPr>
+            <w:r>
+              <w:rPr>
+                <w:sz w:val="22"/>
+              </w:rPr>
+              <w:t>1</w:t>
             </w:r>
           </w:p>
         </w:tc>
@@ -7859,55 +7904,58 @@
         </w:trPr>
         <w:tc>
           <w:tcPr>
-            <w:tcW w:type="dxa" w:w="4082"/>
-            <w:vAlign w:val="center"/>
-          </w:tcPr>
-          <w:p>
-            <w:pPr>
-              <w:pStyle w:val="TableText"/>
+            <w:tcW w:type="dxa" w:w="3515"/>
+            <w:vAlign w:val="center"/>
+          </w:tcPr>
+          <w:p>
+            <w:pPr>
+              <w:pStyle w:val="TableText"/>
+              <w:keepNext/>
               <w:jc w:val="left"/>
             </w:pPr>
             <w:r>
               <w:rPr>
-                <w:sz w:val="20"/>
-              </w:rPr>
-              <w:t>1.3. Распределение функций по степени сложности задания</w:t>
-            </w:r>
-          </w:p>
-        </w:tc>
-        <w:tc>
-          <w:tcPr>
-            <w:tcW w:type="dxa" w:w="4422"/>
-            <w:vAlign w:val="center"/>
-          </w:tcPr>
-          <w:p>
-            <w:pPr>
-              <w:pStyle w:val="TableText"/>
+                <w:sz w:val="22"/>
+              </w:rPr>
+              <w:t>Нагрузка на голосовой аппарат, ч в неделю</w:t>
+            </w:r>
+          </w:p>
+        </w:tc>
+        <w:tc>
+          <w:tcPr>
+            <w:tcW w:type="dxa" w:w="3969"/>
+            <w:vAlign w:val="center"/>
+          </w:tcPr>
+          <w:p>
+            <w:pPr>
+              <w:pStyle w:val="TableText"/>
+              <w:keepNext/>
               <w:jc w:val="left"/>
             </w:pPr>
             <w:r>
               <w:rPr>
-                <w:sz w:val="20"/>
-              </w:rPr>
-              <w:t>Обработка, выполнение задания и его проверка</w:t>
-            </w:r>
-          </w:p>
-        </w:tc>
-        <w:tc>
-          <w:tcPr>
-            <w:tcW w:type="dxa" w:w="850"/>
-            <w:vAlign w:val="center"/>
-          </w:tcPr>
-          <w:p>
-            <w:pPr>
-              <w:pStyle w:val="TableText"/>
-              <w:jc w:val="center"/>
-            </w:pPr>
-            <w:r>
-              <w:rPr>
-                <w:sz w:val="20"/>
-              </w:rPr>
-              <w:t>2</w:t>
+                <w:sz w:val="22"/>
+              </w:rPr>
+              <w:t>около 5 (обсуждения с руководителем)</w:t>
+            </w:r>
+          </w:p>
+        </w:tc>
+        <w:tc>
+          <w:tcPr>
+            <w:tcW w:type="dxa" w:w="1871"/>
+            <w:vAlign w:val="center"/>
+          </w:tcPr>
+          <w:p>
+            <w:pPr>
+              <w:pStyle w:val="TableText"/>
+              <w:keepNext/>
+              <w:jc w:val="center"/>
+            </w:pPr>
+            <w:r>
+              <w:rPr>
+                <w:sz w:val="22"/>
+              </w:rPr>
+              <w:t>1 (до 16)</w:t>
             </w:r>
           </w:p>
         </w:tc>
@@ -7918,55 +7966,58 @@
         </w:trPr>
         <w:tc>
           <w:tcPr>
-            <w:tcW w:type="dxa" w:w="4082"/>
-            <w:vAlign w:val="center"/>
-          </w:tcPr>
-          <w:p>
-            <w:pPr>
-              <w:pStyle w:val="TableText"/>
+            <w:tcW w:type="dxa" w:w="3515"/>
+            <w:vAlign w:val="center"/>
+          </w:tcPr>
+          <w:p>
+            <w:pPr>
+              <w:pStyle w:val="TableText"/>
+              <w:keepNext/>
               <w:jc w:val="left"/>
             </w:pPr>
             <w:r>
               <w:rPr>
-                <w:sz w:val="20"/>
-              </w:rPr>
-              <w:t>1.4. Характер выполняемой работы</w:t>
-            </w:r>
-          </w:p>
-        </w:tc>
-        <w:tc>
-          <w:tcPr>
-            <w:tcW w:type="dxa" w:w="4422"/>
-            <w:vAlign w:val="center"/>
-          </w:tcPr>
-          <w:p>
-            <w:pPr>
-              <w:pStyle w:val="TableText"/>
+                <w:sz w:val="22"/>
+              </w:rPr>
+              <w:t>Число элементов простого задания или повторяющихся операций, ед.</w:t>
+            </w:r>
+          </w:p>
+        </w:tc>
+        <w:tc>
+          <w:tcPr>
+            <w:tcW w:type="dxa" w:w="3969"/>
+            <w:vAlign w:val="center"/>
+          </w:tcPr>
+          <w:p>
+            <w:pPr>
+              <w:pStyle w:val="TableText"/>
+              <w:keepNext/>
               <w:jc w:val="left"/>
             </w:pPr>
             <w:r>
               <w:rPr>
-                <w:sz w:val="20"/>
-              </w:rPr>
-              <w:t>Работа по календарному плану с возможной его коррекцией</w:t>
-            </w:r>
-          </w:p>
-        </w:tc>
-        <w:tc>
-          <w:tcPr>
-            <w:tcW w:type="dxa" w:w="850"/>
-            <w:vAlign w:val="center"/>
-          </w:tcPr>
-          <w:p>
-            <w:pPr>
-              <w:pStyle w:val="TableText"/>
-              <w:jc w:val="center"/>
-            </w:pPr>
-            <w:r>
-              <w:rPr>
-                <w:sz w:val="20"/>
-              </w:rPr>
-              <w:t>2</w:t>
+                <w:sz w:val="22"/>
+              </w:rPr>
+              <w:t>14</w:t>
+            </w:r>
+          </w:p>
+        </w:tc>
+        <w:tc>
+          <w:tcPr>
+            <w:tcW w:type="dxa" w:w="1871"/>
+            <w:vAlign w:val="center"/>
+          </w:tcPr>
+          <w:p>
+            <w:pPr>
+              <w:pStyle w:val="TableText"/>
+              <w:keepNext/>
+              <w:jc w:val="center"/>
+            </w:pPr>
+            <w:r>
+              <w:rPr>
+                <w:sz w:val="22"/>
+              </w:rPr>
+              <w:t>1</w:t>
             </w:r>
           </w:p>
         </w:tc>
@@ -7977,8 +8028,7 @@
         </w:trPr>
         <w:tc>
           <w:tcPr>
-            <w:tcW w:type="dxa" w:w="9354"/>
-            <w:gridSpan w:val="3"/>
+            <w:tcW w:type="dxa" w:w="3515"/>
             <w:vAlign w:val="center"/>
           </w:tcPr>
           <w:p>
@@ -7988,21 +8038,15 @@
             </w:pPr>
             <w:r>
               <w:rPr>
-                <w:b/>
-                <w:sz w:val="20"/>
-              </w:rPr>
-              <w:t>2. Сенсорные нагрузки</w:t>
-            </w:r>
-          </w:p>
-        </w:tc>
-      </w:tr>
-      <w:tr>
-        <w:trPr>
-          <w:cantSplit/>
-        </w:trPr>
-        <w:tc>
-          <w:tcPr>
-            <w:tcW w:type="dxa" w:w="4082"/>
+                <w:sz w:val="22"/>
+              </w:rPr>
+              <w:t>Время пассивного наблюдения за ходом процесса, % времени смены</w:t>
+            </w:r>
+          </w:p>
+        </w:tc>
+        <w:tc>
+          <w:tcPr>
+            <w:tcW w:type="dxa" w:w="3969"/>
             <w:vAlign w:val="center"/>
           </w:tcPr>
           <w:p>
@@ -8012,1250 +8056,27 @@
             </w:pPr>
             <w:r>
               <w:rPr>
-                <w:sz w:val="20"/>
-              </w:rPr>
-              <w:t>2.1. Длительность сосредоточенного наблюдения, % времени смены</w:t>
-            </w:r>
-          </w:p>
-        </w:tc>
-        <w:tc>
-          <w:tcPr>
-            <w:tcW w:type="dxa" w:w="4422"/>
-            <w:vAlign w:val="center"/>
-          </w:tcPr>
-          <w:p>
-            <w:pPr>
-              <w:pStyle w:val="TableText"/>
-              <w:jc w:val="left"/>
-            </w:pPr>
-            <w:r>
-              <w:rPr>
-                <w:sz w:val="20"/>
-              </w:rPr>
-              <w:t>26–50</w:t>
-            </w:r>
-          </w:p>
-        </w:tc>
-        <w:tc>
-          <w:tcPr>
-            <w:tcW w:type="dxa" w:w="850"/>
-            <w:vAlign w:val="center"/>
-          </w:tcPr>
-          <w:p>
-            <w:pPr>
-              <w:pStyle w:val="TableText"/>
-              <w:jc w:val="center"/>
-            </w:pPr>
-            <w:r>
-              <w:rPr>
-                <w:sz w:val="20"/>
-              </w:rPr>
-              <w:t>2</w:t>
-            </w:r>
-          </w:p>
-        </w:tc>
-      </w:tr>
-      <w:tr>
-        <w:trPr>
-          <w:cantSplit/>
-        </w:trPr>
-        <w:tc>
-          <w:tcPr>
-            <w:tcW w:type="dxa" w:w="4082"/>
-            <w:vAlign w:val="center"/>
-          </w:tcPr>
-          <w:p>
-            <w:pPr>
-              <w:pStyle w:val="TableText"/>
-              <w:jc w:val="left"/>
-            </w:pPr>
-            <w:r>
-              <w:rPr>
-                <w:sz w:val="20"/>
-              </w:rPr>
-              <w:t>2.2. Плотность сигналов и сообщений в среднем за 1 ч</w:t>
-            </w:r>
-          </w:p>
-        </w:tc>
-        <w:tc>
-          <w:tcPr>
-            <w:tcW w:type="dxa" w:w="4422"/>
-            <w:vAlign w:val="center"/>
-          </w:tcPr>
-          <w:p>
-            <w:pPr>
-              <w:pStyle w:val="TableText"/>
-              <w:jc w:val="left"/>
-            </w:pPr>
-            <w:r>
-              <w:rPr>
-                <w:sz w:val="20"/>
-              </w:rPr>
-              <w:t>До 75</w:t>
-            </w:r>
-          </w:p>
-        </w:tc>
-        <w:tc>
-          <w:tcPr>
-            <w:tcW w:type="dxa" w:w="850"/>
-            <w:vAlign w:val="center"/>
-          </w:tcPr>
-          <w:p>
-            <w:pPr>
-              <w:pStyle w:val="TableText"/>
-              <w:jc w:val="center"/>
-            </w:pPr>
-            <w:r>
-              <w:rPr>
-                <w:sz w:val="20"/>
-              </w:rPr>
-              <w:t>1</w:t>
-            </w:r>
-          </w:p>
-        </w:tc>
-      </w:tr>
-      <w:tr>
-        <w:trPr>
-          <w:cantSplit/>
-        </w:trPr>
-        <w:tc>
-          <w:tcPr>
-            <w:tcW w:type="dxa" w:w="4082"/>
-            <w:vAlign w:val="center"/>
-          </w:tcPr>
-          <w:p>
-            <w:pPr>
-              <w:pStyle w:val="TableText"/>
-              <w:jc w:val="left"/>
-            </w:pPr>
-            <w:r>
-              <w:rPr>
-                <w:sz w:val="20"/>
-              </w:rPr>
-              <w:t>2.3. Число производственных объектов одновременного наблюдения</w:t>
-            </w:r>
-          </w:p>
-        </w:tc>
-        <w:tc>
-          <w:tcPr>
-            <w:tcW w:type="dxa" w:w="4422"/>
-            <w:vAlign w:val="center"/>
-          </w:tcPr>
-          <w:p>
-            <w:pPr>
-              <w:pStyle w:val="TableText"/>
-              <w:jc w:val="left"/>
-            </w:pPr>
-            <w:r>
-              <w:rPr>
-                <w:sz w:val="20"/>
-              </w:rPr>
-              <w:t>До 5</w:t>
-            </w:r>
-          </w:p>
-        </w:tc>
-        <w:tc>
-          <w:tcPr>
-            <w:tcW w:type="dxa" w:w="850"/>
-            <w:vAlign w:val="center"/>
-          </w:tcPr>
-          <w:p>
-            <w:pPr>
-              <w:pStyle w:val="TableText"/>
-              <w:jc w:val="center"/>
-            </w:pPr>
-            <w:r>
-              <w:rPr>
-                <w:sz w:val="20"/>
-              </w:rPr>
-              <w:t>1</w:t>
-            </w:r>
-          </w:p>
-        </w:tc>
-      </w:tr>
-      <w:tr>
-        <w:trPr>
-          <w:cantSplit/>
-        </w:trPr>
-        <w:tc>
-          <w:tcPr>
-            <w:tcW w:type="dxa" w:w="4082"/>
-            <w:vAlign w:val="center"/>
-          </w:tcPr>
-          <w:p>
-            <w:pPr>
-              <w:pStyle w:val="TableText"/>
-              <w:jc w:val="left"/>
-            </w:pPr>
-            <w:r>
-              <w:rPr>
-                <w:sz w:val="20"/>
-              </w:rPr>
-              <w:t>2.4. Размер объекта различения</w:t>
-            </w:r>
-          </w:p>
-        </w:tc>
-        <w:tc>
-          <w:tcPr>
-            <w:tcW w:type="dxa" w:w="4422"/>
-            <w:vAlign w:val="center"/>
-          </w:tcPr>
-          <w:p>
-            <w:pPr>
-              <w:pStyle w:val="TableText"/>
-              <w:jc w:val="left"/>
-            </w:pPr>
-            <w:r>
-              <w:rPr>
-                <w:sz w:val="20"/>
-              </w:rPr>
-              <w:t>5–1,1 мм – более 50 % времени (знаки на экране)</w:t>
-            </w:r>
-          </w:p>
-        </w:tc>
-        <w:tc>
-          <w:tcPr>
-            <w:tcW w:type="dxa" w:w="850"/>
-            <w:vAlign w:val="center"/>
-          </w:tcPr>
-          <w:p>
-            <w:pPr>
-              <w:pStyle w:val="TableText"/>
-              <w:jc w:val="center"/>
-            </w:pPr>
-            <w:r>
-              <w:rPr>
-                <w:sz w:val="20"/>
-              </w:rPr>
-              <w:t>2</w:t>
-            </w:r>
-          </w:p>
-        </w:tc>
-      </w:tr>
-      <w:tr>
-        <w:trPr>
-          <w:cantSplit/>
-        </w:trPr>
-        <w:tc>
-          <w:tcPr>
-            <w:tcW w:type="dxa" w:w="4082"/>
-            <w:vAlign w:val="center"/>
-          </w:tcPr>
-          <w:p>
-            <w:pPr>
-              <w:pStyle w:val="TableText"/>
-              <w:jc w:val="left"/>
-            </w:pPr>
-            <w:r>
-              <w:rPr>
-                <w:sz w:val="20"/>
-              </w:rPr>
-              <w:t>2.5. Работа с оптическими приборами, % времени смены</w:t>
-            </w:r>
-          </w:p>
-        </w:tc>
-        <w:tc>
-          <w:tcPr>
-            <w:tcW w:type="dxa" w:w="4422"/>
-            <w:vAlign w:val="center"/>
-          </w:tcPr>
-          <w:p>
-            <w:pPr>
-              <w:pStyle w:val="TableText"/>
-              <w:jc w:val="left"/>
-            </w:pPr>
-            <w:r>
-              <w:rPr>
-                <w:sz w:val="20"/>
-              </w:rPr>
-              <w:t>Не выполняется</w:t>
-            </w:r>
-          </w:p>
-        </w:tc>
-        <w:tc>
-          <w:tcPr>
-            <w:tcW w:type="dxa" w:w="850"/>
-            <w:vAlign w:val="center"/>
-          </w:tcPr>
-          <w:p>
-            <w:pPr>
-              <w:pStyle w:val="TableText"/>
-              <w:jc w:val="center"/>
-            </w:pPr>
-            <w:r>
-              <w:rPr>
-                <w:sz w:val="20"/>
-              </w:rPr>
-              <w:t>1</w:t>
-            </w:r>
-          </w:p>
-        </w:tc>
-      </w:tr>
-      <w:tr>
-        <w:trPr>
-          <w:cantSplit/>
-        </w:trPr>
-        <w:tc>
-          <w:tcPr>
-            <w:tcW w:type="dxa" w:w="4082"/>
-            <w:vAlign w:val="center"/>
-          </w:tcPr>
-          <w:p>
-            <w:pPr>
-              <w:pStyle w:val="TableText"/>
-              <w:jc w:val="left"/>
-            </w:pPr>
-            <w:r>
-              <w:rPr>
-                <w:sz w:val="20"/>
-              </w:rPr>
-              <w:t>2.6. Наблюдение за экраном видеотерминала, ч в смену</w:t>
-            </w:r>
-          </w:p>
-        </w:tc>
-        <w:tc>
-          <w:tcPr>
-            <w:tcW w:type="dxa" w:w="4422"/>
-            <w:vAlign w:val="center"/>
-          </w:tcPr>
-          <w:p>
-            <w:pPr>
-              <w:pStyle w:val="TableText"/>
-              <w:jc w:val="left"/>
-            </w:pPr>
-            <w:r>
-              <w:rPr>
-                <w:sz w:val="20"/>
-              </w:rPr>
-              <w:t>До 6 (графический тип отображения)</w:t>
-            </w:r>
-          </w:p>
-        </w:tc>
-        <w:tc>
-          <w:tcPr>
-            <w:tcW w:type="dxa" w:w="850"/>
-            <w:vAlign w:val="center"/>
-          </w:tcPr>
-          <w:p>
-            <w:pPr>
-              <w:pStyle w:val="TableText"/>
-              <w:jc w:val="center"/>
-            </w:pPr>
-            <w:r>
-              <w:rPr>
-                <w:sz w:val="20"/>
-              </w:rPr>
-              <w:t>3.1</w:t>
-            </w:r>
-          </w:p>
-        </w:tc>
-      </w:tr>
-      <w:tr>
-        <w:trPr>
-          <w:cantSplit/>
-        </w:trPr>
-        <w:tc>
-          <w:tcPr>
-            <w:tcW w:type="dxa" w:w="4082"/>
-            <w:vAlign w:val="center"/>
-          </w:tcPr>
-          <w:p>
-            <w:pPr>
-              <w:pStyle w:val="TableText"/>
-              <w:jc w:val="left"/>
-            </w:pPr>
-            <w:r>
-              <w:rPr>
-                <w:sz w:val="20"/>
-              </w:rPr>
-              <w:t>2.7. Нагрузка на слуховой анализатор</w:t>
-            </w:r>
-          </w:p>
-        </w:tc>
-        <w:tc>
-          <w:tcPr>
-            <w:tcW w:type="dxa" w:w="4422"/>
-            <w:vAlign w:val="center"/>
-          </w:tcPr>
-          <w:p>
-            <w:pPr>
-              <w:pStyle w:val="TableText"/>
-              <w:jc w:val="left"/>
-            </w:pPr>
-            <w:r>
-              <w:rPr>
-                <w:sz w:val="20"/>
-              </w:rPr>
-              <w:t>Работа на слух не выполняется; речь в кабинете разборчива без помех (разборчивость 100–90 %)</w:t>
-            </w:r>
-          </w:p>
-        </w:tc>
-        <w:tc>
-          <w:tcPr>
-            <w:tcW w:type="dxa" w:w="850"/>
-            <w:vAlign w:val="center"/>
-          </w:tcPr>
-          <w:p>
-            <w:pPr>
-              <w:pStyle w:val="TableText"/>
-              <w:jc w:val="center"/>
-            </w:pPr>
-            <w:r>
-              <w:rPr>
-                <w:sz w:val="20"/>
-              </w:rPr>
-              <w:t>1</w:t>
-            </w:r>
-          </w:p>
-        </w:tc>
-      </w:tr>
-      <w:tr>
-        <w:trPr>
-          <w:cantSplit/>
-        </w:trPr>
-        <w:tc>
-          <w:tcPr>
-            <w:tcW w:type="dxa" w:w="4082"/>
-            <w:vAlign w:val="center"/>
-          </w:tcPr>
-          <w:p>
-            <w:pPr>
-              <w:pStyle w:val="TableText"/>
-              <w:jc w:val="left"/>
-            </w:pPr>
-            <w:r>
-              <w:rPr>
-                <w:sz w:val="20"/>
-              </w:rPr>
-              <w:t>2.8. Нагрузка на голосовой аппарат, ч в неделю</w:t>
-            </w:r>
-          </w:p>
-        </w:tc>
-        <w:tc>
-          <w:tcPr>
-            <w:tcW w:type="dxa" w:w="4422"/>
-            <w:vAlign w:val="center"/>
-          </w:tcPr>
-          <w:p>
-            <w:pPr>
-              <w:pStyle w:val="TableText"/>
-              <w:jc w:val="left"/>
-            </w:pPr>
-            <w:r>
-              <w:rPr>
-                <w:sz w:val="20"/>
-              </w:rPr>
-              <w:t>До 16</w:t>
-            </w:r>
-          </w:p>
-        </w:tc>
-        <w:tc>
-          <w:tcPr>
-            <w:tcW w:type="dxa" w:w="850"/>
-            <w:vAlign w:val="center"/>
-          </w:tcPr>
-          <w:p>
-            <w:pPr>
-              <w:pStyle w:val="TableText"/>
-              <w:jc w:val="center"/>
-            </w:pPr>
-            <w:r>
-              <w:rPr>
-                <w:sz w:val="20"/>
-              </w:rPr>
-              <w:t>1</w:t>
-            </w:r>
-          </w:p>
-        </w:tc>
-      </w:tr>
-      <w:tr>
-        <w:trPr>
-          <w:cantSplit/>
-        </w:trPr>
-        <w:tc>
-          <w:tcPr>
-            <w:tcW w:type="dxa" w:w="9354"/>
-            <w:gridSpan w:val="3"/>
-            <w:vAlign w:val="center"/>
-          </w:tcPr>
-          <w:p>
-            <w:pPr>
-              <w:pStyle w:val="TableText"/>
-              <w:jc w:val="left"/>
-            </w:pPr>
-            <w:r>
-              <w:rPr>
-                <w:b/>
-                <w:sz w:val="20"/>
-              </w:rPr>
-              <w:t>3. Эмоциональные нагрузки</w:t>
-            </w:r>
-          </w:p>
-        </w:tc>
-      </w:tr>
-      <w:tr>
-        <w:trPr>
-          <w:cantSplit/>
-        </w:trPr>
-        <w:tc>
-          <w:tcPr>
-            <w:tcW w:type="dxa" w:w="4082"/>
-            <w:vAlign w:val="center"/>
-          </w:tcPr>
-          <w:p>
-            <w:pPr>
-              <w:pStyle w:val="TableText"/>
-              <w:jc w:val="left"/>
-            </w:pPr>
-            <w:r>
-              <w:rPr>
-                <w:sz w:val="20"/>
-              </w:rPr>
-              <w:t>3.1. Степень ответственности за результат собственной деятельности</w:t>
-            </w:r>
-          </w:p>
-        </w:tc>
-        <w:tc>
-          <w:tcPr>
-            <w:tcW w:type="dxa" w:w="4422"/>
-            <w:vAlign w:val="center"/>
-          </w:tcPr>
-          <w:p>
-            <w:pPr>
-              <w:pStyle w:val="TableText"/>
-              <w:jc w:val="left"/>
-            </w:pPr>
-            <w:r>
-              <w:rPr>
-                <w:sz w:val="20"/>
-              </w:rPr>
-              <w:t>За функциональное качество вспомогательных работ, ошибки исправляются с участием руководителя</w:t>
-            </w:r>
-          </w:p>
-        </w:tc>
-        <w:tc>
-          <w:tcPr>
-            <w:tcW w:type="dxa" w:w="850"/>
-            <w:vAlign w:val="center"/>
-          </w:tcPr>
-          <w:p>
-            <w:pPr>
-              <w:pStyle w:val="TableText"/>
-              <w:jc w:val="center"/>
-            </w:pPr>
-            <w:r>
-              <w:rPr>
-                <w:sz w:val="20"/>
-              </w:rPr>
-              <w:t>2</w:t>
-            </w:r>
-          </w:p>
-        </w:tc>
-      </w:tr>
-      <w:tr>
-        <w:trPr>
-          <w:cantSplit/>
-        </w:trPr>
-        <w:tc>
-          <w:tcPr>
-            <w:tcW w:type="dxa" w:w="4082"/>
-            <w:vAlign w:val="center"/>
-          </w:tcPr>
-          <w:p>
-            <w:pPr>
-              <w:pStyle w:val="TableText"/>
-              <w:jc w:val="left"/>
-            </w:pPr>
-            <w:r>
-              <w:rPr>
-                <w:sz w:val="20"/>
-              </w:rPr>
-              <w:t>3.2. Степень риска для собственной жизни</w:t>
-            </w:r>
-          </w:p>
-        </w:tc>
-        <w:tc>
-          <w:tcPr>
-            <w:tcW w:type="dxa" w:w="4422"/>
-            <w:vAlign w:val="center"/>
-          </w:tcPr>
-          <w:p>
-            <w:pPr>
-              <w:pStyle w:val="TableText"/>
-              <w:jc w:val="left"/>
-            </w:pPr>
-            <w:r>
-              <w:rPr>
-                <w:sz w:val="20"/>
-              </w:rPr>
-              <w:t>Исключена</w:t>
-            </w:r>
-          </w:p>
-        </w:tc>
-        <w:tc>
-          <w:tcPr>
-            <w:tcW w:type="dxa" w:w="850"/>
-            <w:vAlign w:val="center"/>
-          </w:tcPr>
-          <w:p>
-            <w:pPr>
-              <w:pStyle w:val="TableText"/>
-              <w:jc w:val="center"/>
-            </w:pPr>
-            <w:r>
-              <w:rPr>
-                <w:sz w:val="20"/>
-              </w:rPr>
-              <w:t>1</w:t>
-            </w:r>
-          </w:p>
-        </w:tc>
-      </w:tr>
-      <w:tr>
-        <w:trPr>
-          <w:cantSplit/>
-        </w:trPr>
-        <w:tc>
-          <w:tcPr>
-            <w:tcW w:type="dxa" w:w="4082"/>
-            <w:vAlign w:val="center"/>
-          </w:tcPr>
-          <w:p>
-            <w:pPr>
-              <w:pStyle w:val="TableText"/>
-              <w:jc w:val="left"/>
-            </w:pPr>
-            <w:r>
-              <w:rPr>
-                <w:sz w:val="20"/>
-              </w:rPr>
-              <w:t>3.3. Степень ответственности за безопасность других лиц</w:t>
-            </w:r>
-          </w:p>
-        </w:tc>
-        <w:tc>
-          <w:tcPr>
-            <w:tcW w:type="dxa" w:w="4422"/>
-            <w:vAlign w:val="center"/>
-          </w:tcPr>
-          <w:p>
-            <w:pPr>
-              <w:pStyle w:val="TableText"/>
-              <w:jc w:val="left"/>
-            </w:pPr>
-            <w:r>
-              <w:rPr>
-                <w:sz w:val="20"/>
-              </w:rPr>
-              <w:t>Исключена</w:t>
-            </w:r>
-          </w:p>
-        </w:tc>
-        <w:tc>
-          <w:tcPr>
-            <w:tcW w:type="dxa" w:w="850"/>
-            <w:vAlign w:val="center"/>
-          </w:tcPr>
-          <w:p>
-            <w:pPr>
-              <w:pStyle w:val="TableText"/>
-              <w:jc w:val="center"/>
-            </w:pPr>
-            <w:r>
-              <w:rPr>
-                <w:sz w:val="20"/>
-              </w:rPr>
-              <w:t>1</w:t>
-            </w:r>
-          </w:p>
-        </w:tc>
-      </w:tr>
-      <w:tr>
-        <w:trPr>
-          <w:cantSplit/>
-        </w:trPr>
-        <w:tc>
-          <w:tcPr>
-            <w:tcW w:type="dxa" w:w="4082"/>
-            <w:vAlign w:val="center"/>
-          </w:tcPr>
-          <w:p>
-            <w:pPr>
-              <w:pStyle w:val="TableText"/>
-              <w:jc w:val="left"/>
-            </w:pPr>
-            <w:r>
-              <w:rPr>
-                <w:sz w:val="20"/>
-              </w:rPr>
-              <w:t>3.4. Количество конфликтных ситуаций за смену</w:t>
-            </w:r>
-          </w:p>
-        </w:tc>
-        <w:tc>
-          <w:tcPr>
-            <w:tcW w:type="dxa" w:w="4422"/>
-            <w:vAlign w:val="center"/>
-          </w:tcPr>
-          <w:p>
-            <w:pPr>
-              <w:pStyle w:val="TableText"/>
-              <w:jc w:val="left"/>
-            </w:pPr>
-            <w:r>
-              <w:rPr>
-                <w:sz w:val="20"/>
-              </w:rPr>
-              <w:t>Отсутствуют</w:t>
-            </w:r>
-          </w:p>
-        </w:tc>
-        <w:tc>
-          <w:tcPr>
-            <w:tcW w:type="dxa" w:w="850"/>
-            <w:vAlign w:val="center"/>
-          </w:tcPr>
-          <w:p>
-            <w:pPr>
-              <w:pStyle w:val="TableText"/>
-              <w:jc w:val="center"/>
-            </w:pPr>
-            <w:r>
-              <w:rPr>
-                <w:sz w:val="20"/>
-              </w:rPr>
-              <w:t>1</w:t>
-            </w:r>
-          </w:p>
-        </w:tc>
-      </w:tr>
-      <w:tr>
-        <w:trPr>
-          <w:cantSplit/>
-        </w:trPr>
-        <w:tc>
-          <w:tcPr>
-            <w:tcW w:type="dxa" w:w="9354"/>
-            <w:gridSpan w:val="3"/>
-            <w:vAlign w:val="center"/>
-          </w:tcPr>
-          <w:p>
-            <w:pPr>
-              <w:pStyle w:val="TableText"/>
-              <w:jc w:val="left"/>
-            </w:pPr>
-            <w:r>
-              <w:rPr>
-                <w:b/>
-                <w:sz w:val="20"/>
-              </w:rPr>
-              <w:t>4. Монотонность нагрузок</w:t>
-            </w:r>
-          </w:p>
-        </w:tc>
-      </w:tr>
-      <w:tr>
-        <w:trPr>
-          <w:cantSplit/>
-        </w:trPr>
-        <w:tc>
-          <w:tcPr>
-            <w:tcW w:type="dxa" w:w="4082"/>
-            <w:vAlign w:val="center"/>
-          </w:tcPr>
-          <w:p>
-            <w:pPr>
-              <w:pStyle w:val="TableText"/>
-              <w:jc w:val="left"/>
-            </w:pPr>
-            <w:r>
-              <w:rPr>
-                <w:sz w:val="20"/>
-              </w:rPr>
-              <w:t>4.1. Число элементов, необходимых для реализации простого задания</w:t>
-            </w:r>
-          </w:p>
-        </w:tc>
-        <w:tc>
-          <w:tcPr>
-            <w:tcW w:type="dxa" w:w="4422"/>
-            <w:vAlign w:val="center"/>
-          </w:tcPr>
-          <w:p>
-            <w:pPr>
-              <w:pStyle w:val="TableText"/>
-              <w:jc w:val="left"/>
-            </w:pPr>
-            <w:r>
-              <w:rPr>
-                <w:sz w:val="20"/>
-              </w:rPr>
-              <w:t>Более 10</w:t>
-            </w:r>
-          </w:p>
-        </w:tc>
-        <w:tc>
-          <w:tcPr>
-            <w:tcW w:type="dxa" w:w="850"/>
-            <w:vAlign w:val="center"/>
-          </w:tcPr>
-          <w:p>
-            <w:pPr>
-              <w:pStyle w:val="TableText"/>
-              <w:jc w:val="center"/>
-            </w:pPr>
-            <w:r>
-              <w:rPr>
-                <w:sz w:val="20"/>
-              </w:rPr>
-              <w:t>1</w:t>
-            </w:r>
-          </w:p>
-        </w:tc>
-      </w:tr>
-      <w:tr>
-        <w:trPr>
-          <w:cantSplit/>
-        </w:trPr>
-        <w:tc>
-          <w:tcPr>
-            <w:tcW w:type="dxa" w:w="4082"/>
-            <w:vAlign w:val="center"/>
-          </w:tcPr>
-          <w:p>
-            <w:pPr>
-              <w:pStyle w:val="TableText"/>
-              <w:jc w:val="left"/>
-            </w:pPr>
-            <w:r>
-              <w:rPr>
-                <w:sz w:val="20"/>
-              </w:rPr>
-              <w:t>4.2. Продолжительность выполнения простых заданий, с</w:t>
-            </w:r>
-          </w:p>
-        </w:tc>
-        <w:tc>
-          <w:tcPr>
-            <w:tcW w:type="dxa" w:w="4422"/>
-            <w:vAlign w:val="center"/>
-          </w:tcPr>
-          <w:p>
-            <w:pPr>
-              <w:pStyle w:val="TableText"/>
-              <w:jc w:val="left"/>
-            </w:pPr>
-            <w:r>
-              <w:rPr>
-                <w:sz w:val="20"/>
-              </w:rPr>
-              <w:t>Более 100</w:t>
-            </w:r>
-          </w:p>
-        </w:tc>
-        <w:tc>
-          <w:tcPr>
-            <w:tcW w:type="dxa" w:w="850"/>
-            <w:vAlign w:val="center"/>
-          </w:tcPr>
-          <w:p>
-            <w:pPr>
-              <w:pStyle w:val="TableText"/>
-              <w:jc w:val="center"/>
-            </w:pPr>
-            <w:r>
-              <w:rPr>
-                <w:sz w:val="20"/>
-              </w:rPr>
-              <w:t>1</w:t>
-            </w:r>
-          </w:p>
-        </w:tc>
-      </w:tr>
-      <w:tr>
-        <w:trPr>
-          <w:cantSplit/>
-        </w:trPr>
-        <w:tc>
-          <w:tcPr>
-            <w:tcW w:type="dxa" w:w="4082"/>
-            <w:vAlign w:val="center"/>
-          </w:tcPr>
-          <w:p>
-            <w:pPr>
-              <w:pStyle w:val="TableText"/>
-              <w:jc w:val="left"/>
-            </w:pPr>
-            <w:r>
-              <w:rPr>
-                <w:sz w:val="20"/>
-              </w:rPr>
-              <w:t>4.3. Время активных действий, % времени смены</w:t>
-            </w:r>
-          </w:p>
-        </w:tc>
-        <w:tc>
-          <w:tcPr>
-            <w:tcW w:type="dxa" w:w="4422"/>
-            <w:vAlign w:val="center"/>
-          </w:tcPr>
-          <w:p>
-            <w:pPr>
-              <w:pStyle w:val="TableText"/>
-              <w:jc w:val="left"/>
-            </w:pPr>
-            <w:r>
-              <w:rPr>
-                <w:sz w:val="20"/>
-              </w:rPr>
-              <w:t>20 и более</w:t>
-            </w:r>
-          </w:p>
-        </w:tc>
-        <w:tc>
-          <w:tcPr>
-            <w:tcW w:type="dxa" w:w="850"/>
-            <w:vAlign w:val="center"/>
-          </w:tcPr>
-          <w:p>
-            <w:pPr>
-              <w:pStyle w:val="TableText"/>
-              <w:jc w:val="center"/>
-            </w:pPr>
-            <w:r>
-              <w:rPr>
-                <w:sz w:val="20"/>
-              </w:rPr>
-              <w:t>1</w:t>
-            </w:r>
-          </w:p>
-        </w:tc>
-      </w:tr>
-      <w:tr>
-        <w:trPr>
-          <w:cantSplit/>
-        </w:trPr>
-        <w:tc>
-          <w:tcPr>
-            <w:tcW w:type="dxa" w:w="4082"/>
-            <w:vAlign w:val="center"/>
-          </w:tcPr>
-          <w:p>
-            <w:pPr>
-              <w:pStyle w:val="TableText"/>
-              <w:jc w:val="left"/>
-            </w:pPr>
-            <w:r>
-              <w:rPr>
-                <w:sz w:val="20"/>
-              </w:rPr>
-              <w:t>4.4. Монотонность производственной обстановки, % времени смены</w:t>
-            </w:r>
-          </w:p>
-        </w:tc>
-        <w:tc>
-          <w:tcPr>
-            <w:tcW w:type="dxa" w:w="4422"/>
-            <w:vAlign w:val="center"/>
-          </w:tcPr>
-          <w:p>
-            <w:pPr>
-              <w:pStyle w:val="TableText"/>
-              <w:jc w:val="left"/>
-            </w:pPr>
-            <w:r>
-              <w:rPr>
-                <w:sz w:val="20"/>
-              </w:rPr>
-              <w:t>Менее 75</w:t>
-            </w:r>
-          </w:p>
-        </w:tc>
-        <w:tc>
-          <w:tcPr>
-            <w:tcW w:type="dxa" w:w="850"/>
-            <w:vAlign w:val="center"/>
-          </w:tcPr>
-          <w:p>
-            <w:pPr>
-              <w:pStyle w:val="TableText"/>
-              <w:jc w:val="center"/>
-            </w:pPr>
-            <w:r>
-              <w:rPr>
-                <w:sz w:val="20"/>
-              </w:rPr>
-              <w:t>1</w:t>
-            </w:r>
-          </w:p>
-        </w:tc>
-      </w:tr>
-      <w:tr>
-        <w:trPr>
-          <w:cantSplit/>
-        </w:trPr>
-        <w:tc>
-          <w:tcPr>
-            <w:tcW w:type="dxa" w:w="9354"/>
-            <w:gridSpan w:val="3"/>
-            <w:vAlign w:val="center"/>
-          </w:tcPr>
-          <w:p>
-            <w:pPr>
-              <w:pStyle w:val="TableText"/>
-              <w:jc w:val="left"/>
-            </w:pPr>
-            <w:r>
-              <w:rPr>
-                <w:b/>
-                <w:sz w:val="20"/>
-              </w:rPr>
-              <w:t>5. Режим работы</w:t>
-            </w:r>
-          </w:p>
-        </w:tc>
-      </w:tr>
-      <w:tr>
-        <w:trPr>
-          <w:cantSplit/>
-        </w:trPr>
-        <w:tc>
-          <w:tcPr>
-            <w:tcW w:type="dxa" w:w="4082"/>
-            <w:vAlign w:val="center"/>
-          </w:tcPr>
-          <w:p>
-            <w:pPr>
-              <w:pStyle w:val="TableText"/>
-              <w:jc w:val="left"/>
-            </w:pPr>
-            <w:r>
-              <w:rPr>
-                <w:sz w:val="20"/>
-              </w:rPr>
-              <w:t>5.1. Фактическая продолжительность рабочего дня</w:t>
-            </w:r>
-          </w:p>
-        </w:tc>
-        <w:tc>
-          <w:tcPr>
-            <w:tcW w:type="dxa" w:w="4422"/>
-            <w:vAlign w:val="center"/>
-          </w:tcPr>
-          <w:p>
-            <w:pPr>
-              <w:pStyle w:val="TableText"/>
-              <w:jc w:val="left"/>
-            </w:pPr>
-            <w:r>
-              <w:rPr>
-                <w:sz w:val="20"/>
-              </w:rPr>
-              <w:t>8–9 ч</w:t>
-            </w:r>
-          </w:p>
-        </w:tc>
-        <w:tc>
-          <w:tcPr>
-            <w:tcW w:type="dxa" w:w="850"/>
-            <w:vAlign w:val="center"/>
-          </w:tcPr>
-          <w:p>
-            <w:pPr>
-              <w:pStyle w:val="TableText"/>
-              <w:jc w:val="center"/>
-            </w:pPr>
-            <w:r>
-              <w:rPr>
-                <w:sz w:val="20"/>
-              </w:rPr>
-              <w:t>2</w:t>
-            </w:r>
-          </w:p>
-        </w:tc>
-      </w:tr>
-      <w:tr>
-        <w:trPr>
-          <w:cantSplit/>
-        </w:trPr>
-        <w:tc>
-          <w:tcPr>
-            <w:tcW w:type="dxa" w:w="4082"/>
-            <w:vAlign w:val="center"/>
-          </w:tcPr>
-          <w:p>
-            <w:pPr>
-              <w:pStyle w:val="TableText"/>
-              <w:jc w:val="left"/>
-            </w:pPr>
-            <w:r>
-              <w:rPr>
-                <w:sz w:val="20"/>
-              </w:rPr>
-              <w:t>5.2. Сменность работы</w:t>
-            </w:r>
-          </w:p>
-        </w:tc>
-        <w:tc>
-          <w:tcPr>
-            <w:tcW w:type="dxa" w:w="4422"/>
-            <w:vAlign w:val="center"/>
-          </w:tcPr>
-          <w:p>
-            <w:pPr>
-              <w:pStyle w:val="TableText"/>
-              <w:jc w:val="left"/>
-            </w:pPr>
-            <w:r>
-              <w:rPr>
-                <w:sz w:val="20"/>
-              </w:rPr>
-              <w:t>Односменная работа без ночной смены</w:t>
-            </w:r>
-          </w:p>
-        </w:tc>
-        <w:tc>
-          <w:tcPr>
-            <w:tcW w:type="dxa" w:w="850"/>
-            <w:vAlign w:val="center"/>
-          </w:tcPr>
-          <w:p>
-            <w:pPr>
-              <w:pStyle w:val="TableText"/>
-              <w:jc w:val="center"/>
-            </w:pPr>
-            <w:r>
-              <w:rPr>
-                <w:sz w:val="20"/>
-              </w:rPr>
-              <w:t>1</w:t>
-            </w:r>
-          </w:p>
-        </w:tc>
-      </w:tr>
-      <w:tr>
-        <w:trPr>
-          <w:cantSplit/>
-        </w:trPr>
-        <w:tc>
-          <w:tcPr>
-            <w:tcW w:type="dxa" w:w="4082"/>
-            <w:vAlign w:val="center"/>
-          </w:tcPr>
-          <w:p>
-            <w:pPr>
-              <w:pStyle w:val="TableText"/>
-              <w:jc w:val="left"/>
-            </w:pPr>
-            <w:r>
-              <w:rPr>
-                <w:sz w:val="20"/>
-              </w:rPr>
-              <w:t>5.3. Наличие регламентированных перерывов и их продолжительность</w:t>
-            </w:r>
-          </w:p>
-        </w:tc>
-        <w:tc>
-          <w:tcPr>
-            <w:tcW w:type="dxa" w:w="4422"/>
-            <w:vAlign w:val="center"/>
-          </w:tcPr>
-          <w:p>
-            <w:pPr>
-              <w:pStyle w:val="TableText"/>
-              <w:jc w:val="left"/>
-            </w:pPr>
-            <w:r>
-              <w:rPr>
-                <w:sz w:val="20"/>
-              </w:rPr>
-              <w:t>Перерывы регламентированы, 7 % и более рабочего времени</w:t>
-            </w:r>
-          </w:p>
-        </w:tc>
-        <w:tc>
-          <w:tcPr>
-            <w:tcW w:type="dxa" w:w="850"/>
-            <w:vAlign w:val="center"/>
-          </w:tcPr>
-          <w:p>
-            <w:pPr>
-              <w:pStyle w:val="TableText"/>
-              <w:jc w:val="center"/>
-            </w:pPr>
-            <w:r>
-              <w:rPr>
-                <w:sz w:val="20"/>
-              </w:rPr>
-              <w:t>1</w:t>
-            </w:r>
-          </w:p>
-        </w:tc>
-      </w:tr>
-      <w:tr>
-        <w:trPr>
-          <w:cantSplit/>
-        </w:trPr>
-        <w:tc>
-          <w:tcPr>
-            <w:tcW w:type="dxa" w:w="9354"/>
-            <w:gridSpan w:val="3"/>
-            <w:vAlign w:val="center"/>
-          </w:tcPr>
-          <w:p>
-            <w:pPr>
-              <w:pStyle w:val="TableText"/>
-              <w:jc w:val="left"/>
-            </w:pPr>
-            <w:r>
-              <w:rPr>
-                <w:sz w:val="20"/>
-              </w:rPr>
-              <w:t>Число показателей: класс 1 – 14, класс 2 – 6, класс 3.1 – 2, класс 3.2 – 1</w:t>
-            </w:r>
-          </w:p>
-        </w:tc>
-      </w:tr>
-      <w:tr>
-        <w:trPr>
-          <w:cantSplit/>
-        </w:trPr>
-        <w:tc>
-          <w:tcPr>
-            <w:tcW w:type="dxa" w:w="8504"/>
-            <w:gridSpan w:val="2"/>
-            <w:vAlign w:val="center"/>
-          </w:tcPr>
-          <w:p>
-            <w:pPr>
-              <w:pStyle w:val="TableText"/>
-              <w:jc w:val="left"/>
-            </w:pPr>
-            <w:r>
-              <w:rPr>
-                <w:b/>
-                <w:sz w:val="20"/>
-              </w:rPr>
-              <w:t>Итоговая оценка напряжённости трудового процесса</w:t>
-            </w:r>
-          </w:p>
-        </w:tc>
-        <w:tc>
-          <w:tcPr>
-            <w:tcW w:type="dxa" w:w="850"/>
-            <w:vAlign w:val="center"/>
-          </w:tcPr>
-          <w:p>
-            <w:pPr>
-              <w:pStyle w:val="TableText"/>
-              <w:jc w:val="center"/>
-            </w:pPr>
-            <w:r>
-              <w:rPr>
-                <w:b/>
-                <w:sz w:val="20"/>
-              </w:rPr>
-              <w:t>2</w:t>
+                <w:sz w:val="22"/>
+              </w:rPr>
+              <w:t>10–15 (ожидание прошивки плат и окончания опытов)</w:t>
+            </w:r>
+          </w:p>
+        </w:tc>
+        <w:tc>
+          <w:tcPr>
+            <w:tcW w:type="dxa" w:w="1871"/>
+            <w:vAlign w:val="center"/>
+          </w:tcPr>
+          <w:p>
+            <w:pPr>
+              <w:pStyle w:val="TableText"/>
+              <w:jc w:val="center"/>
+            </w:pPr>
+            <w:r>
+              <w:rPr>
+                <w:sz w:val="22"/>
+              </w:rPr>
+              <w:t>1 (менее 75)</w:t>
             </w:r>
           </w:p>
         </w:tc>
@@ -9268,7 +8089,7 @@
     </w:p>
     <w:p>
       <w:r>
-        <w:t>Из 23 показателей 3 выше класса 2, и это свойства самой исследовательской работы: содержание работы творческое – решения ищутся без готового алгоритма (класс 3.2); измеренные значения постоянно сопоставляются с расчётными и нормативными (класс 3.1); с экраном монитора работа идёт до 6 ч за смену (класс 3.1). По правилу Р 2.2.2006-05 напряжённость признаётся допустимой, если таких показателей не больше пяти, а остальные относятся к классам 1 и 2 [68]. Напряжённость трудового процесса – класс 2 (допустимый). Для снижения утомления через каждый час работы с ПЭВМ делаются перерывы 10–15 мин с упражнениями для глаз и разминкой.</w:t>
+        <w:t>Все показатели соответствуют классу 1, поэтому напряжённость трудового процесса – класс 1 (оптимальный). Для снижения утомления через каждый час работы с ПЭВМ делаются перерывы 10–15 мин с упражнениями для глаз и разминкой.</w:t>
       </w:r>
     </w:p>
     <w:p>
@@ -9276,12 +8097,12 @@
         <w:pStyle w:val="Heading3"/>
       </w:pPr>
       <w:r>
-        <w:t>5.2.7 Класс условий труда</w:t>
+        <w:t>5.1.7 Класс условий труда</w:t>
       </w:r>
     </w:p>
     <w:p>
       <w:r>
-        <w:t>Итоговый класс условий труда равен наивысшему из классов по отдельным факторам [53]. Результаты приведены в таблице 5.10.</w:t>
+        <w:t>Итоговый класс условий труда равен наивысшему из классов по отдельным факторам [3]. Результаты приведены в таблице 5.10.</w:t>
       </w:r>
     </w:p>
     <w:p>
@@ -9516,7 +8337,7 @@
               <w:rPr>
                 <w:sz w:val="22"/>
               </w:rPr>
-              <w:t>287 лк к концу срока службы (новые светильники – около 430 лк) [5.2.3]</w:t>
+              <w:t>323 лк (новые светильники – около 480 лк) [5.1.3]</w:t>
             </w:r>
           </w:p>
         </w:tc>
@@ -9535,7 +8356,7 @@
               <w:rPr>
                 <w:sz w:val="22"/>
               </w:rPr>
-              <w:t>300 лк, допуск −10…+20 %</w:t>
+              <w:t>не менее 300 лк</w:t>
             </w:r>
           </w:p>
         </w:tc>
@@ -9597,7 +8418,7 @@
               <w:rPr>
                 <w:sz w:val="22"/>
               </w:rPr>
-              <w:t>46,7 дБА [5.2.4]</w:t>
+              <w:t>46,7 дБА [5.1.4]</w:t>
             </w:r>
           </w:p>
         </w:tc>
@@ -9678,7 +8499,7 @@
               <w:rPr>
                 <w:sz w:val="22"/>
               </w:rPr>
-              <w:t>51,2 (мкВт/см²)·ч [5.2.5]</w:t>
+              <w:t>51,2 (мкВт/см²)·ч [5.1.5]</w:t>
             </w:r>
           </w:p>
         </w:tc>
@@ -9840,7 +8661,7 @@
               <w:rPr>
                 <w:sz w:val="22"/>
               </w:rPr>
-              <w:t>3 показателя из 23 – класс 3.1–3.2, остальные – классы 1 и 2 (таблица 5.9)</w:t>
+              <w:t>Все 6 показателей – класс 1 (таблица 5.9)</w:t>
             </w:r>
           </w:p>
         </w:tc>
@@ -9859,7 +8680,7 @@
               <w:rPr>
                 <w:sz w:val="22"/>
               </w:rPr>
-              <w:t>Класс 2 – не более 5 показателей класса 3.1–3.2 при остальных классах 1 и 2</w:t>
+              <w:t>Итоговый класс – наибольший из классов по показателям</w:t>
             </w:r>
           </w:p>
         </w:tc>
@@ -9878,7 +8699,7 @@
               <w:rPr>
                 <w:sz w:val="22"/>
               </w:rPr>
-              <w:t>2</w:t>
+              <w:t>1</w:t>
             </w:r>
           </w:p>
         </w:tc>
@@ -9943,12 +8764,12 @@
         <w:pStyle w:val="Heading2"/>
       </w:pPr>
       <w:r>
-        <w:t>5.3 Оценка условий труда по эргономическим параметрам</w:t>
+        <w:t>5.2 Оценка условий труда по эргономическим параметрам</w:t>
       </w:r>
     </w:p>
     <w:p>
       <w:r>
-        <w:t>Конструкция рабочего места и взаимное расположение его элементов должны соответствовать антропометрическим, физиологическим и психологическим требованиям [69, 70]. Компоновка рабочего места специалиста показана на рисунке 5.2: верхний край экрана находится ниже уровня глаз, линия взгляда на центр экрана наклонена к горизонтали на 20°, руки при работе с клавиатурой согнуты в локтях под углом, близким к прямому, стопы стоят на полу.</w:t>
+        <w:t>Конструкция рабочего места и взаимное расположение его элементов должны соответствовать антропометрическим, физиологическим и психологическим требованиям [22, 23]. Компоновка рабочего места специалиста показана на рисунке 5.2: верхний край экрана находится ниже уровня глаз, линия взгляда на центр экрана наклонена к горизонтали на 20°, руки при работе с клавиатурой согнуты в локтях под углом, близким к прямому, стопы стоят на полу.</w:t>
       </w:r>
     </w:p>
     <w:p>
@@ -10003,7 +8824,7 @@
     </w:p>
     <w:p>
       <w:r>
-        <w:t>Органы управления и предметы труда размещаются в пределах зон досягаемости моторного поля [69], показанных на рисунке 5.3: в зоне А (оптимальной) находятся клавиатура и мышь, которыми пользуются постоянно, в зоне Б (лёгкой досягаемости) – документы, в зоне В (досягаемости вытянутой рукой) – редко используемые предметы. Монитор стоит за пределами зон досягаемости, на расстоянии наблюдения.</w:t>
+        <w:t>Органы управления и предметы труда размещаются в пределах зон досягаемости моторного поля [22], показанных на рисунке 5.3: в зоне А (оптимальной) находятся клавиатура и мышь, которыми пользуются постоянно, в зоне Б (лёгкой досягаемости) – документы, в зоне В (досягаемости вытянутой рукой) – редко используемые предметы. Монитор стоит за пределами зон досягаемости, на расстоянии наблюдения.</w:t>
       </w:r>
     </w:p>
     <w:p>
@@ -10058,7 +8879,7 @@
     </w:p>
     <w:p>
       <w:r>
-        <w:t>Параметры рабочего места и видеотерминала сопоставлены с нормативными в таблице 5.11 [70, 71, 72].</w:t>
+        <w:t>Параметры рабочего места и видеотерминала сопоставлены с нормативными в таблице 5.11 [23, 24, 25].</w:t>
       </w:r>
     </w:p>
     <w:p>
@@ -11185,17 +10006,17 @@
         <w:pStyle w:val="Heading2"/>
       </w:pPr>
       <w:r>
-        <w:t>5.4 Оценка помещения по электроопасности</w:t>
+        <w:t>5.3 Оценка помещения по электроопасности</w:t>
       </w:r>
     </w:p>
     <w:p>
       <w:r>
-        <w:t>По опасности поражения электрическим током помещения делятся на помещения без повышенной опасности, с повышенной опасностью и особо опасные [73]. Относительная влажность воздуха в кабинете – 40–50 % (таблица 5.4), то есть не более 60 %, поэтому по ПУЭ помещение сухое; температура нормальная, токопроводящая пыль отсутствует, пол – ламинат – не проводит ток. Металлические радиаторы отопления, соединённые с землёй, закрыты декоративными экранами, поэтому одновременное прикосновение к радиатору и корпусу ПЭВМ исключено. Кабинет относится к помещениям без повышенной опасности.</w:t>
+        <w:t>По опасности поражения электрическим током помещения делятся на помещения без повышенной опасности, с повышенной опасностью и особо опасные [26]. Относительная влажность воздуха в кабинете – 40–50 % (таблица 5.4), то есть не более 60 %, поэтому по ПУЭ помещение сухое; температура нормальная, токопроводящая пыль отсутствует, пол – ламинат – не проводит ток. Металлические радиаторы отопления, соединённые с землёй, закрыты декоративными экранами, поэтому одновременное прикосновение к радиатору и корпусу ПЭВМ исключено. Кабинет относится к помещениям без повышенной опасности.</w:t>
       </w:r>
     </w:p>
     <w:p>
       <w:r>
-        <w:t>Предельно допустимые значения напряжения прикосновения и тока при нормальном режиме электроустановки переменного тока 50 Гц составляют 2 В и 0,3 мА, при аварийном режиме – зависят от продолжительности воздействия тока и приведены в таблице 5.12 [74].</w:t>
+        <w:t>Предельно допустимые значения напряжения прикосновения и тока при нормальном режиме электроустановки переменного тока 50 Гц составляют 2 В и 0,3 мА, при аварийном режиме – зависят от продолжительности воздействия тока и приведены в таблице 5.12 [27].</w:t>
       </w:r>
     </w:p>
     <w:p>
@@ -12114,7 +10935,7 @@
     </w:p>
     <w:p>
       <w:r>
-        <w:t>Для защиты от поражения током [75, 76]:</w:t>
+        <w:t>Для защиты от поражения током [28, 29]:</w:t>
       </w:r>
     </w:p>
     <w:p>
@@ -12151,7 +10972,7 @@
     </w:p>
     <w:p>
       <w:r>
-        <w:t>Статическое электричество. Синтетическая обивка кресел способствует накоплению зарядов на теле человека; разряды неприятны и могут повредить электронику. Напряжённость электростатического поля на рабочем месте при воздействии в течение всей смены не должна превышать 20 кВ/м, а на поверхности полимерных материалов в общественных зданиях – 15 кВ/м при относительной влажности 30–60 % [57]. Электризацию ограничивают оптимальная влажность воздуха (40–50 %) и заземление корпусов ПЭВМ через розетки с заземляющим контактом.</w:t>
+        <w:t>Статическое электричество. Синтетическая обивка кресел способствует накоплению зарядов на теле человека; разряды неприятны и могут повредить электронику. Напряжённость электростатического поля на рабочем месте при воздействии в течение всей смены не должна превышать 20 кВ/м, а на поверхности полимерных материалов в общественных зданиях – 15 кВ/м при относительной влажности 30–60 % [7]. Электризацию ограничивают оптимальная влажность воздуха (40–50 %) и заземление корпусов ПЭВМ через розетки с заземляющим контактом.</w:t>
       </w:r>
     </w:p>
     <w:p>
@@ -12159,7 +10980,7 @@
         <w:pStyle w:val="Heading2"/>
       </w:pPr>
       <w:r>
-        <w:t>5.5 Классификация помещения по пожароопасности</w:t>
+        <w:t>5.4 Классификация помещения по пожароопасности</w:t>
       </w:r>
     </w:p>
     <w:p>
@@ -12169,7 +10990,7 @@
     </w:p>
     <w:p>
       <w:r>
-        <w:t>Кабинет предназначен для научно-исследовательской работы на ПЭВМ и расположен в офисном здании. Здания научных и проектно-конструкторских организаций, контор и офисов по классу функциональной пожарной опасности относятся к Ф4.3 [77]. Категории по взрывопожарной и пожарной опасности (А, Б, В1–В4, Г, Д) установлены только для помещений производственного и складского назначения: так их определяют статья 27 Технического регламента о требованиях пожарной безопасности [77] и пункт 1.1 СП 12.13130.2009, задающего методику их расчёта [78]. Кабинет – помещение офисного здания, к производственным и складским не относится, поэтому категория для него не определяется. Класс Ф4.3 определяет требования к зданию – к эвакуационным путям и выходам, системам оповещения и пожарной сигнализации [77]; при эксплуатации кабинета действуют Правила противопожарного режима [79], из которых следуют мероприятия:</w:t>
+        <w:t>Кабинет предназначен для научно-исследовательской работы на ПЭВМ и расположен в офисном здании. Здания научных и проектно-конструкторских организаций, контор и офисов по классу функциональной пожарной опасности относятся к Ф4.3 [30]. Категории по взрывопожарной и пожарной опасности (А, Б, В1–В4, Г, Д) установлены только для помещений производственного и складского назначения: так их определяют статья 27 Технического регламента о требованиях пожарной безопасности [30] и пункт 1.1 СП 12.13130.2009, задающего методику их расчёта [31]. Кабинет – помещение офисного здания, к производственным и складским не относится, поэтому категория для него не определяется. Класс Ф4.3 определяет требования к зданию – к эвакуационным путям и выходам, системам оповещения и пожарной сигнализации [30]; при эксплуатации кабинета действуют Правила противопожарного режима [32], из которых следуют мероприятия:</w:t>
       </w:r>
     </w:p>
     <w:p>
@@ -12177,7 +10998,15 @@
         <w:t xml:space="preserve">– </w:t>
       </w:r>
       <w:r>
-        <w:t>в верхнем правом углу прихожей, у выхода, установлен углекислотный огнетушитель ОУ-2, пригодный для тушения электрооборудования под напряжением до 1000 В; углекислотный огнетушитель не портит электронику [80];</w:t>
+        <w:t>электрооборудование поддерживается в исправном состоянии, линии защищены от перегрузки и короткого замыкания;</w:t>
+      </w:r>
+    </w:p>
+    <w:p>
+      <w:r>
+        <w:t xml:space="preserve">– </w:t>
+      </w:r>
+      <w:r>
+        <w:t>в верхнем правом углу прихожей, у выхода, установлен углекислотный огнетушитель ОУ-2, пригодный для тушения электрооборудования под напряжением до 1000 В; углекислотный огнетушитель не портит электронику [33];</w:t>
       </w:r>
     </w:p>
     <w:p>
@@ -12209,7 +11038,7 @@
         <w:t xml:space="preserve">– </w:t>
       </w:r>
       <w:r>
-        <w:t>ширина выхода из помещения 0,9 м, полотно двери открывается внутрь и не перекрывает пути движения в прихожей; направление открывания дверей не нормируется для помещений с одновременным пребыванием не более 15 человек, кроме помещений категорий А и Б [81], а в кабинете одновременно находятся не более 6 человек.</w:t>
+        <w:t>ширина выхода из помещения 0,9 м, полотно двери открывается внутрь и не перекрывает пути движения в прихожей; направление открывания дверей не нормируется для помещений с одновременным пребыванием не более 15 человек, кроме помещений категорий А и Б [34], а в кабинете одновременно находятся не более 6 человек.</w:t>
       </w:r>
     </w:p>
     <w:p>
@@ -12217,12 +11046,12 @@
         <w:pStyle w:val="Heading2"/>
       </w:pPr>
       <w:r>
-        <w:t>5.6 Расчёт искусственного освещения</w:t>
+        <w:t>5.5 Расчёт искусственного освещения</w:t>
       </w:r>
     </w:p>
     <w:p>
       <w:r>
-        <w:t>Индивидуальное задание – расчёт общего искусственного освещения кабинета. Расчёт выполняется методом коэффициента использования светового потока, который применяется для равномерно освещённых горизонтальных поверхностей [59, 60]. Нормируемая освещённость – 300 лк (раздел 5.2.3); для кабинетов и офисов она нормируется на горизонтальной рабочей поверхности на высоте 0,8 м от пола [57].</w:t>
+        <w:t>Индивидуальное задание – расчёт общего искусственного освещения кабинета. Расчёт выполняется методом коэффициента использования светового потока, который применяется для равномерно освещённых горизонтальных поверхностей [10, 11]. Нормируемая освещённость – 300 лк (раздел 5.1.3); для кабинетов и офисов она нормируется на горизонтальной рабочей поверхности на высоте 0,8 м от пола [7].</w:t>
       </w:r>
     </w:p>
     <w:p>
@@ -12707,7 +11536,7 @@
     </w:p>
     <w:p>
       <w:r>
-        <w:t>Коэффициенты отражения потолка, стен и пола (ламинат) – 70, 50 и 30 %. Коэффициент запаса для административно-конструкторских помещений Kз = 1,5, коэффициент неравномерности освещённости z = 1,1 [60].</w:t>
+        <w:t>Коэффициенты отражения потолка, стен и пола (ламинат) – 70, 50 и 30 %. Коэффициент запаса для административно-конструкторских помещений Kз = 1,5, коэффициент неравномерности освещённости z = 1,1 [11].</w:t>
       </w:r>
     </w:p>
     <w:p>
@@ -12715,7 +11544,7 @@
         <w:keepNext/>
       </w:pPr>
       <w:r>
-        <w:t>В кабинете установлены светильники – встраиваемые светодиодные панели 595 × 595 мм для потолка «Армстронг». По паспортным данным панели того же типа: мощность 48 Вт, световой поток 4 800 лм, коэффициент пульсации менее 1 %, цветовая температура 4000 К, матовый (опаловый) рассеиватель [61]. Светильник с матовым рассеивателем светит по косинусному закону – тип кривой силы света Д [60]. В таблице коэффициентов использования косинусная кривая представлена двумя вариантами, Д-1 и Д-2. Принят Д-1, у которого коэффициент использования меньше (при i = 1,25 – 58 % против 68 %). Коэффициент использования светового потока зависит от типа кривой силы света, индекса помещения и коэффициентов отражения; для светильников с типовыми кривыми он приведён в таблице 5.13 [60, 82].</w:t>
+        <w:t>В кабинете установлены светильники – встраиваемые светодиодные панели 595 × 595 мм для потолка «Армстронг». По паспортным данным панели того же типа: мощность 48 Вт, световой поток 4 800 лм, коэффициент пульсации менее 1 %, цветовая температура 4000 К, матовый (опаловый) рассеиватель [12]. Светильник с матовым рассеивателем светит по косинусному закону – тип кривой силы света Д [11]. В таблице коэффициентов использования косинусная кривая представлена двумя вариантами, Д-1 и Д-2. Принят Д-1, у которого коэффициент использования меньше (при i = 1,25 – 58 % против 68 %). Коэффициент использования светового потока зависит от типа кривой силы света, индекса помещения и коэффициентов отражения; для светильников с типовыми кривыми он приведён в таблице 5.13 [11, 35].</w:t>
       </w:r>
     </w:p>
     <w:p>
@@ -14965,7 +13794,7 @@
         <w:keepNext/>
       </w:pPr>
       <w:r>
-        <w:t>Принимаются 8 светильников, по 4 в 2 рядах. Требуемый поток одного светильника при этом числе – ФΣ / N = 40 150 / 8 = 5 019 лм. Отклонение номинального потока выбранного светильника от требуемого:</w:t>
+        <w:t>Число светильников округляется в большую сторону: принимаются 9 светильников. Требуемый поток одного светильника при этом числе – ФΣ / N = 40 150 / 9 = 4 461 лм. Отклонение номинального потока выбранного светильника от требуемого:</w:t>
       </w:r>
     </w:p>
     <w:p>
@@ -15049,7 +13878,7 @@
               <w:rPr>
                 <w:rFonts w:ascii="Cambria Math" w:hAnsi="Cambria Math"/>
               </w:rPr>
-              <m:t xml:space="preserve">4 800 - 5 019</m:t>
+              <m:t xml:space="preserve">4 800 - 4 461</m:t>
             </m:r>
           </m:num>
           <m:den>
@@ -15060,7 +13889,7 @@
               <w:rPr>
                 <w:rFonts w:ascii="Cambria Math" w:hAnsi="Cambria Math"/>
               </w:rPr>
-              <m:t xml:space="preserve">5 019</m:t>
+              <m:t xml:space="preserve">4 461</m:t>
             </m:r>
           </m:den>
         </m:f>
@@ -15071,18 +13900,18 @@
           <w:rPr>
             <w:rFonts w:ascii="Cambria Math" w:hAnsi="Cambria Math"/>
           </w:rPr>
-          <m:t xml:space="preserve">·100 = -4,4 %.</m:t>
+          <m:t xml:space="preserve">·100 = +7,6 %.</m:t>
         </m:r>
       </m:oMath>
     </w:p>
     <w:p>
       <w:r>
-        <w:t>Методические указания допускают отклонение потока от требуемого в пределах −10…+20 % [60], поэтому принятое число светильников обеспечивает нормируемую освещённость.</w:t>
+        <w:t>Методические указания допускают отклонение потока от требуемого в пределах −10…+20 % [11], поэтому принятое число светильников обеспечивает нормируемую освещённость.</w:t>
       </w:r>
     </w:p>
     <w:p>
       <w:r>
-        <w:t>Принятое число совпадает с числом установленных светильников. Они расположены в 2 ряда по 4 вдоль длинной стороны помещения (рисунок 5.4). Расстояние между рядами L = 2,50 м, от крайних рядов до стен l = 1,25 м; в ряду светильники стоят через 2,33 м.</w:t>
+        <w:t>Светильники размещаются в 2 ряда по 4 вдоль длинной стороны основной части помещения и один – в прихожей над дверью (рисунок 5.4). Расстояние между рядами L = 2,50 м, от крайних рядов до стен l = 1,25 м; в ряду светильники стоят через 2,33 м.</w:t>
       </w:r>
     </w:p>
     <w:p>
@@ -15140,7 +13969,7 @@
         <w:keepNext/>
       </w:pPr>
       <w:r>
-        <w:t>Освещённость, создаваемая установленными светильниками на рабочей поверхности:</w:t>
+        <w:t>Освещённость, создаваемая принятыми светильниками на рабочей поверхности:</w:t>
       </w:r>
     </w:p>
     <w:tbl>
@@ -15327,7 +14156,7 @@
                     <w:rPr>
                       <w:rFonts w:ascii="Cambria Math" w:hAnsi="Cambria Math"/>
                     </w:rPr>
-                    <m:t xml:space="preserve">8·4 800·0,63</m:t>
+                    <m:t xml:space="preserve">9·4 800·0,63</m:t>
                   </m:r>
                 </m:num>
                 <m:den>
@@ -15349,7 +14178,7 @@
                 <w:rPr>
                   <w:rFonts w:ascii="Cambria Math" w:hAnsi="Cambria Math"/>
                 </w:rPr>
-                <m:t xml:space="preserve"> = 287 лк.</m:t>
+                <m:t xml:space="preserve"> = 323 лк.</m:t>
               </m:r>
             </m:oMath>
           </w:p>
@@ -15458,13 +14287,13 @@
           <w:rPr>
             <w:rFonts w:ascii="Cambria Math" w:hAnsi="Cambria Math"/>
           </w:rPr>
-          <m:t xml:space="preserve"> = 8·48 = 384 Вт,</m:t>
+          <m:t xml:space="preserve"> = 9·48 = 432 Вт,</m:t>
         </m:r>
       </m:oMath>
     </w:p>
     <w:p>
       <w:r>
-        <w:t>удельная мощность – 7,5 Вт/м². Освещённость 287 лк – наименьшая, к концу срока службы светильников: коэффициент запаса учитывает снижение их потока и загрязнение; новые панели дают около 430 лк. Отклонение расчётной освещённости от нормы 300 лк (−4,3 %) – в пределах допуска −10…+20 % [60], пульсация светодиодных панелей менее 1 % при норме не более 5 %, матовый рассеиватель ограничивает блёскость. Установленное общее освещение соответствует нормам, условия труда по световой среде – допустимые (класс 2). При замене панелей выбираются светильники с индексом цветопередачи не менее 85, который установлен для общего искусственного освещения [57].</w:t>
+        <w:t>удельная мощность – 8,5 Вт/м². Освещённость 323 лк получена с коэффициентом запаса, то есть к концу срока службы светильников, и не ниже нормы 300 лк; новые панели дают около 480 лк. Пульсация панелей – менее 1 % при норме не более 5 %, матовый рассеиватель ограничивает блёскость. При замене панелей выбираются светильники с индексом цветопередачи не менее 85, который установлен для общего искусственного освещения [7].</w:t>
       </w:r>
     </w:p>
     <w:p>
@@ -15472,7 +14301,7 @@
         <w:pStyle w:val="Heading2"/>
       </w:pPr>
       <w:r>
-        <w:t>5.7 Выводы</w:t>
+        <w:t>5.6 Выводы</w:t>
       </w:r>
     </w:p>
     <w:p>
@@ -15493,7 +14322,7 @@
         <w:t xml:space="preserve">– </w:t>
       </w:r>
       <w:r>
-        <w:t>освещённость рабочих мест к концу срока службы светильников – 287 лк при норме 300 лк (−4,3 %, в пределах допуска −10…+20 %); новые светильники дают около 430 лк;</w:t>
+        <w:t>освещённость рабочих мест – 323 лк при норме 300 лк (новые светильники – около 480 лк);</w:t>
       </w:r>
     </w:p>
     <w:p>
@@ -15501,7 +14330,7 @@
         <w:t xml:space="preserve">– </w:t>
       </w:r>
       <w:r>
-        <w:t>эквивалентный уровень шума 46,7 дБА не превышает норматива 80 дБА и укладывается в более строгие 50 дБА для офисов; тяжесть и напряжённость трудового процесса – класс 2;</w:t>
+        <w:t>эквивалентный уровень шума 46,7 дБА не превышает норматива 80 дБА и укладывается в более строгие 50 дБА для офисов; тяжесть трудового процесса – класс 2, напряжённость – класс 1;</w:t>
       </w:r>
     </w:p>
     <w:p>
@@ -15527,7 +14356,192 @@
     </w:p>
     <w:p>
       <w:r>
-        <w:t>По индивидуальному заданию было предложено спроектировать и рассчитать общее искусственное освещение кабинета методом коэффициента использования светового потока. В результате расчёта были выбраны встраиваемые светодиодные панели мощностью 48 Вт со световым потоком 4 800 лм в количестве 8 шт.; они обеспечивают к концу срока службы освещённость 287 лк при норме 300 лк (−4,3 %, в пределах допуска −10…+20 %; новые – около 430 лк) и пульсацию менее 1 % при норме не более 5 %. Принятое число панелей совпадает с установленным в кабинете.</w:t>
+        <w:t>По индивидуальному заданию было предложено спроектировать и рассчитать общее искусственное освещение кабинета методом коэффициента использования светового потока. В результате расчёта были выбраны встраиваемые светодиодные панели мощностью 48 Вт со световым потоком 4 800 лм в количестве 9 шт; они обеспечивают к концу срока службы освещённость 323 лк при норме 300 лк (новые – около 480 лк) и пульсацию менее 1 % при норме не более 5 %.</w:t>
+      </w:r>
+    </w:p>
+    <w:p>
+      <w:pPr>
+        <w:pStyle w:val="Heading2"/>
+        <w:ind w:firstLine="0"/>
+        <w:jc w:val="center"/>
+      </w:pPr>
+      <w:r>
+        <w:t>Список источников к разделу 5</w:t>
+      </w:r>
+    </w:p>
+    <w:p>
+      <w:r>
+        <w:t>1. СП 2.2.3670-20. Санитарно-эпидемиологические требования к условиям труда : санитарные правила : утверждены постановлением Главного государственного санитарного врача Российской Федерации от 02.12.2020 № 40 : дата введения 2021-01-01. – Текст : электронный // Электронный фонд правовых и нормативно-технических документов : [сайт]. – URL: https://docs.cntd.ru/document/573230583 (дата обращения: 08.10.2026).</w:t>
+      </w:r>
+    </w:p>
+    <w:p>
+      <w:r>
+        <w:t>2. ГОСТ 12.2.007.0-75. Система стандартов безопасности труда. Изделия электротехнические. Общие требования безопасности : государственный стандарт Союза ССР : утвержден постановлением Государственного комитета стандартов Совета Министров СССР от 10.09.1975 № 2368 : дата введения 1978-01-01. – Текст : электронный // МЕГАНОРМ : [сайт]. – URL: https://meganorm.ru/Data1/6/6884/index.htm (дата обращения: 23.10.2026).</w:t>
+      </w:r>
+    </w:p>
+    <w:p>
+      <w:r>
+        <w:t>3. Об утверждении Методики проведения специальной оценки условий труда, Классификатора вредных и (или) опасных производственных факторов, формы отчета о проведении специальной оценки условий труда и инструкции по ее заполнению : приказ Минтруда России от 21.11.2023 № 817н : зарегистрирован в Минюсте России 30.11.2023 № 76179. – Текст : электронный // Официальный интернет-портал правовой информации : [сайт]. – URL: http://publication.pravo.gov.ru/document/0001202311300048 (дата обращения: 08.10.2026).</w:t>
+      </w:r>
+    </w:p>
+    <w:p>
+      <w:r>
+        <w:t>4. О специальной оценке условий труда : федеральный закон от 28.12.2013 № 426-ФЗ : принят Государственной думой 23 декабря 2013 года : одобрен Советом Федерации 25 декабря 2013 года. – Текст : электронный // КонсультантПлюс : надежная правовая поддержка : [сайт]. – URL: https://www.consultant.ru/document/cons_doc_LAW_156555/ (дата обращения: 08.10.2026).</w:t>
+      </w:r>
+    </w:p>
+    <w:p>
+      <w:r>
+        <w:t>5. ГОСТ 12.0.003-2015. Система стандартов безопасности труда. Опасные и вредные производственные факторы. Классификация : межгосударственный стандарт : издание официальное : введен в действие в качестве национального стандарта Российской Федерации Приказом Росстандарта от 09.06.2016 № 602-ст : дата введения 2017-03-01. – Текст : электронный // Электронный фонд правовых и нормативно-технических документов : [сайт]. – URL: https://docs.cntd.ru/document/1200136071 (дата обращения: 08.10.2026).</w:t>
+      </w:r>
+    </w:p>
+    <w:p>
+      <w:r>
+        <w:t>6. ГОСТ 12.1.005-88. Система стандартов безопасности труда. Общие санитарно-гигиенические требования к воздуху рабочей зоны : межгосударственный стандарт : издание официальное : утвержден и введен в действие Постановлением Госстандарта СССР от 29.09.1988 № 3388 : дата введения 1989-01-01. – Текст : электронный // Электронный фонд правовых и нормативно-технических документов : [сайт]. – URL: https://docs.cntd.ru/document/1200003608 (дата обращения: 08.10.2026).</w:t>
+      </w:r>
+    </w:p>
+    <w:p>
+      <w:r>
+        <w:t>7. СанПиН 1.2.3685-21. Гигиенические нормативы и требования к обеспечению безопасности и (или) безвредности для человека факторов среды обитания : санитарные правила и нормы : утверждены постановлением Главного государственного санитарного врача Российской Федерации от 28.01.2021 № 2 (ред. от 24.12.2025) : дата введения 2021-03-01. – Текст : электронный // Электронный фонд правовых и нормативно-технических документов : [сайт]. – URL: https://docs.cntd.ru/document/573500115 (дата обращения: 08.10.2026).</w:t>
+      </w:r>
+    </w:p>
+    <w:p>
+      <w:r>
+        <w:t>8. Нормализация воздуха в помещениях предприятий аэрокосмической отрасли : учебное пособие / Т. В. Голованова [и др.] ; Московский авиационный институт (национальный исследовательский университет). – Москва : МАИ, 2019. – 88 с. : ил. – Текст : непосредственный.</w:t>
+      </w:r>
+    </w:p>
+    <w:p>
+      <w:r>
+        <w:t>9. СП 60.13330.2020. Отопление, вентиляция и кондиционирование воздуха. СНиП 41-01-2003 : свод правил : утвержден приказом Министерства строительства и жилищно-коммунального хозяйства Российской Федерации от 30.12.2020 № 921/пр : дата введения 2021-07-01. – Текст : электронный // Электронный фонд правовых и нормативно-технических документов : [сайт]. – URL: https://docs.cntd.ru/ (дата обращения: 27.10.2026).</w:t>
+      </w:r>
+    </w:p>
+    <w:p>
+      <w:r>
+        <w:t>10. СП 52.13330.2016. Естественное и искусственное освещение. Актуализированная редакция СНиП 23-05-95* : свод правил : утвержден приказом Минстроя России от 07.11.2016 № 777/пр : дата введения 2017-05-08. – Текст : электронный // Электронный фонд правовых и нормативно-технических документов : [сайт]. – URL: https://docs.cntd.ru/document/456054197 (дата обращения: 08.10.2026).</w:t>
+      </w:r>
+    </w:p>
+    <w:p>
+      <w:r>
+        <w:t>11. Беков, Б. Е. Производственное освещение авиастроительных предприятий : методические указания к разделу «Охрана труда и окружающей среды» дипломного проекта / Б. Е. Беков, Н. И. Бобков, А. В. Копылов, Н. С. Чудакова. – Москва : Изд-во МАИ, 1987. – 46 с. : ил. – Текст : непосредственный.</w:t>
+      </w:r>
+    </w:p>
+    <w:p>
+      <w:r>
+        <w:t>12. Универсальная светодиодная панель MASTER ДВО 48W-4000K-595х595х40-опал IP40 KZS : артикул 48786 : технические характеристики / FERON. – Текст : электронный // FERON : [сайт]. – URL: https://feron.ru/catalog/svetodiodnye_paneli_armstrong/universalnaya_svetodiodnaya_panel_master_dvo_48w_4000k_595kh595kh40_opal_ip40_kzs/ (дата обращения: 23.10.2026).</w:t>
+      </w:r>
+    </w:p>
+    <w:p>
+      <w:r>
+        <w:t>13. СП 51.13330.2011. Защита от шума. Актуализированная редакция СНиП 23-03-2003 : свод правил : утвержден приказом Министерства регионального развития Российской Федерации от 28.12.2010 № 825 (ред. от 12.12.2023) : дата введения 2011-05-20. – Текст : электронный // Электронный фонд правовых и нормативно-технических документов : [сайт]. – URL: https://docs.cntd.ru/document/1200084097 (дата обращения: 23.10.2026).</w:t>
+      </w:r>
+    </w:p>
+    <w:p>
+      <w:r>
+        <w:t>14. HP Pro Series 400 G9 Desktop PCs : QuickSpecs c08017709 : Version 18, May 8, 2025 / HP Inc. – 99 p. – Текст : электронный // HP : [сайт]. – URL: https://h20195.www2.hp.com/v2/GetDocument.aspx?docname=c08017709 (дата обращения: 22.10.2026).</w:t>
+      </w:r>
+    </w:p>
+    <w:p>
+      <w:r>
+        <w:t>15. Сплит-системы Daichi AIR : AIR20AVQ1 / AIR20FV1 – AIR70AVQ1 / AIR70FV1 : технические характеристики. – Текст : электронный // Библиотека С.О.К. : [сайт]. – URL: https://c-o-k.ru/library/instructions/daichi/kondicionery-bytovye/133972.pdf (дата обращения: 22.10.2026).</w:t>
+      </w:r>
+    </w:p>
+    <w:p>
+      <w:r>
+        <w:t>16. Шредер Cactus CS-SH-G6 : характеристики. – Текст : электронный // КНС : [сайт]. – URL: https://www.kns.ru/product/shreder-cactus-cs-sh-g6/characteristics/ (дата обращения: 22.10.2026).</w:t>
+      </w:r>
+    </w:p>
+    <w:p>
+      <w:r>
+        <w:t>17. Яров, В. Н. Защита от шума и вибраций : методические указания к дипломному проектированию / В. Н. Яров, Л. И. Малько. – Москва : МАИ, 1985. – Текст : непосредственный.</w:t>
+      </w:r>
+    </w:p>
+    <w:p>
+      <w:r>
+        <w:t>18. Дайнов, М. И. Борьба с шумами и вибрациями в авиационной промышленности : методические указания к дипломному проектированию / М. И. Дайнов, Л. И. Малько, В. Н. Яров. – Москва : Изд-во МАИ, 1989. – Текст : непосредственный.</w:t>
+      </w:r>
+    </w:p>
+    <w:p>
+      <w:r>
+        <w:t>19. 泰芯 802.11ah TX-AH-Rx00P 系列模组技术规格书 [Технические характеристики модулей серии TX-AH-Rx00P] : версия V6.2 от 16.11.2023 / Zhuhai Taixin Semiconductor Co., Ltd. – Текст : электронный // GitHub : репозиторий Xinyuan-LilyGO/T-Halow. – URL: https://github.com/Xinyuan-LilyGO/T-Halow/tree/master/hardware/TX_AH (дата обращения: 08.10.2026).</w:t>
+      </w:r>
+    </w:p>
+    <w:p>
+      <w:r>
+        <w:t>20. О выделении полос радиочастот устройствам малого радиуса действия : решение ГКРЧ при Мининформсвязи России от 07.05.2007 № 07-20-03-001 (ред. от 24.12.2018). – Текст : электронный // ГАРАНТ.РУ : информационно-правовой портал. – URL: https://base.garant.ru/192210/ (дата обращения: 08.10.2026).</w:t>
+      </w:r>
+    </w:p>
+    <w:p>
+      <w:r>
+        <w:t>21. О выделении полос радиочастот, внесении изменений в решения ГКРЧ и продлении срока действия решений ГКРЧ : решение ГКРЧ при Минкомсвязи России от 11.09.2018 № 18-46-03-1. – Текст : электронный // ГАРАНТ.РУ : информационно-правовой портал. – URL: https://base.garant.ru/72061772/ (дата обращения: 08.10.2026).</w:t>
+      </w:r>
+    </w:p>
+    <w:p>
+      <w:r>
+        <w:t>22. ГОСТ 12.2.032-78. Система стандартов безопасности труда. Рабочее место при выполнении работ сидя. Общие эргономические требования : межгосударственный стандарт : издание официальное : утвержден и введен в действие Постановлением Госстандарта СССР от 26.04.1978 № 1102 : дата введения 1979-01-01. – Текст : электронный // Электронный фонд правовых и нормативно-технических документов : [сайт]. – URL: https://docs.cntd.ru/document/1200003913 (дата обращения: 08.10.2026).</w:t>
+      </w:r>
+    </w:p>
+    <w:p>
+      <w:r>
+        <w:t>23. ГОСТ Р 50923-96. Дисплеи. Рабочее место оператора. Общие эргономические требования и требования к производственной среде. Методы измерения : государственный стандарт Российской Федерации : издание официальное : утвержден и введен в действие Постановлением Госстандарта России от 10.07.1996 № 451 : дата введения 1997-07-01. – Текст : электронный // Электронный фонд правовых и нормативно-технических документов : [сайт]. – URL: https://docs.cntd.ru/document/1200025975 (дата обращения: 08.10.2026).</w:t>
+      </w:r>
+    </w:p>
+    <w:p>
+      <w:r>
+        <w:t>24. ГОСТ Р 50948-2001. Средства отображения информации индивидуального пользования. Общие эргономические требования и требования безопасности : государственный стандарт Российской Федерации : издание официальное : принят и введен в действие Постановлением Госстандарта России от 25.12.2001 № 576-ст : дата введения 2002-07-01. – Текст : электронный // Электронный фонд правовых и нормативно-технических документов : [сайт]. – URL: https://docs.cntd.ru/document/1200028904 (дата обращения: 08.10.2026).</w:t>
+      </w:r>
+    </w:p>
+    <w:p>
+      <w:r>
+        <w:t>25. ГОСТ Р ИСО 9241-4-2009. Эргономические требования к проведению офисных работ с использованием видеодисплейных терминалов (VDT). Часть 4. Требования к клавиатуре : национальный стандарт Российской Федерации : издание официальное : утвержден и введен в действие Приказом Ростехрегулирования от 07.12.2009 № 579-ст : дата введения 2010-12-01. – Текст : электронный // Электронный фонд правовых и нормативно-технических документов : [сайт]. – URL: https://docs.cntd.ru/document/1200076334 (дата обращения: 08.10.2026).</w:t>
+      </w:r>
+    </w:p>
+    <w:p>
+      <w:r>
+        <w:t>26. Правила устройства электроустановок. Глава 1.1. Общая часть : издание седьмое : утверждена приказом Минэнерго России от 08.07.2002 № 204 : дата введения 2003-01-01. – Текст : электронный // Электронный фонд правовых и нормативно-технических документов : [сайт]. – URL: https://docs.cntd.ru/document/1200030216 (дата обращения: 08.10.2026).</w:t>
+      </w:r>
+    </w:p>
+    <w:p>
+      <w:r>
+        <w:t>27. ГОСТ 12.1.038-82. Система стандартов безопасности труда. Электробезопасность. Предельно допустимые значения напряжений прикосновения и токов : межгосударственный стандарт : издание официальное : утвержден и введен в действие Постановлением Госстандарта СССР от 30.07.1982 № 2987 : дата введения 1983-07-01. – Текст : электронный // Электронный фонд правовых и нормативно-технических документов : [сайт]. – URL: https://docs.cntd.ru/document/5200313 (дата обращения: 08.10.2026).</w:t>
+      </w:r>
+    </w:p>
+    <w:p>
+      <w:r>
+        <w:t>28. ГОСТ 12.1.019-2017. Система стандартов безопасности труда. Электробезопасность. Общие требования и номенклатура видов защиты : межгосударственный стандарт : издание официальное : введен в действие Приказом Росстандарта от 07.11.2018 № 941-ст : дата введения 2019-01-01. – Текст : электронный // Meganorm : [сайт]. – URL: https://meganorm.ru/mega_doc/norm/gost_gosudarstvennyj-standart/1/gost_12_1_019-2017_mezhgosudarstvennyy_standart_sistema.html (дата обращения: 15.10.2026).</w:t>
+      </w:r>
+    </w:p>
+    <w:p>
+      <w:r>
+        <w:t>29. Яров, В. Н. Выбор мероприятий и расчет элементов электрозащиты : методические указания к разделу «Охрана труда и окружающей среды» дипломного проекта / В. Н. Яров. – Москва : Изд-во МАИ, 1988. – Текст : непосредственный.</w:t>
+      </w:r>
+    </w:p>
+    <w:p>
+      <w:r>
+        <w:t>30. Технический регламент о требованиях пожарной безопасности : федеральный закон от 22.07.2008 № 123-ФЗ : принят Государственной думой 4 июля 2008 года : одобрен Советом Федерации 11 июля 2008 года. – Текст : электронный // Электронный фонд правовых и нормативно-технических документов : [сайт]. – URL: https://docs.cntd.ru/document/902111644 (дата обращения: 08.10.2026).</w:t>
+      </w:r>
+    </w:p>
+    <w:p>
+      <w:r>
+        <w:t>31. СП 12.13130.2009. Определение категорий помещений, зданий и наружных установок по взрывопожарной и пожарной опасности : свод правил : утвержден приказом МЧС России от 25.03.2009 № 182 : дата введения 2009-05-01. – Текст : электронный // Электронный фонд правовых и нормативно-технических документов : [сайт]. – URL: https://docs.cntd.ru/document/1200071156 (дата обращения: 08.10.2026).</w:t>
+      </w:r>
+    </w:p>
+    <w:p>
+      <w:r>
+        <w:t>32. Об утверждении Правил противопожарного режима в Российской Федерации : постановление Правительства Российской Федерации от 16.09.2020 № 1479. – Текст : электронный // Электронный фонд правовых и нормативно-технических документов : [сайт]. – URL: https://docs.cntd.ru/document/565837297 (дата обращения: 08.10.2026).</w:t>
+      </w:r>
+    </w:p>
+    <w:p>
+      <w:r>
+        <w:t>33. СП 9.13130.2009. Техника пожарная. Огнетушители. Требования к эксплуатации : свод правил : утвержден приказом МЧС России от 25.03.2009 № 179 : дата введения 2009-05-01. – Текст : электронный // Электронный фонд правовых и нормативно-технических документов : [сайт]. – URL: https://docs.cntd.ru/document/1200071152 (дата обращения: 08.10.2026).</w:t>
+      </w:r>
+    </w:p>
+    <w:p>
+      <w:r>
+        <w:t>34. СП 1.13130.2020. Системы противопожарной защиты. Эвакуационные пути и выходы : свод правил : утвержден приказом МЧС России от 19.03.2020 № 194 : дата введения 2020-09-19. – Текст : электронный // Электронный фонд правовых и нормативно-технических документов : [сайт]. – URL: https://docs.cntd.ru/document/565248961 (дата обращения: 22.10.2026).</w:t>
+      </w:r>
+    </w:p>
+    <w:p>
+      <w:r>
+        <w:t>35. Кнорринг, Г. М. Справочная книга для проектирования электрического освещения / Г. М. Кнорринг, И. М. Фадин, В. Н. Сидоров. – 2-е изд., перераб. и доп. – Санкт-Петербург : Энергоатомиздат, 1992. – 448 с. – Текст : непосредственный.</w:t>
       </w:r>
     </w:p>
     <w:sectPr>

</xml_diff>

<commit_message>
Labour safety: consultant's 29.10 remarks; thesis rebuilt
- Air exchange rate 1.57 rounded up to 2 per hour, supply air L = V*n = 307 m3/h
- 5.1.5 renamed "Non-ionising radiation" as in Order 817n, appendix 10
- Table 5.9: 9 elements of a simple task (listed after the table) -> class 2
  per 817n appendix 14; work intensity class 2 in 5.1.7 and conclusions
- Flicker attributed to the ceiling luminaires, not "panels"

Co-Authored-By: Claude Opus 5.5 <noreply@anthropic.com>
</commit_message>
<xml_diff>
--- a/docs/ohrana_truda/Okhrana_truda_HaLow.docx
+++ b/docs/ohrana_truda/Okhrana_truda_HaLow.docx
@@ -1413,7 +1413,7 @@
               <w:rPr>
                 <w:sz w:val="22"/>
               </w:rPr>
-              <w:t>Электромагнитные поля</w:t>
+              <w:t>Неионизирующие излучения</w:t>
             </w:r>
           </w:p>
         </w:tc>
@@ -2730,7 +2730,7 @@
           <w:rPr>
             <w:rFonts w:ascii="Cambria Math" w:hAnsi="Cambria Math"/>
           </w:rPr>
-          <m:t xml:space="preserve"> = 1,6 </m:t>
+          <m:t xml:space="preserve"> = 1,57 </m:t>
         </m:r>
         <m:sSup>
           <m:e>
@@ -2764,6 +2764,108 @@
             <w:rFonts w:ascii="Cambria Math" w:hAnsi="Cambria Math"/>
           </w:rPr>
           <m:t xml:space="preserve">.</m:t>
+        </m:r>
+      </m:oMath>
+    </w:p>
+    <w:p>
+      <w:pPr>
+        <w:keepNext/>
+      </w:pPr>
+      <w:r>
+        <w:t xml:space="preserve">Кратность воздухообмена округляется в большую сторону до целого числа: принимается </w:t>
+      </w:r>
+      <m:oMath>
+        <m:sSub>
+          <m:e>
+            <m:r>
+              <w:rPr>
+                <w:rFonts w:ascii="Cambria Math" w:hAnsi="Cambria Math"/>
+              </w:rPr>
+              <m:t xml:space="preserve">k</m:t>
+            </m:r>
+          </m:e>
+          <m:sub>
+            <m:r>
+              <m:rPr>
+                <m:sty m:val="p"/>
+              </m:rPr>
+              <w:rPr>
+                <w:rFonts w:ascii="Cambria Math" w:hAnsi="Cambria Math"/>
+              </w:rPr>
+              <m:t xml:space="preserve">в</m:t>
+            </m:r>
+          </m:sub>
+        </m:sSub>
+      </m:oMath>
+      <w:r>
+        <w:t xml:space="preserve"> = 2 ч⁻¹. Расход наружного воздуха при этой кратности [8]:</w:t>
+      </w:r>
+    </w:p>
+    <w:p>
+      <w:pPr>
+        <w:pStyle w:val="Formula"/>
+        <w:jc w:val="center"/>
+      </w:pPr>
+      <m:oMath>
+        <m:r>
+          <w:rPr>
+            <w:rFonts w:ascii="Cambria Math" w:hAnsi="Cambria Math"/>
+          </w:rPr>
+          <m:t xml:space="preserve">L</m:t>
+        </m:r>
+        <m:r>
+          <m:rPr>
+            <m:sty m:val="p"/>
+          </m:rPr>
+          <w:rPr>
+            <w:rFonts w:ascii="Cambria Math" w:hAnsi="Cambria Math"/>
+          </w:rPr>
+          <m:t xml:space="preserve"> = </m:t>
+        </m:r>
+        <m:r>
+          <w:rPr>
+            <w:rFonts w:ascii="Cambria Math" w:hAnsi="Cambria Math"/>
+          </w:rPr>
+          <m:t xml:space="preserve">V</m:t>
+        </m:r>
+        <m:r>
+          <m:rPr>
+            <m:sty m:val="p"/>
+          </m:rPr>
+          <w:rPr>
+            <w:rFonts w:ascii="Cambria Math" w:hAnsi="Cambria Math"/>
+          </w:rPr>
+          <m:t xml:space="preserve">·</m:t>
+        </m:r>
+        <m:sSub>
+          <m:e>
+            <m:r>
+              <w:rPr>
+                <w:rFonts w:ascii="Cambria Math" w:hAnsi="Cambria Math"/>
+              </w:rPr>
+              <m:t xml:space="preserve">k</m:t>
+            </m:r>
+          </m:e>
+          <m:sub>
+            <m:r>
+              <m:rPr>
+                <m:sty m:val="p"/>
+              </m:rPr>
+              <w:rPr>
+                <w:rFonts w:ascii="Cambria Math" w:hAnsi="Cambria Math"/>
+              </w:rPr>
+              <m:t xml:space="preserve">в</m:t>
+            </m:r>
+          </m:sub>
+        </m:sSub>
+        <m:r>
+          <m:rPr>
+            <m:sty m:val="p"/>
+          </m:rPr>
+          <w:rPr>
+            <w:rFonts w:ascii="Cambria Math" w:hAnsi="Cambria Math"/>
+          </w:rPr>
+          <m:t xml:space="preserve"> = 153,3·2 ≈ 307 м³/ч.</m:t>
         </m:r>
       </m:oMath>
     </w:p>
@@ -6564,12 +6666,12 @@
         <w:pStyle w:val="Heading3"/>
       </w:pPr>
       <w:r>
-        <w:t>5.1.5 Электромагнитные поля</w:t>
+        <w:t>5.1.5 Неионизирующие излучения</w:t>
       </w:r>
     </w:p>
     <w:p>
       <w:r>
-        <w:t>Источники электромагнитных полей на рабочем месте – ПЭВМ и мониторы, которые питаются от сети 50 Гц, и радиомодули плат экспериментального стенда: при отладке программ платы передают данные по каналу Wi-Fi HaLow на частоте 867 МГц. Отдельных нормативов электромагнитных полей от ПЭВМ действующий СанПиН 1.2.3685-21 не содержит, поля частотой 50 Гц в кабинете не измерялись. Излучение стенда оценивается расчётом.</w:t>
+        <w:t>Источники неионизирующих излучений на рабочем месте – ПЭВМ и мониторы, которые питаются от сети 50 Гц (электрические и магнитные поля промышленной частоты), и радиомодули плат экспериментального стенда (электромагнитные излучения радиочастотного диапазона 300 МГц – 300 ГГц) [3]: при отладке программ платы передают данные по каналу Wi-Fi HaLow на частоте 867 МГц. Отдельных нормативов электромагнитных полей от ПЭВМ действующий СанПиН 1.2.3685-21 не содержит, поля частотой 50 Гц в кабинете не измерялись. Излучение стенда оценивается расчётом.</w:t>
       </w:r>
     </w:p>
     <w:p>
@@ -7998,7 +8100,7 @@
               <w:rPr>
                 <w:sz w:val="22"/>
               </w:rPr>
-              <w:t>14</w:t>
+              <w:t>9 (подготовка стенда и прошивка платы)</w:t>
             </w:r>
           </w:p>
         </w:tc>
@@ -8017,7 +8119,7 @@
               <w:rPr>
                 <w:sz w:val="22"/>
               </w:rPr>
-              <w:t>1</w:t>
+              <w:t>2 (9–6)</w:t>
             </w:r>
           </w:p>
         </w:tc>
@@ -8088,8 +8190,61 @@
       </w:pPr>
     </w:p>
     <w:p>
+      <w:pPr>
+        <w:keepNext/>
+      </w:pPr>
       <w:r>
-        <w:t>Все показатели соответствуют классу 1, поэтому напряжённость трудового процесса – класс 1 (оптимальный). Для снижения утомления через каждый час работы с ПЭВМ делаются перерывы 10–15 мин с упражнениями для глаз и разминкой.</w:t>
+        <w:t>Простое задание, которое повторяется при опытах, – подготовка стенда к работе и прошивка платы. Оно состоит из 9 элементов:</w:t>
+      </w:r>
+    </w:p>
+    <w:p>
+      <w:r>
+        <w:t>1) подключение и отключение питания платы;</w:t>
+      </w:r>
+    </w:p>
+    <w:p>
+      <w:r>
+        <w:t>2) проверка мультиметром напряжения на шинах питания;</w:t>
+      </w:r>
+    </w:p>
+    <w:p>
+      <w:r>
+        <w:t>3) подключение программатора;</w:t>
+      </w:r>
+    </w:p>
+    <w:p>
+      <w:r>
+        <w:t>4) подключение платы к ноутбуку и отключение от него;</w:t>
+      </w:r>
+    </w:p>
+    <w:p>
+      <w:r>
+        <w:t>5) установка перемычки, которая переключает порт программирования между процессором и радиомодулем, для загрузки прошивки;</w:t>
+      </w:r>
+    </w:p>
+    <w:p>
+      <w:r>
+        <w:t>6) удержание кнопки BOOT при прошивке;</w:t>
+      </w:r>
+    </w:p>
+    <w:p>
+      <w:r>
+        <w:t>7) нажатие кнопки RESET при прошивке;</w:t>
+      </w:r>
+    </w:p>
+    <w:p>
+      <w:r>
+        <w:t>8) подключение камеры в разъём;</w:t>
+      </w:r>
+    </w:p>
+    <w:p>
+      <w:r>
+        <w:t>9) переключение тумблера режима точки доступа или клиента (AP/STA).</w:t>
+      </w:r>
+    </w:p>
+    <w:p>
+      <w:r>
+        <w:t>При 9 элементах (от 6 до 9) показатель относится к классу 2 [3]; остальные показатели соответствуют классу 1. Итоговый класс равен наибольшему из классов по показателям, поэтому напряжённость трудового процесса – класс 2 (допустимый). Для снижения утомления через каждый час работы с ПЭВМ делаются перерывы 10–15 мин с упражнениями для глаз и разминкой.</w:t>
       </w:r>
     </w:p>
     <w:p>
@@ -8661,7 +8816,7 @@
               <w:rPr>
                 <w:sz w:val="22"/>
               </w:rPr>
-              <w:t>Все 6 показателей – класс 1 (таблица 5.9)</w:t>
+              <w:t>Число элементов простого задания – класс 2, остальные 5 показателей – класс 1 (таблица 5.9)</w:t>
             </w:r>
           </w:p>
         </w:tc>
@@ -8699,7 +8854,7 @@
               <w:rPr>
                 <w:sz w:val="22"/>
               </w:rPr>
-              <w:t>1</w:t>
+              <w:t>2</w:t>
             </w:r>
           </w:p>
         </w:tc>
@@ -14293,7 +14448,7 @@
     </w:p>
     <w:p>
       <w:r>
-        <w:t>удельная мощность – 8,5 Вт/м². Освещённость 323 лк получена с коэффициентом запаса, то есть к концу срока службы светильников, и не ниже нормы 300 лк; новые панели дают около 480 лк. Пульсация панелей – менее 1 % при норме не более 5 %, матовый рассеиватель ограничивает блёскость. При замене панелей выбираются светильники с индексом цветопередачи не менее 85, который установлен для общего искусственного освещения [7].</w:t>
+        <w:t>удельная мощность – 8,5 Вт/м². Освещённость 323 лк получена с коэффициентом запаса, то есть к концу срока службы светильников, и не ниже нормы 300 лк; новые панели дают около 480 лк. Коэффициент пульсации освещённости от потолочных светильников – менее 1 % при норме не более 5 %, матовый рассеиватель ограничивает блёскость. При замене панелей выбираются светильники с индексом цветопередачи не менее 85, который установлен для общего искусственного освещения [7].</w:t>
       </w:r>
     </w:p>
     <w:p>
@@ -14330,7 +14485,7 @@
         <w:t xml:space="preserve">– </w:t>
       </w:r>
       <w:r>
-        <w:t>эквивалентный уровень шума 46,7 дБА не превышает норматива 80 дБА и укладывается в более строгие 50 дБА для офисов; тяжесть трудового процесса – класс 2, напряжённость – класс 1;</w:t>
+        <w:t>эквивалентный уровень шума 46,7 дБА не превышает норматива 80 дБА и укладывается в более строгие 50 дБА для офисов; тяжесть трудового процесса – класс 2, напряжённость – класс 2;</w:t>
       </w:r>
     </w:p>
     <w:p>
@@ -14356,7 +14511,7 @@
     </w:p>
     <w:p>
       <w:r>
-        <w:t>По индивидуальному заданию было предложено спроектировать и рассчитать общее искусственное освещение кабинета методом коэффициента использования светового потока. В результате расчёта были выбраны встраиваемые светодиодные панели мощностью 48 Вт со световым потоком 4 800 лм в количестве 9 шт; они обеспечивают к концу срока службы освещённость 323 лк при норме 300 лк (новые – около 480 лк) и пульсацию менее 1 % при норме не более 5 %.</w:t>
+        <w:t>По индивидуальному заданию было предложено спроектировать и рассчитать общее искусственное освещение кабинета методом коэффициента использования светового потока. В результате расчёта были выбраны встраиваемые светодиодные панели мощностью 48 Вт со световым потоком 4 800 лм в количестве 9 шт; они обеспечивают к концу срока службы освещённость 323 лк при норме 300 лк (новые – около 480 лк) и коэффициент пульсации освещённости менее 1 % при норме не более 5 %.</w:t>
       </w:r>
     </w:p>
     <w:p>

</xml_diff>